<commit_message>
Harden template: migrations, generic model, secure config, features
- Data model: drop leftover health columns; add UserInfo.meta JSON
- Flask-Migrate (multidb) + baseline migration; add-a-column without rebuild
- ECPay: reusable create_ecpay_order() helper + config-driven order defaults
- Security: secure session cookies, sandbox ECPay default, prod secret warnings
- Features: /change_password page, optional SMTP reset email, GitHub Actions CI, MIT LICENSE
- Cleanup: remove unused fonts/images (59->41 tracked files)
- Docs: README add-a-column recipe, SECRETS hardening checklist; regenerate PROJECT_GUIDE.docx
</commit_message>
<xml_diff>
--- a/PROJECT_GUIDE.docx
+++ b/PROJECT_GUIDE.docx
@@ -1096,7 +1096,7 @@
           <w:sz w:val="18"/>
           <w:szCs w:val="18"/>
         </w:rPr>
-        <w:t xml:space="preserve">userID + name  (composite primary key)</w:t>
+        <w:t xml:space="preserve">userID + name (composite PK); phone / device / time / meta(JSON)</w:t>
       </w:r>
     </w:p>
     <w:p>
@@ -1142,6 +1142,32 @@
     </w:p>
     <w:p>
       <w:pPr>
+        <w:pStyle w:val="ListParagraph"/>
+        <w:numPr>
+          <w:ilvl w:val="0"/>
+          <w:numId w:val="2"/>
+        </w:numPr>
+        <w:spacing w:after="40"/>
+      </w:pPr>
+      <w:r>
+        <w:t xml:space="preserve">`meta` is a generic JSON catch-all: any extra per-person attribute can be stored</w:t>
+      </w:r>
+    </w:p>
+    <w:p>
+      <w:pPr>
+        <w:pStyle w:val="ListParagraph"/>
+        <w:numPr>
+          <w:ilvl w:val="0"/>
+          <w:numId w:val="2"/>
+        </w:numPr>
+        <w:spacing w:after="40"/>
+      </w:pPr>
+      <w:r>
+        <w:t xml:space="preserve">with no schema change (the /save API auto-routes unknown fields there).</w:t>
+      </w:r>
+    </w:p>
+    <w:p>
+      <w:pPr>
         <w:spacing w:after="80"/>
       </w:pPr>
       <w:r>
@@ -1152,7 +1178,7 @@
         <w:t xml:space="preserve">Tech point: </w:t>
       </w:r>
       <w:r>
-        <w:t xml:space="preserve">A composite primary key models 'a person is identified by id + name together'.</w:t>
+        <w:t xml:space="preserve">A composite primary key models 'a person is identified by id + name together'; the meta JSON keeps the model generic so new fields never force a redesign.</w:t>
       </w:r>
     </w:p>
     <w:p>
@@ -1289,6 +1315,67 @@
       </w:r>
     </w:p>
     <w:p>
+      <w:pPr>
+        <w:pStyle w:val="Heading2"/>
+      </w:pPr>
+      <w:r>
+        <w:t xml:space="preserve">Adding a column whenever you want</w:t>
+      </w:r>
+    </w:p>
+    <w:p>
+      <w:pPr>
+        <w:spacing w:after="120"/>
+      </w:pPr>
+      <w:r>
+        <w:t xml:space="preserve">Two paths, depending on whether you need a real (queryable) column:</w:t>
+      </w:r>
+    </w:p>
+    <w:p>
+      <w:pPr>
+        <w:spacing w:after="80"/>
+      </w:pPr>
+      <w:r>
+        <w:rPr>
+          <w:b/>
+          <w:bCs/>
+        </w:rPr>
+        <w:t xml:space="preserve">No schema change: </w:t>
+      </w:r>
+      <w:r>
+        <w:t xml:space="preserve">drop extra fields into the JSON - UserInfo.meta or UserData.data. The /save API already routes unknown userInfo keys into meta.</w:t>
+      </w:r>
+    </w:p>
+    <w:p>
+      <w:pPr>
+        <w:spacing w:after="80"/>
+      </w:pPr>
+      <w:r>
+        <w:rPr>
+          <w:b/>
+          <w:bCs/>
+        </w:rPr>
+        <w:t xml:space="preserve">Promote to a real column: </w:t>
+      </w:r>
+      <w:r>
+        <w:t xml:space="preserve">schema is managed by Flask-Migrate (Alembic). Add one Mapped[...] line to the model, then run: flask db migrate -m "add X"  and  flask db upgrade. No rebuild, no data loss; the app auto-applies migrations on startup.</w:t>
+      </w:r>
+    </w:p>
+    <w:p>
+      <w:pPr>
+        <w:spacing w:after="80"/>
+      </w:pPr>
+      <w:r>
+        <w:rPr>
+          <w:b/>
+          <w:bCs/>
+        </w:rPr>
+        <w:t xml:space="preserve">Why this matters: </w:t>
+      </w:r>
+      <w:r>
+        <w:t xml:space="preserve">earlier, a model change drifted from the existing DB and forced a full recreate. Migrations make 'separate a field into its own column anytime' a small, safe, isolated change.</w:t>
+      </w:r>
+    </w:p>
+    <w:p>
       <w:r>
         <w:br w:type="page"/>
       </w:r>
@@ -2169,7 +2256,7 @@
         <w:pStyle w:val="Heading3"/>
       </w:pPr>
       <w:r>
-        <w:t xml:space="preserve">create_backup(app) / delete_old_backups(app)</w:t>
+        <w:t xml:space="preserve">create_ecpay_order(item_name, amount, custom_field, *, return_path, result_path)</w:t>
       </w:r>
     </w:p>
     <w:p>
@@ -2186,7 +2273,7 @@
           <w:sz w:val="18"/>
           <w:szCs w:val="18"/>
         </w:rPr>
-        <w:t xml:space="preserve">scheduler runs these daily at 12:30 / 12:35</w:t>
+        <w:t xml:space="preserve">builds + signs an order from config defaults -&gt; returns (params, action_url)</w:t>
       </w:r>
     </w:p>
     <w:p>
@@ -2214,33 +2301,46 @@
         <w:spacing w:after="40"/>
       </w:pPr>
       <w:r>
-        <w:t xml:space="preserve">create_backup copies the database file into the backups folder with a timestamped name.</w:t>
-      </w:r>
-    </w:p>
-    <w:p>
-      <w:pPr>
-        <w:pStyle w:val="ListParagraph"/>
-        <w:numPr>
-          <w:ilvl w:val="0"/>
-          <w:numId w:val="2"/>
-        </w:numPr>
-        <w:spacing w:after="40"/>
-      </w:pPr>
-      <w:r>
-        <w:t xml:space="preserve">delete_old_backups removes backups older than RETENTION_DAYS.</w:t>
-      </w:r>
-    </w:p>
-    <w:p>
-      <w:pPr>
-        <w:pStyle w:val="ListParagraph"/>
-        <w:numPr>
-          <w:ilvl w:val="0"/>
-          <w:numId w:val="2"/>
-        </w:numPr>
-        <w:spacing w:after="40"/>
-      </w:pPr>
-      <w:r>
-        <w:t xml:space="preserve">Both take 'app' and use app.app_context() because they run on a background thread.</w:t>
+        <w:t xml:space="preserve">Assembles the ECPay order dict (amount, item, callback URLs, payment methods).</w:t>
+      </w:r>
+    </w:p>
+    <w:p>
+      <w:pPr>
+        <w:pStyle w:val="ListParagraph"/>
+        <w:numPr>
+          <w:ilvl w:val="0"/>
+          <w:numId w:val="2"/>
+        </w:numPr>
+        <w:spacing w:after="40"/>
+      </w:pPr>
+      <w:r>
+        <w:t xml:space="preserve">Pulls changeable defaults from config (ChoosePayment, EncryptType, item, action URL).</w:t>
+      </w:r>
+    </w:p>
+    <w:p>
+      <w:pPr>
+        <w:pStyle w:val="ListParagraph"/>
+        <w:numPr>
+          <w:ilvl w:val="0"/>
+          <w:numId w:val="2"/>
+        </w:numPr>
+        <w:spacing w:after="40"/>
+      </w:pPr>
+      <w:r>
+        <w:t xml:space="preserve">Signs it via get_ecpay_sdk() and returns the signed params plus the action URL.</w:t>
+      </w:r>
+    </w:p>
+    <w:p>
+      <w:pPr>
+        <w:pStyle w:val="ListParagraph"/>
+        <w:numPr>
+          <w:ilvl w:val="0"/>
+          <w:numId w:val="2"/>
+        </w:numPr>
+        <w:spacing w:after="40"/>
+      </w:pPr>
+      <w:r>
+        <w:t xml:space="preserve">pay_vip is now just a thin caller; new payment flows are a single call.</w:t>
       </w:r>
     </w:p>
     <w:p>
@@ -2255,7 +2355,7 @@
         <w:t xml:space="preserve">Tech point: </w:t>
       </w:r>
       <w:r>
-        <w:t xml:space="preserve">A background job needs an explicit application context to access app.config and the database.</w:t>
+        <w:t xml:space="preserve">One reusable builder instead of an order hardcoded inside a route.</w:t>
       </w:r>
     </w:p>
     <w:p>
@@ -2270,28 +2370,7 @@
         <w:t xml:space="preserve">Thinking behind it: </w:t>
       </w:r>
       <w:r>
-        <w:t xml:space="preserve">Automatic daily backups with retention give cheap safety; passing app in makes them callable from the scheduler thread, which has no request context.</w:t>
-      </w:r>
-    </w:p>
-    <w:p>
-      <w:r>
-        <w:br w:type="page"/>
-      </w:r>
-    </w:p>
-    <w:p>
-      <w:pPr>
-        <w:pStyle w:val="Heading1"/>
-      </w:pPr>
-      <w:r>
-        <w:t xml:space="preserve">7. app.py - routes (the seven sections)</w:t>
-      </w:r>
-    </w:p>
-    <w:p>
-      <w:pPr>
-        <w:pStyle w:val="Heading2"/>
-      </w:pPr>
-      <w:r>
-        <w:t xml:space="preserve">7.1 Account register</w:t>
+        <w:t xml:space="preserve">You asked for ECPay to be generic AND easy to change: amount/item are per-call, and payment methods/encryption/URL are config - so adding a new payment or changing behavior never means editing route code.</w:t>
       </w:r>
     </w:p>
     <w:p>
@@ -2299,7 +2378,7 @@
         <w:pStyle w:val="Heading3"/>
       </w:pPr>
       <w:r>
-        <w:t xml:space="preserve">api_register  (POST /api/register)</w:t>
+        <w:t xml:space="preserve">send_email(to, subject, body)</w:t>
       </w:r>
     </w:p>
     <w:p>
@@ -2316,7 +2395,7 @@
           <w:sz w:val="18"/>
           <w:szCs w:val="18"/>
         </w:rPr>
-        <w:t xml:space="preserve">JSON {username, password, name?, email?, phone?} -&gt; 201 / 400 / 500</w:t>
+        <w:t xml:space="preserve">uses SMTP if configured (config SMTP_*), else logs the message</w:t>
       </w:r>
     </w:p>
     <w:p>
@@ -2344,46 +2423,20 @@
         <w:spacing w:after="40"/>
       </w:pPr>
       <w:r>
-        <w:t xml:space="preserve">Reads JSON, requires username + password.</w:t>
-      </w:r>
-    </w:p>
-    <w:p>
-      <w:pPr>
-        <w:pStyle w:val="ListParagraph"/>
-        <w:numPr>
-          <w:ilvl w:val="0"/>
-          <w:numId w:val="2"/>
-        </w:numPr>
-        <w:spacing w:after="40"/>
-      </w:pPr>
-      <w:r>
-        <w:t xml:space="preserve">Rejects duplicates.</w:t>
-      </w:r>
-    </w:p>
-    <w:p>
-      <w:pPr>
-        <w:pStyle w:val="ListParagraph"/>
-        <w:numPr>
-          <w:ilvl w:val="0"/>
-          <w:numId w:val="2"/>
-        </w:numPr>
-        <w:spacing w:after="40"/>
-      </w:pPr>
-      <w:r>
-        <w:t xml:space="preserve">Always creates a plain 'user' (admins are promoted later via the admin panel or DB).</w:t>
-      </w:r>
-    </w:p>
-    <w:p>
-      <w:pPr>
-        <w:pStyle w:val="ListParagraph"/>
-        <w:numPr>
-          <w:ilvl w:val="0"/>
-          <w:numId w:val="2"/>
-        </w:numPr>
-        <w:spacing w:after="40"/>
-      </w:pPr>
-      <w:r>
-        <w:t xml:space="preserve">Creates the user, hashes the password, commits, returns 201.</w:t>
+        <w:t xml:space="preserve">If SMTP_HOST is set, sends a real email (STARTTLS + optional login).</w:t>
+      </w:r>
+    </w:p>
+    <w:p>
+      <w:pPr>
+        <w:pStyle w:val="ListParagraph"/>
+        <w:numPr>
+          <w:ilvl w:val="0"/>
+          <w:numId w:val="2"/>
+        </w:numPr>
+        <w:spacing w:after="40"/>
+      </w:pPr>
+      <w:r>
+        <w:t xml:space="preserve">If not configured, logs the content and returns False (dev fallback).</w:t>
       </w:r>
     </w:p>
     <w:p>
@@ -2398,7 +2451,7 @@
         <w:t xml:space="preserve">Tech point: </w:t>
       </w:r>
       <w:r>
-        <w:t xml:space="preserve">JSON API registration for the mobile app; jsonify returns machine-readable responses.</w:t>
+        <w:t xml:space="preserve">Optional dependency-free email via stdlib smtplib; behavior driven by config.</w:t>
       </w:r>
     </w:p>
     <w:p>
@@ -2413,7 +2466,7 @@
         <w:t xml:space="preserve">Thinking behind it: </w:t>
       </w:r>
       <w:r>
-        <w:t xml:space="preserve">Fixes the original bug where an undefined variable 'name' crashed this route every time - it now reads name from the request safely.</w:t>
+        <w:t xml:space="preserve">Lets the password-reset flow email links in production without forcing SMTP setup for local dev.</w:t>
       </w:r>
     </w:p>
     <w:p>
@@ -2421,7 +2474,7 @@
         <w:pStyle w:val="Heading3"/>
       </w:pPr>
       <w:r>
-        <w:t xml:space="preserve">register  (POST /register)</w:t>
+        <w:t xml:space="preserve">create_backup(app) / delete_old_backups(app)</w:t>
       </w:r>
     </w:p>
     <w:p>
@@ -2438,7 +2491,7 @@
           <w:sz w:val="18"/>
           <w:szCs w:val="18"/>
         </w:rPr>
-        <w:t xml:space="preserve">minimal JSON {username, password}</w:t>
+        <w:t xml:space="preserve">scheduler runs these daily at 12:30 / 12:35</w:t>
       </w:r>
     </w:p>
     <w:p>
@@ -2466,7 +2519,33 @@
         <w:spacing w:after="40"/>
       </w:pPr>
       <w:r>
-        <w:t xml:space="preserve">A stripped-down JSON register with just username + password.</w:t>
+        <w:t xml:space="preserve">create_backup copies the database file into the backups folder with a timestamped name.</w:t>
+      </w:r>
+    </w:p>
+    <w:p>
+      <w:pPr>
+        <w:pStyle w:val="ListParagraph"/>
+        <w:numPr>
+          <w:ilvl w:val="0"/>
+          <w:numId w:val="2"/>
+        </w:numPr>
+        <w:spacing w:after="40"/>
+      </w:pPr>
+      <w:r>
+        <w:t xml:space="preserve">delete_old_backups removes backups older than RETENTION_DAYS.</w:t>
+      </w:r>
+    </w:p>
+    <w:p>
+      <w:pPr>
+        <w:pStyle w:val="ListParagraph"/>
+        <w:numPr>
+          <w:ilvl w:val="0"/>
+          <w:numId w:val="2"/>
+        </w:numPr>
+        <w:spacing w:after="40"/>
+      </w:pPr>
+      <w:r>
+        <w:t xml:space="preserve">Both take 'app' and use app.app_context() because they run on a background thread.</w:t>
       </w:r>
     </w:p>
     <w:p>
@@ -2481,7 +2560,7 @@
         <w:t xml:space="preserve">Tech point: </w:t>
       </w:r>
       <w:r>
-        <w:t xml:space="preserve">A second, simpler endpoint kept for compatibility.</w:t>
+        <w:t xml:space="preserve">A background job needs an explicit application context to access app.config and the database.</w:t>
       </w:r>
     </w:p>
     <w:p>
@@ -2496,7 +2575,28 @@
         <w:t xml:space="preserve">Thinking behind it: </w:t>
       </w:r>
       <w:r>
-        <w:t xml:space="preserve">Some clients only send credentials; this avoids forcing optional fields.</w:t>
+        <w:t xml:space="preserve">Automatic daily backups with retention give cheap safety; passing app in makes them callable from the scheduler thread, which has no request context.</w:t>
+      </w:r>
+    </w:p>
+    <w:p>
+      <w:r>
+        <w:br w:type="page"/>
+      </w:r>
+    </w:p>
+    <w:p>
+      <w:pPr>
+        <w:pStyle w:val="Heading1"/>
+      </w:pPr>
+      <w:r>
+        <w:t xml:space="preserve">7. app.py - routes (the seven sections)</w:t>
+      </w:r>
+    </w:p>
+    <w:p>
+      <w:pPr>
+        <w:pStyle w:val="Heading2"/>
+      </w:pPr>
+      <w:r>
+        <w:t xml:space="preserve">7.1 Account register</w:t>
       </w:r>
     </w:p>
     <w:p>
@@ -2504,7 +2604,7 @@
         <w:pStyle w:val="Heading3"/>
       </w:pPr>
       <w:r>
-        <w:t xml:space="preserve">web_register_page (GET) / web_register_action (POST /web_register)</w:t>
+        <w:t xml:space="preserve">api_register  (POST /api/register)</w:t>
       </w:r>
     </w:p>
     <w:p>
@@ -2521,7 +2621,7 @@
           <w:sz w:val="18"/>
           <w:szCs w:val="18"/>
         </w:rPr>
-        <w:t xml:space="preserve">render register.html  /  validate form, create user</w:t>
+        <w:t xml:space="preserve">JSON {username, password, name?, email?, phone?} -&gt; 201 / 400 / 500</w:t>
       </w:r>
     </w:p>
     <w:p>
@@ -2549,20 +2649,46 @@
         <w:spacing w:after="40"/>
       </w:pPr>
       <w:r>
-        <w:t xml:space="preserve">The GET shows the registration HTML page.</w:t>
-      </w:r>
-    </w:p>
-    <w:p>
-      <w:pPr>
-        <w:pStyle w:val="ListParagraph"/>
-        <w:numPr>
-          <w:ilvl w:val="0"/>
-          <w:numId w:val="2"/>
-        </w:numPr>
-        <w:spacing w:after="40"/>
-      </w:pPr>
-      <w:r>
-        <w:t xml:space="preserve">The POST validates the form (required fields, matching passwords, unique username) and creates the account, then shows login.</w:t>
+        <w:t xml:space="preserve">Reads JSON, requires username + password.</w:t>
+      </w:r>
+    </w:p>
+    <w:p>
+      <w:pPr>
+        <w:pStyle w:val="ListParagraph"/>
+        <w:numPr>
+          <w:ilvl w:val="0"/>
+          <w:numId w:val="2"/>
+        </w:numPr>
+        <w:spacing w:after="40"/>
+      </w:pPr>
+      <w:r>
+        <w:t xml:space="preserve">Rejects duplicates.</w:t>
+      </w:r>
+    </w:p>
+    <w:p>
+      <w:pPr>
+        <w:pStyle w:val="ListParagraph"/>
+        <w:numPr>
+          <w:ilvl w:val="0"/>
+          <w:numId w:val="2"/>
+        </w:numPr>
+        <w:spacing w:after="40"/>
+      </w:pPr>
+      <w:r>
+        <w:t xml:space="preserve">Always creates a plain 'user' (admins are promoted later via the admin panel or DB).</w:t>
+      </w:r>
+    </w:p>
+    <w:p>
+      <w:pPr>
+        <w:pStyle w:val="ListParagraph"/>
+        <w:numPr>
+          <w:ilvl w:val="0"/>
+          <w:numId w:val="2"/>
+        </w:numPr>
+        <w:spacing w:after="40"/>
+      </w:pPr>
+      <w:r>
+        <w:t xml:space="preserve">Creates the user, hashes the password, commits, returns 201.</w:t>
       </w:r>
     </w:p>
     <w:p>
@@ -2577,7 +2703,7 @@
         <w:t xml:space="preserve">Tech point: </w:t>
       </w:r>
       <w:r>
-        <w:t xml:space="preserve">Classic server-rendered form handling with render_template.</w:t>
+        <w:t xml:space="preserve">JSON API registration for the mobile app; jsonify returns machine-readable responses.</w:t>
       </w:r>
     </w:p>
     <w:p>
@@ -2592,15 +2718,7 @@
         <w:t xml:space="preserve">Thinking behind it: </w:t>
       </w:r>
       <w:r>
-        <w:t xml:space="preserve">Humans need a page with inline error messages, distinct from the JSON API used by apps.</w:t>
-      </w:r>
-    </w:p>
-    <w:p>
-      <w:pPr>
-        <w:pStyle w:val="Heading2"/>
-      </w:pPr>
-      <w:r>
-        <w:t xml:space="preserve">7.2 Login, session &amp; token</w:t>
+        <w:t xml:space="preserve">Fixes the original bug where an undefined variable 'name' crashed this route every time - it now reads name from the request safely.</w:t>
       </w:r>
     </w:p>
     <w:p>
@@ -2608,7 +2726,7 @@
         <w:pStyle w:val="Heading3"/>
       </w:pPr>
       <w:r>
-        <w:t xml:space="preserve">api_login  (POST /login)</w:t>
+        <w:t xml:space="preserve">register  (POST /register)</w:t>
       </w:r>
     </w:p>
     <w:p>
@@ -2625,7 +2743,7 @@
           <w:sz w:val="18"/>
           <w:szCs w:val="18"/>
         </w:rPr>
-        <w:t xml:space="preserve">verify password -&gt; issue Bearer token + return profile JSON</w:t>
+        <w:t xml:space="preserve">minimal JSON {username, password}</w:t>
       </w:r>
     </w:p>
     <w:p>
@@ -2653,46 +2771,7 @@
         <w:spacing w:after="40"/>
       </w:pPr>
       <w:r>
-        <w:t xml:space="preserve">Looks up the user and checks the password.</w:t>
-      </w:r>
-    </w:p>
-    <w:p>
-      <w:pPr>
-        <w:pStyle w:val="ListParagraph"/>
-        <w:numPr>
-          <w:ilvl w:val="0"/>
-          <w:numId w:val="2"/>
-        </w:numPr>
-        <w:spacing w:after="40"/>
-      </w:pPr>
-      <w:r>
-        <w:t xml:space="preserve">On success, issues a signed bearer token and returns it with profile and VIP info.</w:t>
-      </w:r>
-    </w:p>
-    <w:p>
-      <w:pPr>
-        <w:pStyle w:val="ListParagraph"/>
-        <w:numPr>
-          <w:ilvl w:val="0"/>
-          <w:numId w:val="2"/>
-        </w:numPr>
-        <w:spacing w:after="40"/>
-      </w:pPr>
-      <w:r>
-        <w:t xml:space="preserve">On failure returns 401.</w:t>
-      </w:r>
-    </w:p>
-    <w:p>
-      <w:pPr>
-        <w:pStyle w:val="ListParagraph"/>
-        <w:numPr>
-          <w:ilvl w:val="0"/>
-          <w:numId w:val="2"/>
-        </w:numPr>
-        <w:spacing w:after="40"/>
-      </w:pPr>
-      <w:r>
-        <w:t xml:space="preserve">Rate-limited.</w:t>
+        <w:t xml:space="preserve">A stripped-down JSON register with just username + password.</w:t>
       </w:r>
     </w:p>
     <w:p>
@@ -2707,7 +2786,7 @@
         <w:t xml:space="preserve">Tech point: </w:t>
       </w:r>
       <w:r>
-        <w:t xml:space="preserve">Token issuance for stateless API auth; the mobile app stores the token and sends it back to reach /save etc.</w:t>
+        <w:t xml:space="preserve">A second, simpler endpoint kept for compatibility.</w:t>
       </w:r>
     </w:p>
     <w:p>
@@ -2722,7 +2801,7 @@
         <w:t xml:space="preserve">Thinking behind it: </w:t>
       </w:r>
       <w:r>
-        <w:t xml:space="preserve">Websites use cookies, but a mobile app cannot rely on cookies for API calls - a token is the standard answer.</w:t>
+        <w:t xml:space="preserve">Some clients only send credentials; this avoids forcing optional fields.</w:t>
       </w:r>
     </w:p>
     <w:p>
@@ -2730,7 +2809,7 @@
         <w:pStyle w:val="Heading3"/>
       </w:pPr>
       <w:r>
-        <w:t xml:space="preserve">web_login_page (GET /login) / web_login_action (POST /web_login)</w:t>
+        <w:t xml:space="preserve">web_register_page (GET) / web_register_action (POST /web_register)</w:t>
       </w:r>
     </w:p>
     <w:p>
@@ -2747,7 +2826,7 @@
           <w:sz w:val="18"/>
           <w:szCs w:val="18"/>
         </w:rPr>
-        <w:t xml:space="preserve">show login.html  /  set session['user_id']</w:t>
+        <w:t xml:space="preserve">render register.html  /  validate form, create user</w:t>
       </w:r>
     </w:p>
     <w:p>
@@ -2775,33 +2854,20 @@
         <w:spacing w:after="40"/>
       </w:pPr>
       <w:r>
-        <w:t xml:space="preserve">The GET shows the login page (or redirects in if already logged in).</w:t>
-      </w:r>
-    </w:p>
-    <w:p>
-      <w:pPr>
-        <w:pStyle w:val="ListParagraph"/>
-        <w:numPr>
-          <w:ilvl w:val="0"/>
-          <w:numId w:val="2"/>
-        </w:numPr>
-        <w:spacing w:after="40"/>
-      </w:pPr>
-      <w:r>
-        <w:t xml:space="preserve">The POST verifies credentials and stores user_id in the session cookie.</w:t>
-      </w:r>
-    </w:p>
-    <w:p>
-      <w:pPr>
-        <w:pStyle w:val="ListParagraph"/>
-        <w:numPr>
-          <w:ilvl w:val="0"/>
-          <w:numId w:val="2"/>
-        </w:numPr>
-        <w:spacing w:after="40"/>
-      </w:pPr>
-      <w:r>
-        <w:t xml:space="preserve">Rate-limited.</w:t>
+        <w:t xml:space="preserve">The GET shows the registration HTML page.</w:t>
+      </w:r>
+    </w:p>
+    <w:p>
+      <w:pPr>
+        <w:pStyle w:val="ListParagraph"/>
+        <w:numPr>
+          <w:ilvl w:val="0"/>
+          <w:numId w:val="2"/>
+        </w:numPr>
+        <w:spacing w:after="40"/>
+      </w:pPr>
+      <w:r>
+        <w:t xml:space="preserve">The POST validates the form (required fields, matching passwords, unique username) and creates the account, then shows login.</w:t>
       </w:r>
     </w:p>
     <w:p>
@@ -2816,7 +2882,7 @@
         <w:t xml:space="preserve">Tech point: </w:t>
       </w:r>
       <w:r>
-        <w:t xml:space="preserve">Cookie/session login for the browser.</w:t>
+        <w:t xml:space="preserve">Classic server-rendered form handling with render_template.</w:t>
       </w:r>
     </w:p>
     <w:p>
@@ -2831,7 +2897,15 @@
         <w:t xml:space="preserve">Thinking behind it: </w:t>
       </w:r>
       <w:r>
-        <w:t xml:space="preserve">Keeping the website (session) and the app (token) paths separate keeps each simple and correct.</w:t>
+        <w:t xml:space="preserve">Humans need a page with inline error messages, distinct from the JSON API used by apps.</w:t>
+      </w:r>
+    </w:p>
+    <w:p>
+      <w:pPr>
+        <w:pStyle w:val="Heading2"/>
+      </w:pPr>
+      <w:r>
+        <w:t xml:space="preserve">7.2 Login, session &amp; token</w:t>
       </w:r>
     </w:p>
     <w:p>
@@ -2839,7 +2913,7 @@
         <w:pStyle w:val="Heading3"/>
       </w:pPr>
       <w:r>
-        <w:t xml:space="preserve">logout  (GET /logout)</w:t>
+        <w:t xml:space="preserve">api_login  (POST /login)</w:t>
       </w:r>
     </w:p>
     <w:p>
@@ -2856,7 +2930,7 @@
           <w:sz w:val="18"/>
           <w:szCs w:val="18"/>
         </w:rPr>
-        <w:t xml:space="preserve">session.clear()</w:t>
+        <w:t xml:space="preserve">verify password -&gt; issue Bearer token + return profile JSON</w:t>
       </w:r>
     </w:p>
     <w:p>
@@ -2884,7 +2958,46 @@
         <w:spacing w:after="40"/>
       </w:pPr>
       <w:r>
-        <w:t xml:space="preserve">Clears the whole session and redirects to login.</w:t>
+        <w:t xml:space="preserve">Looks up the user and checks the password.</w:t>
+      </w:r>
+    </w:p>
+    <w:p>
+      <w:pPr>
+        <w:pStyle w:val="ListParagraph"/>
+        <w:numPr>
+          <w:ilvl w:val="0"/>
+          <w:numId w:val="2"/>
+        </w:numPr>
+        <w:spacing w:after="40"/>
+      </w:pPr>
+      <w:r>
+        <w:t xml:space="preserve">On success, issues a signed bearer token and returns it with profile and VIP info.</w:t>
+      </w:r>
+    </w:p>
+    <w:p>
+      <w:pPr>
+        <w:pStyle w:val="ListParagraph"/>
+        <w:numPr>
+          <w:ilvl w:val="0"/>
+          <w:numId w:val="2"/>
+        </w:numPr>
+        <w:spacing w:after="40"/>
+      </w:pPr>
+      <w:r>
+        <w:t xml:space="preserve">On failure returns 401.</w:t>
+      </w:r>
+    </w:p>
+    <w:p>
+      <w:pPr>
+        <w:pStyle w:val="ListParagraph"/>
+        <w:numPr>
+          <w:ilvl w:val="0"/>
+          <w:numId w:val="2"/>
+        </w:numPr>
+        <w:spacing w:after="40"/>
+      </w:pPr>
+      <w:r>
+        <w:t xml:space="preserve">Rate-limited.</w:t>
       </w:r>
     </w:p>
     <w:p>
@@ -2899,7 +3012,7 @@
         <w:t xml:space="preserve">Tech point: </w:t>
       </w:r>
       <w:r>
-        <w:t xml:space="preserve">Wipes the signed cookie contents.</w:t>
+        <w:t xml:space="preserve">Token issuance for stateless API auth; the mobile app stores the token and sends it back to reach /save etc.</w:t>
       </w:r>
     </w:p>
     <w:p>
@@ -2914,15 +3027,7 @@
         <w:t xml:space="preserve">Thinking behind it: </w:t>
       </w:r>
       <w:r>
-        <w:t xml:space="preserve">Clearing everything (not just user_id) avoids leftover session keys.</w:t>
-      </w:r>
-    </w:p>
-    <w:p>
-      <w:pPr>
-        <w:pStyle w:val="Heading2"/>
-      </w:pPr>
-      <w:r>
-        <w:t xml:space="preserve">7.3 Password reset (new)</w:t>
+        <w:t xml:space="preserve">Websites use cookies, but a mobile app cannot rely on cookies for API calls - a token is the standard answer.</w:t>
       </w:r>
     </w:p>
     <w:p>
@@ -2930,7 +3035,7 @@
         <w:pStyle w:val="Heading3"/>
       </w:pPr>
       <w:r>
-        <w:t xml:space="preserve">forgot_password (GET/POST)</w:t>
+        <w:t xml:space="preserve">web_login_page (GET /login) / web_login_action (POST /web_login)</w:t>
       </w:r>
     </w:p>
     <w:p>
@@ -2947,7 +3052,7 @@
           <w:sz w:val="18"/>
           <w:szCs w:val="18"/>
         </w:rPr>
-        <w:t xml:space="preserve">make reset token -&gt; log link (dev) -&gt; always show same message</w:t>
+        <w:t xml:space="preserve">show login.html  /  set session['user_id']</w:t>
       </w:r>
     </w:p>
     <w:p>
@@ -2975,33 +3080,20 @@
         <w:spacing w:after="40"/>
       </w:pPr>
       <w:r>
-        <w:t xml:space="preserve">GET shows the form; POST looks up the user.</w:t>
-      </w:r>
-    </w:p>
-    <w:p>
-      <w:pPr>
-        <w:pStyle w:val="ListParagraph"/>
-        <w:numPr>
-          <w:ilvl w:val="0"/>
-          <w:numId w:val="2"/>
-        </w:numPr>
-        <w:spacing w:after="40"/>
-      </w:pPr>
-      <w:r>
-        <w:t xml:space="preserve">If found, builds a time-limited reset link and logs it (a hook for sending email later).</w:t>
-      </w:r>
-    </w:p>
-    <w:p>
-      <w:pPr>
-        <w:pStyle w:val="ListParagraph"/>
-        <w:numPr>
-          <w:ilvl w:val="0"/>
-          <w:numId w:val="2"/>
-        </w:numPr>
-        <w:spacing w:after="40"/>
-      </w:pPr>
-      <w:r>
-        <w:t xml:space="preserve">Always shows the same confirmation, whether or not the account exists.</w:t>
+        <w:t xml:space="preserve">The GET shows the login page (or redirects in if already logged in).</w:t>
+      </w:r>
+    </w:p>
+    <w:p>
+      <w:pPr>
+        <w:pStyle w:val="ListParagraph"/>
+        <w:numPr>
+          <w:ilvl w:val="0"/>
+          <w:numId w:val="2"/>
+        </w:numPr>
+        <w:spacing w:after="40"/>
+      </w:pPr>
+      <w:r>
+        <w:t xml:space="preserve">The POST verifies credentials and stores user_id in the session cookie.</w:t>
       </w:r>
     </w:p>
     <w:p>
@@ -3029,7 +3121,7 @@
         <w:t xml:space="preserve">Tech point: </w:t>
       </w:r>
       <w:r>
-        <w:t xml:space="preserve">Signed token in the URL; deliberate non-disclosure of which accounts exist.</w:t>
+        <w:t xml:space="preserve">Cookie/session login for the browser.</w:t>
       </w:r>
     </w:p>
     <w:p>
@@ -3044,7 +3136,7 @@
         <w:t xml:space="preserve">Thinking behind it: </w:t>
       </w:r>
       <w:r>
-        <w:t xml:space="preserve">Telling attackers which usernames are valid is an information leak; identical responses prevent enumeration. Email sending is left as a clearly marked hook.</w:t>
+        <w:t xml:space="preserve">Keeping the website (session) and the app (token) paths separate keeps each simple and correct.</w:t>
       </w:r>
     </w:p>
     <w:p>
@@ -3052,7 +3144,7 @@
         <w:pStyle w:val="Heading3"/>
       </w:pPr>
       <w:r>
-        <w:t xml:space="preserve">reset_password (GET/POST /reset_password/&lt;token&gt;)</w:t>
+        <w:t xml:space="preserve">logout  (GET /logout)</w:t>
       </w:r>
     </w:p>
     <w:p>
@@ -3069,7 +3161,7 @@
           <w:sz w:val="18"/>
           <w:szCs w:val="18"/>
         </w:rPr>
-        <w:t xml:space="preserve">verify token -&gt; set new password</w:t>
+        <w:t xml:space="preserve">session.clear()</w:t>
       </w:r>
     </w:p>
     <w:p>
@@ -3097,33 +3189,7 @@
         <w:spacing w:after="40"/>
       </w:pPr>
       <w:r>
-        <w:t xml:space="preserve">Verifies the token (signature + age).</w:t>
-      </w:r>
-    </w:p>
-    <w:p>
-      <w:pPr>
-        <w:pStyle w:val="ListParagraph"/>
-        <w:numPr>
-          <w:ilvl w:val="0"/>
-          <w:numId w:val="2"/>
-        </w:numPr>
-        <w:spacing w:after="40"/>
-      </w:pPr>
-      <w:r>
-        <w:t xml:space="preserve">On POST with matching passwords, sets the new password and commits.</w:t>
-      </w:r>
-    </w:p>
-    <w:p>
-      <w:pPr>
-        <w:pStyle w:val="ListParagraph"/>
-        <w:numPr>
-          <w:ilvl w:val="0"/>
-          <w:numId w:val="2"/>
-        </w:numPr>
-        <w:spacing w:after="40"/>
-      </w:pPr>
-      <w:r>
-        <w:t xml:space="preserve">Invalid/expired tokens show an error with a link to try again.</w:t>
+        <w:t xml:space="preserve">Clears the whole session and redirects to login.</w:t>
       </w:r>
     </w:p>
     <w:p>
@@ -3138,7 +3204,7 @@
         <w:t xml:space="preserve">Tech point: </w:t>
       </w:r>
       <w:r>
-        <w:t xml:space="preserve">Stateless verification via read_token; no reset table needed.</w:t>
+        <w:t xml:space="preserve">Wipes the signed cookie contents.</w:t>
       </w:r>
     </w:p>
     <w:p>
@@ -3153,7 +3219,7 @@
         <w:t xml:space="preserve">Thinking behind it: </w:t>
       </w:r>
       <w:r>
-        <w:t xml:space="preserve">The token both authorizes the reset and identifies the user, so the flow stays simple and safe.</w:t>
+        <w:t xml:space="preserve">Clearing everything (not just user_id) avoids leftover session keys.</w:t>
       </w:r>
     </w:p>
     <w:p>
@@ -3161,7 +3227,7 @@
         <w:pStyle w:val="Heading2"/>
       </w:pPr>
       <w:r>
-        <w:t xml:space="preserve">7.4 Profile</w:t>
+        <w:t xml:space="preserve">7.3 Password reset (new)</w:t>
       </w:r>
     </w:p>
     <w:p>
@@ -3169,7 +3235,7 @@
         <w:pStyle w:val="Heading3"/>
       </w:pPr>
       <w:r>
-        <w:t xml:space="preserve">update_profile (POST /api/update_profile)</w:t>
+        <w:t xml:space="preserve">forgot_password (GET/POST)</w:t>
       </w:r>
     </w:p>
     <w:p>
@@ -3186,7 +3252,7 @@
           <w:sz w:val="18"/>
           <w:szCs w:val="18"/>
         </w:rPr>
-        <w:t xml:space="preserve">JSON -&gt; update height/weight/age/linked id</w:t>
+        <w:t xml:space="preserve">make reset token -&gt; log link (dev) -&gt; always show same message</w:t>
       </w:r>
     </w:p>
     <w:p>
@@ -3214,7 +3280,46 @@
         <w:spacing w:after="40"/>
       </w:pPr>
       <w:r>
-        <w:t xml:space="preserve">Finds the user by username and updates a few profile fields.</w:t>
+        <w:t xml:space="preserve">GET shows the form; POST looks up the user.</w:t>
+      </w:r>
+    </w:p>
+    <w:p>
+      <w:pPr>
+        <w:pStyle w:val="ListParagraph"/>
+        <w:numPr>
+          <w:ilvl w:val="0"/>
+          <w:numId w:val="2"/>
+        </w:numPr>
+        <w:spacing w:after="40"/>
+      </w:pPr>
+      <w:r>
+        <w:t xml:space="preserve">If found, builds a time-limited reset link and logs it (a hook for sending email later).</w:t>
+      </w:r>
+    </w:p>
+    <w:p>
+      <w:pPr>
+        <w:pStyle w:val="ListParagraph"/>
+        <w:numPr>
+          <w:ilvl w:val="0"/>
+          <w:numId w:val="2"/>
+        </w:numPr>
+        <w:spacing w:after="40"/>
+      </w:pPr>
+      <w:r>
+        <w:t xml:space="preserve">Always shows the same confirmation, whether or not the account exists.</w:t>
+      </w:r>
+    </w:p>
+    <w:p>
+      <w:pPr>
+        <w:pStyle w:val="ListParagraph"/>
+        <w:numPr>
+          <w:ilvl w:val="0"/>
+          <w:numId w:val="2"/>
+        </w:numPr>
+        <w:spacing w:after="40"/>
+      </w:pPr>
+      <w:r>
+        <w:t xml:space="preserve">Rate-limited.</w:t>
       </w:r>
     </w:p>
     <w:p>
@@ -3229,7 +3334,7 @@
         <w:t xml:space="preserve">Tech point: </w:t>
       </w:r>
       <w:r>
-        <w:t xml:space="preserve">Simple JSON write endpoint.</w:t>
+        <w:t xml:space="preserve">Signed token in the URL; deliberate non-disclosure of which accounts exist.</w:t>
       </w:r>
     </w:p>
     <w:p>
@@ -3244,15 +3349,7 @@
         <w:t xml:space="preserve">Thinking behind it: </w:t>
       </w:r>
       <w:r>
-        <w:t xml:space="preserve">Lets the app edit profile fields the user owns without touching admin tools.</w:t>
-      </w:r>
-    </w:p>
-    <w:p>
-      <w:pPr>
-        <w:pStyle w:val="Heading2"/>
-      </w:pPr>
-      <w:r>
-        <w:t xml:space="preserve">7.5 Payment + ECPay</w:t>
+        <w:t xml:space="preserve">Telling attackers which usernames are valid is an information leak; identical responses prevent enumeration. Email sending is left as a clearly marked hook.</w:t>
       </w:r>
     </w:p>
     <w:p>
@@ -3260,7 +3357,7 @@
         <w:pStyle w:val="Heading3"/>
       </w:pPr>
       <w:r>
-        <w:t xml:space="preserve">pay_vip (GET /pay_vip)</w:t>
+        <w:t xml:space="preserve">reset_password (GET/POST /reset_password/&lt;token&gt;)</w:t>
       </w:r>
     </w:p>
     <w:p>
@@ -3277,7 +3374,7 @@
           <w:sz w:val="18"/>
           <w:szCs w:val="18"/>
         </w:rPr>
-        <w:t xml:space="preserve">build order params -&gt; sdk.create_order -&gt; POST auto-submit form to ECPay</w:t>
+        <w:t xml:space="preserve">verify token -&gt; set new password</w:t>
       </w:r>
     </w:p>
     <w:p>
@@ -3305,33 +3402,33 @@
         <w:spacing w:after="40"/>
       </w:pPr>
       <w:r>
-        <w:t xml:space="preserve">Builds the order (amount, item, callback URLs from PUBLIC_BASE_URL).</w:t>
-      </w:r>
-    </w:p>
-    <w:p>
-      <w:pPr>
-        <w:pStyle w:val="ListParagraph"/>
-        <w:numPr>
-          <w:ilvl w:val="0"/>
-          <w:numId w:val="2"/>
-        </w:numPr>
-        <w:spacing w:after="40"/>
-      </w:pPr>
-      <w:r>
-        <w:t xml:space="preserve">Asks the ECPay SDK to sign the order (CheckMacValue).</w:t>
-      </w:r>
-    </w:p>
-    <w:p>
-      <w:pPr>
-        <w:pStyle w:val="ListParagraph"/>
-        <w:numPr>
-          <w:ilvl w:val="0"/>
-          <w:numId w:val="2"/>
-        </w:numPr>
-        <w:spacing w:after="40"/>
-      </w:pPr>
-      <w:r>
-        <w:t xml:space="preserve">Renders a page that auto-submits the signed form to ECPay's payment page.</w:t>
+        <w:t xml:space="preserve">Verifies the token (signature + age).</w:t>
+      </w:r>
+    </w:p>
+    <w:p>
+      <w:pPr>
+        <w:pStyle w:val="ListParagraph"/>
+        <w:numPr>
+          <w:ilvl w:val="0"/>
+          <w:numId w:val="2"/>
+        </w:numPr>
+        <w:spacing w:after="40"/>
+      </w:pPr>
+      <w:r>
+        <w:t xml:space="preserve">On POST with matching passwords, sets the new password and commits.</w:t>
+      </w:r>
+    </w:p>
+    <w:p>
+      <w:pPr>
+        <w:pStyle w:val="ListParagraph"/>
+        <w:numPr>
+          <w:ilvl w:val="0"/>
+          <w:numId w:val="2"/>
+        </w:numPr>
+        <w:spacing w:after="40"/>
+      </w:pPr>
+      <w:r>
+        <w:t xml:space="preserve">Invalid/expired tokens show an error with a link to try again.</w:t>
       </w:r>
     </w:p>
     <w:p>
@@ -3346,7 +3443,7 @@
         <w:t xml:space="preserve">Tech point: </w:t>
       </w:r>
       <w:r>
-        <w:t xml:space="preserve">ECPay redirect flow; the SDK computes the SHA256 signature ECPay requires.</w:t>
+        <w:t xml:space="preserve">Stateless verification via read_token; no reset table needed.</w:t>
       </w:r>
     </w:p>
     <w:p>
@@ -3361,7 +3458,7 @@
         <w:t xml:space="preserve">Thinking behind it: </w:t>
       </w:r>
       <w:r>
-        <w:t xml:space="preserve">Callback URLs and price come from config so test vs live and amounts are settings, not code edits.</w:t>
+        <w:t xml:space="preserve">The token both authorizes the reset and identifies the user, so the flow stays simple and safe.</w:t>
       </w:r>
     </w:p>
     <w:p>
@@ -3369,7 +3466,7 @@
         <w:pStyle w:val="Heading3"/>
       </w:pPr>
       <w:r>
-        <w:t xml:space="preserve">payment_notify (POST /payment/notify)</w:t>
+        <w:t xml:space="preserve">change_password (GET/POST /change_password)</w:t>
       </w:r>
     </w:p>
     <w:p>
@@ -3386,7 +3483,7 @@
           <w:sz w:val="18"/>
           <w:szCs w:val="18"/>
         </w:rPr>
-        <w:t xml:space="preserve">verify CheckMacValue -&gt; if paid, activate VIP -&gt; return '1|OK'</w:t>
+        <w:t xml:space="preserve">@login_required -&gt; verify current password -&gt; set new</w:t>
       </w:r>
     </w:p>
     <w:p>
@@ -3414,46 +3511,33 @@
         <w:spacing w:after="40"/>
       </w:pPr>
       <w:r>
-        <w:t xml:space="preserve">Receives ECPay's server-to-server callback.</w:t>
-      </w:r>
-    </w:p>
-    <w:p>
-      <w:pPr>
-        <w:pStyle w:val="ListParagraph"/>
-        <w:numPr>
-          <w:ilvl w:val="0"/>
-          <w:numId w:val="2"/>
-        </w:numPr>
-        <w:spacing w:after="40"/>
-      </w:pPr>
-      <w:r>
-        <w:t xml:space="preserve">Recomputes the signature and compares it to the one ECPay sent.</w:t>
-      </w:r>
-    </w:p>
-    <w:p>
-      <w:pPr>
-        <w:pStyle w:val="ListParagraph"/>
-        <w:numPr>
-          <w:ilvl w:val="0"/>
-          <w:numId w:val="2"/>
-        </w:numPr>
-        <w:spacing w:after="40"/>
-      </w:pPr>
-      <w:r>
-        <w:t xml:space="preserve">If valid and paid, sets is_vip and an expiry date, writes a PaymentLog, and replies '1|OK'.</w:t>
-      </w:r>
-    </w:p>
-    <w:p>
-      <w:pPr>
-        <w:pStyle w:val="ListParagraph"/>
-        <w:numPr>
-          <w:ilvl w:val="0"/>
-          <w:numId w:val="2"/>
-        </w:numPr>
-        <w:spacing w:after="40"/>
-      </w:pPr>
-      <w:r>
-        <w:t xml:space="preserve">CSRF-exempt (it is a machine call, not a browser form).</w:t>
+        <w:t xml:space="preserve">For an already-logged-in user.</w:t>
+      </w:r>
+    </w:p>
+    <w:p>
+      <w:pPr>
+        <w:pStyle w:val="ListParagraph"/>
+        <w:numPr>
+          <w:ilvl w:val="0"/>
+          <w:numId w:val="2"/>
+        </w:numPr>
+        <w:spacing w:after="40"/>
+      </w:pPr>
+      <w:r>
+        <w:t xml:space="preserve">Verifies the current password, checks the two new entries match, updates it.</w:t>
+      </w:r>
+    </w:p>
+    <w:p>
+      <w:pPr>
+        <w:pStyle w:val="ListParagraph"/>
+        <w:numPr>
+          <w:ilvl w:val="0"/>
+          <w:numId w:val="2"/>
+        </w:numPr>
+        <w:spacing w:after="40"/>
+      </w:pPr>
+      <w:r>
+        <w:t xml:space="preserve">CSRF-protected form; linked from the personal page.</w:t>
       </w:r>
     </w:p>
     <w:p>
@@ -3468,7 +3552,7 @@
         <w:t xml:space="preserve">Tech point: </w:t>
       </w:r>
       <w:r>
-        <w:t xml:space="preserve">Signature verification proves the callback truly came from ECPay and was not forged.</w:t>
+        <w:t xml:space="preserve">Self-service credential change distinct from the token-based reset.</w:t>
       </w:r>
     </w:p>
     <w:p>
@@ -3483,7 +3567,15 @@
         <w:t xml:space="preserve">Thinking behind it: </w:t>
       </w:r>
       <w:r>
-        <w:t xml:space="preserve">Never trust a payment 'success' from the browser; only the signed server callback flips VIP on. The '1|OK' reply is ECPay's required acknowledgement.</w:t>
+        <w:t xml:space="preserve">A logged-in user changing their own password is a basic need the original app lacked (only admin reset existed).</w:t>
+      </w:r>
+    </w:p>
+    <w:p>
+      <w:pPr>
+        <w:pStyle w:val="Heading2"/>
+      </w:pPr>
+      <w:r>
+        <w:t xml:space="preserve">7.4 Profile</w:t>
       </w:r>
     </w:p>
     <w:p>
@@ -3491,7 +3583,7 @@
         <w:pStyle w:val="Heading3"/>
       </w:pPr>
       <w:r>
-        <w:t xml:space="preserve">payment_result (POST /payment/result)</w:t>
+        <w:t xml:space="preserve">update_profile (POST /api/update_profile)</w:t>
       </w:r>
     </w:p>
     <w:p>
@@ -3508,7 +3600,7 @@
           <w:sz w:val="18"/>
           <w:szCs w:val="18"/>
         </w:rPr>
-        <w:t xml:space="preserve">render payment_success.html</w:t>
+        <w:t xml:space="preserve">JSON -&gt; update name/email/phone/linked id</w:t>
       </w:r>
     </w:p>
     <w:p>
@@ -3536,20 +3628,7 @@
         <w:spacing w:after="40"/>
       </w:pPr>
       <w:r>
-        <w:t xml:space="preserve">The page the user's browser lands on after paying; shows order id and amount.</w:t>
-      </w:r>
-    </w:p>
-    <w:p>
-      <w:pPr>
-        <w:pStyle w:val="ListParagraph"/>
-        <w:numPr>
-          <w:ilvl w:val="0"/>
-          <w:numId w:val="2"/>
-        </w:numPr>
-        <w:spacing w:after="40"/>
-      </w:pPr>
-      <w:r>
-        <w:t xml:space="preserve">CSRF-exempt (ECPay posts to it).</w:t>
+        <w:t xml:space="preserve">Finds the user by username and updates generic profile fields only.</w:t>
       </w:r>
     </w:p>
     <w:p>
@@ -3564,7 +3643,7 @@
         <w:t xml:space="preserve">Tech point: </w:t>
       </w:r>
       <w:r>
-        <w:t xml:space="preserve">Separates the user-facing result page from the authoritative server callback.</w:t>
+        <w:t xml:space="preserve">Simple JSON write endpoint (no domain-specific fields).</w:t>
       </w:r>
     </w:p>
     <w:p>
@@ -3579,7 +3658,7 @@
         <w:t xml:space="preserve">Thinking behind it: </w:t>
       </w:r>
       <w:r>
-        <w:t xml:space="preserve">The browser result is cosmetic; activation already happened in payment_notify - this avoids granting VIP on a spoofed redirect.</w:t>
+        <w:t xml:space="preserve">Lets the app edit profile fields the user owns without touching admin tools.</w:t>
       </w:r>
     </w:p>
     <w:p>
@@ -3587,7 +3666,7 @@
         <w:pStyle w:val="Heading2"/>
       </w:pPr>
       <w:r>
-        <w:t xml:space="preserve">7.6 VIP (admin utilities)</w:t>
+        <w:t xml:space="preserve">7.5 Payment + ECPay</w:t>
       </w:r>
     </w:p>
     <w:p>
@@ -3595,7 +3674,7 @@
         <w:pStyle w:val="Heading3"/>
       </w:pPr>
       <w:r>
-        <w:t xml:space="preserve">set_vip / reset_vip (POST /admin/set_vip, /admin/reset_vip)</w:t>
+        <w:t xml:space="preserve">pay_vip (GET /pay_vip)</w:t>
       </w:r>
     </w:p>
     <w:p>
@@ -3612,7 +3691,7 @@
           <w:sz w:val="18"/>
           <w:szCs w:val="18"/>
         </w:rPr>
-        <w:t xml:space="preserve">admin_required -&gt; toggle a user's VIP</w:t>
+        <w:t xml:space="preserve">calls create_ecpay_order(...) -&gt; POST auto-submit form to ECPay</w:t>
       </w:r>
     </w:p>
     <w:p>
@@ -3640,7 +3719,33 @@
         <w:spacing w:after="40"/>
       </w:pPr>
       <w:r>
-        <w:t xml:space="preserve">Admin-only endpoints to turn a chosen user's VIP on (with expiry) or off.</w:t>
+        <w:t xml:space="preserve">Calls the reusable create_ecpay_order helper with the VIP item + price.</w:t>
+      </w:r>
+    </w:p>
+    <w:p>
+      <w:pPr>
+        <w:pStyle w:val="ListParagraph"/>
+        <w:numPr>
+          <w:ilvl w:val="0"/>
+          <w:numId w:val="2"/>
+        </w:numPr>
+        <w:spacing w:after="40"/>
+      </w:pPr>
+      <w:r>
+        <w:t xml:space="preserve">Asks the ECPay SDK to sign the order (CheckMacValue).</w:t>
+      </w:r>
+    </w:p>
+    <w:p>
+      <w:pPr>
+        <w:pStyle w:val="ListParagraph"/>
+        <w:numPr>
+          <w:ilvl w:val="0"/>
+          <w:numId w:val="2"/>
+        </w:numPr>
+        <w:spacing w:after="40"/>
+      </w:pPr>
+      <w:r>
+        <w:t xml:space="preserve">Renders a page that auto-submits the signed form to ECPay's payment page.</w:t>
       </w:r>
     </w:p>
     <w:p>
@@ -3655,7 +3760,7 @@
         <w:t xml:space="preserve">Tech point: </w:t>
       </w:r>
       <w:r>
-        <w:t xml:space="preserve">Role-gated POST actions.</w:t>
+        <w:t xml:space="preserve">ECPay redirect flow; the SDK computes the SHA256 signature ECPay requires.</w:t>
       </w:r>
     </w:p>
     <w:p>
@@ -3670,15 +3775,7 @@
         <w:t xml:space="preserve">Thinking behind it: </w:t>
       </w:r>
       <w:r>
-        <w:t xml:space="preserve">Replaces the old /debug/set_vip and /debug/reset_vip, which were open backdoors keyed to a hardcoded username - a real security hole.</w:t>
-      </w:r>
-    </w:p>
-    <w:p>
-      <w:pPr>
-        <w:pStyle w:val="Heading2"/>
-      </w:pPr>
-      <w:r>
-        <w:t xml:space="preserve">7.7 Account management (admin)</w:t>
+        <w:t xml:space="preserve">Callback URLs and price come from config so test vs live and amounts are settings, not code edits.</w:t>
       </w:r>
     </w:p>
     <w:p>
@@ -3686,7 +3783,7 @@
         <w:pStyle w:val="Heading3"/>
       </w:pPr>
       <w:r>
-        <w:t xml:space="preserve">admin_accounts (GET /admin/accounts)</w:t>
+        <w:t xml:space="preserve">payment_notify (POST /payment/notify)</w:t>
       </w:r>
     </w:p>
     <w:p>
@@ -3703,7 +3800,7 @@
           <w:sz w:val="18"/>
           <w:szCs w:val="18"/>
         </w:rPr>
-        <w:t xml:space="preserve">list + optional search</w:t>
+        <w:t xml:space="preserve">verify CheckMacValue -&gt; if paid, activate VIP -&gt; return '1|OK'</w:t>
       </w:r>
     </w:p>
     <w:p>
@@ -3731,7 +3828,46 @@
         <w:spacing w:after="40"/>
       </w:pPr>
       <w:r>
-        <w:t xml:space="preserve">Lists accounts, optionally filtered by a search keyword.</w:t>
+        <w:t xml:space="preserve">Receives ECPay's server-to-server callback.</w:t>
+      </w:r>
+    </w:p>
+    <w:p>
+      <w:pPr>
+        <w:pStyle w:val="ListParagraph"/>
+        <w:numPr>
+          <w:ilvl w:val="0"/>
+          <w:numId w:val="2"/>
+        </w:numPr>
+        <w:spacing w:after="40"/>
+      </w:pPr>
+      <w:r>
+        <w:t xml:space="preserve">Recomputes the signature and compares it to the one ECPay sent.</w:t>
+      </w:r>
+    </w:p>
+    <w:p>
+      <w:pPr>
+        <w:pStyle w:val="ListParagraph"/>
+        <w:numPr>
+          <w:ilvl w:val="0"/>
+          <w:numId w:val="2"/>
+        </w:numPr>
+        <w:spacing w:after="40"/>
+      </w:pPr>
+      <w:r>
+        <w:t xml:space="preserve">If valid and paid, sets is_vip and an expiry date, writes a PaymentLog, and replies '1|OK'.</w:t>
+      </w:r>
+    </w:p>
+    <w:p>
+      <w:pPr>
+        <w:pStyle w:val="ListParagraph"/>
+        <w:numPr>
+          <w:ilvl w:val="0"/>
+          <w:numId w:val="2"/>
+        </w:numPr>
+        <w:spacing w:after="40"/>
+      </w:pPr>
+      <w:r>
+        <w:t xml:space="preserve">CSRF-exempt (it is a machine call, not a browser form).</w:t>
       </w:r>
     </w:p>
     <w:p>
@@ -3746,7 +3882,7 @@
         <w:t xml:space="preserve">Tech point: </w:t>
       </w:r>
       <w:r>
-        <w:t xml:space="preserve">Server-rendered admin table.</w:t>
+        <w:t xml:space="preserve">Signature verification proves the callback truly came from ECPay and was not forged.</w:t>
       </w:r>
     </w:p>
     <w:p>
@@ -3761,7 +3897,7 @@
         <w:t xml:space="preserve">Thinking behind it: </w:t>
       </w:r>
       <w:r>
-        <w:t xml:space="preserve">One screen to find and manage any account.</w:t>
+        <w:t xml:space="preserve">Never trust a payment 'success' from the browser; only the signed server callback flips VIP on. The '1|OK' reply is ECPay's required acknowledgement.</w:t>
       </w:r>
     </w:p>
     <w:p>
@@ -3769,7 +3905,7 @@
         <w:pStyle w:val="Heading3"/>
       </w:pPr>
       <w:r>
-        <w:t xml:space="preserve">admin_create_account / admin_edit_account / update_binding / delete_account</w:t>
+        <w:t xml:space="preserve">payment_result (POST /payment/result)</w:t>
       </w:r>
     </w:p>
     <w:p>
@@ -3786,7 +3922,7 @@
           <w:sz w:val="18"/>
           <w:szCs w:val="18"/>
         </w:rPr>
-        <w:t xml:space="preserve">all @admin_required, all POST</w:t>
+        <w:t xml:space="preserve">render payment_success.html</w:t>
       </w:r>
     </w:p>
     <w:p>
@@ -3814,46 +3950,20 @@
         <w:spacing w:after="40"/>
       </w:pPr>
       <w:r>
-        <w:t xml:space="preserve">create: add a new account.</w:t>
-      </w:r>
-    </w:p>
-    <w:p>
-      <w:pPr>
-        <w:pStyle w:val="ListParagraph"/>
-        <w:numPr>
-          <w:ilvl w:val="0"/>
-          <w:numId w:val="2"/>
-        </w:numPr>
-        <w:spacing w:after="40"/>
-      </w:pPr>
-      <w:r>
-        <w:t xml:space="preserve">edit: change role, email, phone, and optionally reset the password (only a superadmin may set/modify admin or superadmin accounts).</w:t>
-      </w:r>
-    </w:p>
-    <w:p>
-      <w:pPr>
-        <w:pStyle w:val="ListParagraph"/>
-        <w:numPr>
-          <w:ilvl w:val="0"/>
-          <w:numId w:val="2"/>
-        </w:numPr>
-        <w:spacing w:after="40"/>
-      </w:pPr>
-      <w:r>
-        <w:t xml:space="preserve">update_binding: link an account to a product/device id.</w:t>
-      </w:r>
-    </w:p>
-    <w:p>
-      <w:pPr>
-        <w:pStyle w:val="ListParagraph"/>
-        <w:numPr>
-          <w:ilvl w:val="0"/>
-          <w:numId w:val="2"/>
-        </w:numPr>
-        <w:spacing w:after="40"/>
-      </w:pPr>
-      <w:r>
-        <w:t xml:space="preserve">delete: remove an account (but you cannot delete yourself).</w:t>
+        <w:t xml:space="preserve">The page the user's browser lands on after paying; shows order id and amount.</w:t>
+      </w:r>
+    </w:p>
+    <w:p>
+      <w:pPr>
+        <w:pStyle w:val="ListParagraph"/>
+        <w:numPr>
+          <w:ilvl w:val="0"/>
+          <w:numId w:val="2"/>
+        </w:numPr>
+        <w:spacing w:after="40"/>
+      </w:pPr>
+      <w:r>
+        <w:t xml:space="preserve">CSRF-exempt (ECPay posts to it).</w:t>
       </w:r>
     </w:p>
     <w:p>
@@ -3868,7 +3978,7 @@
         <w:t xml:space="preserve">Tech point: </w:t>
       </w:r>
       <w:r>
-        <w:t xml:space="preserve">CRUD operations guarded by admin_required; the self-delete check prevents lockout.</w:t>
+        <w:t xml:space="preserve">Separates the user-facing result page from the authoritative server callback.</w:t>
       </w:r>
     </w:p>
     <w:p>
@@ -3883,7 +3993,7 @@
         <w:t xml:space="preserve">Thinking behind it: </w:t>
       </w:r>
       <w:r>
-        <w:t xml:space="preserve">These cover the full lifecycle of an account, all behind one role gate so the checks are consistent.</w:t>
+        <w:t xml:space="preserve">The browser result is cosmetic; activation already happened in payment_notify - this avoids granting VIP on a spoofed redirect.</w:t>
       </w:r>
     </w:p>
     <w:p>
@@ -3891,7 +4001,7 @@
         <w:pStyle w:val="Heading2"/>
       </w:pPr>
       <w:r>
-        <w:t xml:space="preserve">7.8 Per-person database sorting</w:t>
+        <w:t xml:space="preserve">7.6 VIP (admin utilities)</w:t>
       </w:r>
     </w:p>
     <w:p>
@@ -3899,7 +4009,7 @@
         <w:pStyle w:val="Heading3"/>
       </w:pPr>
       <w:r>
-        <w:t xml:space="preserve">index (GET /) </w:t>
+        <w:t xml:space="preserve">set_vip / reset_vip (POST /admin/set_vip, /admin/reset_vip)</w:t>
       </w:r>
     </w:p>
     <w:p>
@@ -3916,7 +4026,7 @@
           <w:sz w:val="18"/>
           <w:szCs w:val="18"/>
         </w:rPr>
-        <w:t xml:space="preserve">redirect to /users</w:t>
+        <w:t xml:space="preserve">admin_required -&gt; toggle a user's VIP</w:t>
       </w:r>
     </w:p>
     <w:p>
@@ -3944,7 +4054,7 @@
         <w:spacing w:after="40"/>
       </w:pPr>
       <w:r>
-        <w:t xml:space="preserve">The home route simply redirects logged-in users to the people list.</w:t>
+        <w:t xml:space="preserve">Admin-only endpoints to turn a chosen user's VIP on (with expiry) or off.</w:t>
       </w:r>
     </w:p>
     <w:p>
@@ -3959,7 +4069,7 @@
         <w:t xml:space="preserve">Tech point: </w:t>
       </w:r>
       <w:r>
-        <w:t xml:space="preserve">A thin landing route.</w:t>
+        <w:t xml:space="preserve">Role-gated POST actions.</w:t>
       </w:r>
     </w:p>
     <w:p>
@@ -3974,7 +4084,15 @@
         <w:t xml:space="preserve">Thinking behind it: </w:t>
       </w:r>
       <w:r>
-        <w:t xml:space="preserve">Gives the app a sensible default page.</w:t>
+        <w:t xml:space="preserve">Replaces the old /debug/set_vip and /debug/reset_vip, which were open backdoors keyed to a hardcoded username - a real security hole.</w:t>
+      </w:r>
+    </w:p>
+    <w:p>
+      <w:pPr>
+        <w:pStyle w:val="Heading2"/>
+      </w:pPr>
+      <w:r>
+        <w:t xml:space="preserve">7.7 Account management (admin)</w:t>
       </w:r>
     </w:p>
     <w:p>
@@ -3982,7 +4100,7 @@
         <w:pStyle w:val="Heading3"/>
       </w:pPr>
       <w:r>
-        <w:t xml:space="preserve">personal_page (GET /personal)</w:t>
+        <w:t xml:space="preserve">admin_accounts (GET /admin/accounts)</w:t>
       </w:r>
     </w:p>
     <w:p>
@@ -3999,7 +4117,7 @@
           <w:sz w:val="18"/>
           <w:szCs w:val="18"/>
         </w:rPr>
-        <w:t xml:space="preserve">show own profile + VIP + own records</w:t>
+        <w:t xml:space="preserve">list + optional search</w:t>
       </w:r>
     </w:p>
     <w:p>
@@ -4027,33 +4145,7 @@
         <w:spacing w:after="40"/>
       </w:pPr>
       <w:r>
-        <w:t xml:space="preserve">Loads the logged-in user.</w:t>
-      </w:r>
-    </w:p>
-    <w:p>
-      <w:pPr>
-        <w:pStyle w:val="ListParagraph"/>
-        <w:numPr>
-          <w:ilvl w:val="0"/>
-          <w:numId w:val="2"/>
-        </w:numPr>
-        <w:spacing w:after="40"/>
-      </w:pPr>
-      <w:r>
-        <w:t xml:space="preserve">Auto-expires VIP if past the expiry date.</w:t>
-      </w:r>
-    </w:p>
-    <w:p>
-      <w:pPr>
-        <w:pStyle w:val="ListParagraph"/>
-        <w:numPr>
-          <w:ilvl w:val="0"/>
-          <w:numId w:val="2"/>
-        </w:numPr>
-        <w:spacing w:after="40"/>
-      </w:pPr>
-      <w:r>
-        <w:t xml:space="preserve">For non-admins, loads that person's own data records to display.</w:t>
+        <w:t xml:space="preserve">Lists accounts, optionally filtered by a search keyword.</w:t>
       </w:r>
     </w:p>
     <w:p>
@@ -4068,7 +4160,7 @@
         <w:t xml:space="preserve">Tech point: </w:t>
       </w:r>
       <w:r>
-        <w:t xml:space="preserve">Self-service view; VIP expiry is checked lazily on view.</w:t>
+        <w:t xml:space="preserve">Server-rendered admin table.</w:t>
       </w:r>
     </w:p>
     <w:p>
@@ -4083,7 +4175,7 @@
         <w:t xml:space="preserve">Thinking behind it: </w:t>
       </w:r>
       <w:r>
-        <w:t xml:space="preserve">Lazy expiry avoids a nightly job just to flip flags - it is corrected the moment it matters.</w:t>
+        <w:t xml:space="preserve">One screen to find and manage any account.</w:t>
       </w:r>
     </w:p>
     <w:p>
@@ -4091,7 +4183,7 @@
         <w:pStyle w:val="Heading3"/>
       </w:pPr>
       <w:r>
-        <w:t xml:space="preserve">list_users (GET /users)</w:t>
+        <w:t xml:space="preserve">admin_create_account / admin_edit_account / update_binding / delete_account</w:t>
       </w:r>
     </w:p>
     <w:p>
@@ -4108,7 +4200,7 @@
           <w:sz w:val="18"/>
           <w:szCs w:val="18"/>
         </w:rPr>
-        <w:t xml:space="preserve">permission-filtered, searchable, paginated list of people</w:t>
+        <w:t xml:space="preserve">all @admin_required, all POST</w:t>
       </w:r>
     </w:p>
     <w:p>
@@ -4136,20 +4228,46 @@
         <w:spacing w:after="40"/>
       </w:pPr>
       <w:r>
-        <w:t xml:space="preserve">Builds the query, then narrows it by role: ordinary users see only themselves; admins and superadmins see all.</w:t>
-      </w:r>
-    </w:p>
-    <w:p>
-      <w:pPr>
-        <w:pStyle w:val="ListParagraph"/>
-        <w:numPr>
-          <w:ilvl w:val="0"/>
-          <w:numId w:val="2"/>
-        </w:numPr>
-        <w:spacing w:after="40"/>
-      </w:pPr>
-      <w:r>
-        <w:t xml:space="preserve">Applies the search term and paginates (50 per page).</w:t>
+        <w:t xml:space="preserve">create: add a new account.</w:t>
+      </w:r>
+    </w:p>
+    <w:p>
+      <w:pPr>
+        <w:pStyle w:val="ListParagraph"/>
+        <w:numPr>
+          <w:ilvl w:val="0"/>
+          <w:numId w:val="2"/>
+        </w:numPr>
+        <w:spacing w:after="40"/>
+      </w:pPr>
+      <w:r>
+        <w:t xml:space="preserve">edit: change role, email, phone, and optionally reset the password (only a superadmin may set/modify admin or superadmin accounts).</w:t>
+      </w:r>
+    </w:p>
+    <w:p>
+      <w:pPr>
+        <w:pStyle w:val="ListParagraph"/>
+        <w:numPr>
+          <w:ilvl w:val="0"/>
+          <w:numId w:val="2"/>
+        </w:numPr>
+        <w:spacing w:after="40"/>
+      </w:pPr>
+      <w:r>
+        <w:t xml:space="preserve">update_binding: link an account to a product/device id.</w:t>
+      </w:r>
+    </w:p>
+    <w:p>
+      <w:pPr>
+        <w:pStyle w:val="ListParagraph"/>
+        <w:numPr>
+          <w:ilvl w:val="0"/>
+          <w:numId w:val="2"/>
+        </w:numPr>
+        <w:spacing w:after="40"/>
+      </w:pPr>
+      <w:r>
+        <w:t xml:space="preserve">delete: remove an account (but you cannot delete yourself).</w:t>
       </w:r>
     </w:p>
     <w:p>
@@ -4164,7 +4282,7 @@
         <w:t xml:space="preserve">Tech point: </w:t>
       </w:r>
       <w:r>
-        <w:t xml:space="preserve">Query is composed conditionally before execution; pagination via SQLAlchemy.</w:t>
+        <w:t xml:space="preserve">CRUD operations guarded by admin_required; the self-delete check prevents lockout.</w:t>
       </w:r>
     </w:p>
     <w:p>
@@ -4179,7 +4297,15 @@
         <w:t xml:space="preserve">Thinking behind it: </w:t>
       </w:r>
       <w:r>
-        <w:t xml:space="preserve">This is the 'sort the database per person' core - one screen whose contents depend on who is looking.</w:t>
+        <w:t xml:space="preserve">These cover the full lifecycle of an account, all behind one role gate so the checks are consistent.</w:t>
+      </w:r>
+    </w:p>
+    <w:p>
+      <w:pPr>
+        <w:pStyle w:val="Heading2"/>
+      </w:pPr>
+      <w:r>
+        <w:t xml:space="preserve">7.8 Per-person database sorting</w:t>
       </w:r>
     </w:p>
     <w:p>
@@ -4187,7 +4313,7 @@
         <w:pStyle w:val="Heading3"/>
       </w:pPr>
       <w:r>
-        <w:t xml:space="preserve">user_data (GET /user_data/&lt;id&gt;/&lt;name&gt;)</w:t>
+        <w:t xml:space="preserve">index (GET /) </w:t>
       </w:r>
     </w:p>
     <w:p>
@@ -4204,7 +4330,7 @@
           <w:sz w:val="18"/>
           <w:szCs w:val="18"/>
         </w:rPr>
-        <w:t xml:space="preserve">all records for one person, newest first</w:t>
+        <w:t xml:space="preserve">redirect to /users</w:t>
       </w:r>
     </w:p>
     <w:p>
@@ -4232,7 +4358,7 @@
         <w:spacing w:after="40"/>
       </w:pPr>
       <w:r>
-        <w:t xml:space="preserve">Finds the person, loads their records newest-first, converts timestamps to local time, and renders them as formatted JSON.</w:t>
+        <w:t xml:space="preserve">The home route simply redirects logged-in users to the people list.</w:t>
       </w:r>
     </w:p>
     <w:p>
@@ -4247,7 +4373,7 @@
         <w:t xml:space="preserve">Tech point: </w:t>
       </w:r>
       <w:r>
-        <w:t xml:space="preserve">Renders the generic JSON payload with a Jinja tojson filter.</w:t>
+        <w:t xml:space="preserve">A thin landing route.</w:t>
       </w:r>
     </w:p>
     <w:p>
@@ -4262,7 +4388,7 @@
         <w:t xml:space="preserve">Thinking behind it: </w:t>
       </w:r>
       <w:r>
-        <w:t xml:space="preserve">Because data is generic JSON, the page shows whatever was stored without assuming any fixed columns.</w:t>
+        <w:t xml:space="preserve">Gives the app a sensible default page.</w:t>
       </w:r>
     </w:p>
     <w:p>
@@ -4270,7 +4396,7 @@
         <w:pStyle w:val="Heading3"/>
       </w:pPr>
       <w:r>
-        <w:t xml:space="preserve">delete_user (POST /delete_user/&lt;id&gt;/&lt;name&gt;)</w:t>
+        <w:t xml:space="preserve">personal_page (GET /personal)</w:t>
       </w:r>
     </w:p>
     <w:p>
@@ -4287,7 +4413,7 @@
           <w:sz w:val="18"/>
           <w:szCs w:val="18"/>
         </w:rPr>
-        <w:t xml:space="preserve">delete a person and their records</w:t>
+        <w:t xml:space="preserve">show own profile + VIP + own records</w:t>
       </w:r>
     </w:p>
     <w:p>
@@ -4315,7 +4441,33 @@
         <w:spacing w:after="40"/>
       </w:pPr>
       <w:r>
-        <w:t xml:space="preserve">Deletes the person's data records, then the person, in one transaction.</w:t>
+        <w:t xml:space="preserve">Loads the logged-in user.</w:t>
+      </w:r>
+    </w:p>
+    <w:p>
+      <w:pPr>
+        <w:pStyle w:val="ListParagraph"/>
+        <w:numPr>
+          <w:ilvl w:val="0"/>
+          <w:numId w:val="2"/>
+        </w:numPr>
+        <w:spacing w:after="40"/>
+      </w:pPr>
+      <w:r>
+        <w:t xml:space="preserve">Auto-expires VIP if past the expiry date.</w:t>
+      </w:r>
+    </w:p>
+    <w:p>
+      <w:pPr>
+        <w:pStyle w:val="ListParagraph"/>
+        <w:numPr>
+          <w:ilvl w:val="0"/>
+          <w:numId w:val="2"/>
+        </w:numPr>
+        <w:spacing w:after="40"/>
+      </w:pPr>
+      <w:r>
+        <w:t xml:space="preserve">For non-admins, loads that person's own data records to display.</w:t>
       </w:r>
     </w:p>
     <w:p>
@@ -4330,7 +4482,7 @@
         <w:t xml:space="preserve">Tech point: </w:t>
       </w:r>
       <w:r>
-        <w:t xml:space="preserve">Cascade-style cleanup inside a transaction with rollback on error.</w:t>
+        <w:t xml:space="preserve">Self-service view; VIP expiry is checked lazily on view.</w:t>
       </w:r>
     </w:p>
     <w:p>
@@ -4345,15 +4497,7 @@
         <w:t xml:space="preserve">Thinking behind it: </w:t>
       </w:r>
       <w:r>
-        <w:t xml:space="preserve">Removing a person must not leave orphan records behind.</w:t>
-      </w:r>
-    </w:p>
-    <w:p>
-      <w:pPr>
-        <w:pStyle w:val="Heading2"/>
-      </w:pPr>
-      <w:r>
-        <w:t xml:space="preserve">7.9 Protected external data API</w:t>
+        <w:t xml:space="preserve">Lazy expiry avoids a nightly job just to flip flags - it is corrected the moment it matters.</w:t>
       </w:r>
     </w:p>
     <w:p>
@@ -4361,7 +4505,7 @@
         <w:pStyle w:val="Heading3"/>
       </w:pPr>
       <w:r>
-        <w:t xml:space="preserve">save_data (POST /save)</w:t>
+        <w:t xml:space="preserve">list_users (GET /users)</w:t>
       </w:r>
     </w:p>
     <w:p>
@@ -4378,7 +4522,7 @@
           <w:sz w:val="18"/>
           <w:szCs w:val="18"/>
         </w:rPr>
-        <w:t xml:space="preserve">@api_key_required + rate limit -&gt; upsert person, append generic record</w:t>
+        <w:t xml:space="preserve">permission-filtered, searchable, paginated list of people</w:t>
       </w:r>
     </w:p>
     <w:p>
@@ -4406,46 +4550,20 @@
         <w:spacing w:after="40"/>
       </w:pPr>
       <w:r>
-        <w:t xml:space="preserve">Requires a valid API key or bearer token (and is rate-limited).</w:t>
-      </w:r>
-    </w:p>
-    <w:p>
-      <w:pPr>
-        <w:pStyle w:val="ListParagraph"/>
-        <w:numPr>
-          <w:ilvl w:val="0"/>
-          <w:numId w:val="2"/>
-        </w:numPr>
-        <w:spacing w:after="40"/>
-      </w:pPr>
-      <w:r>
-        <w:t xml:space="preserve">Reads the JSON body and requires userInfo.userID and userInfo.name.</w:t>
-      </w:r>
-    </w:p>
-    <w:p>
-      <w:pPr>
-        <w:pStyle w:val="ListParagraph"/>
-        <w:numPr>
-          <w:ilvl w:val="0"/>
-          <w:numId w:val="2"/>
-        </w:numPr>
-        <w:spacing w:after="40"/>
-      </w:pPr>
-      <w:r>
-        <w:t xml:space="preserve">Creates or updates the person (upsert), then appends a new record whose 'data' is the generic payload.</w:t>
-      </w:r>
-    </w:p>
-    <w:p>
-      <w:pPr>
-        <w:pStyle w:val="ListParagraph"/>
-        <w:numPr>
-          <w:ilvl w:val="0"/>
-          <w:numId w:val="2"/>
-        </w:numPr>
-        <w:spacing w:after="40"/>
-      </w:pPr>
-      <w:r>
-        <w:t xml:space="preserve">Commits, or rolls back and returns an error.</w:t>
+        <w:t xml:space="preserve">Builds the query, then narrows it by role: ordinary users see only themselves; admins and superadmins see all.</w:t>
+      </w:r>
+    </w:p>
+    <w:p>
+      <w:pPr>
+        <w:pStyle w:val="ListParagraph"/>
+        <w:numPr>
+          <w:ilvl w:val="0"/>
+          <w:numId w:val="2"/>
+        </w:numPr>
+        <w:spacing w:after="40"/>
+      </w:pPr>
+      <w:r>
+        <w:t xml:space="preserve">Applies the search term and paginates (50 per page).</w:t>
       </w:r>
     </w:p>
     <w:p>
@@ -4460,7 +4578,7 @@
         <w:t xml:space="preserve">Tech point: </w:t>
       </w:r>
       <w:r>
-        <w:t xml:space="preserve">Upsert (update-or-insert) plus a flexible JSON payload; protected by the api guard.</w:t>
+        <w:t xml:space="preserve">Query is composed conditionally before execution; pagination via SQLAlchemy.</w:t>
       </w:r>
     </w:p>
     <w:p>
@@ -4475,7 +4593,7 @@
         <w:t xml:space="preserve">Thinking behind it: </w:t>
       </w:r>
       <w:r>
-        <w:t xml:space="preserve">This is the front door for outside systems. It was previously wide open; now it is authenticated, rate-limited, and domain-agnostic.</w:t>
+        <w:t xml:space="preserve">This is the 'sort the database per person' core - one screen whose contents depend on who is looking.</w:t>
       </w:r>
     </w:p>
     <w:p>
@@ -4483,7 +4601,7 @@
         <w:pStyle w:val="Heading3"/>
       </w:pPr>
       <w:r>
-        <w:t xml:space="preserve">get_log (GET /log)</w:t>
+        <w:t xml:space="preserve">user_data (GET /user_data/&lt;id&gt;/&lt;name&gt;)</w:t>
       </w:r>
     </w:p>
     <w:p>
@@ -4500,7 +4618,7 @@
           <w:sz w:val="18"/>
           <w:szCs w:val="18"/>
         </w:rPr>
-        <w:t xml:space="preserve">@api_key_required -&gt; recent records as JSON</w:t>
+        <w:t xml:space="preserve">all records for one person, newest first</w:t>
       </w:r>
     </w:p>
     <w:p>
@@ -4528,7 +4646,7 @@
         <w:spacing w:after="40"/>
       </w:pPr>
       <w:r>
-        <w:t xml:space="preserve">Requires API auth and returns the 100 most recent records as JSON.</w:t>
+        <w:t xml:space="preserve">Finds the person, loads their records newest-first, converts timestamps to local time, and renders them as formatted JSON.</w:t>
       </w:r>
     </w:p>
     <w:p>
@@ -4543,7 +4661,7 @@
         <w:t xml:space="preserve">Tech point: </w:t>
       </w:r>
       <w:r>
-        <w:t xml:space="preserve">A read endpoint behind the same guard as /save.</w:t>
+        <w:t xml:space="preserve">Renders the generic JSON payload with a Jinja tojson filter.</w:t>
       </w:r>
     </w:p>
     <w:p>
@@ -4558,20 +4676,7 @@
         <w:t xml:space="preserve">Thinking behind it: </w:t>
       </w:r>
       <w:r>
-        <w:t xml:space="preserve">Lets an authorized client confirm what was received without opening the website.</w:t>
-      </w:r>
-    </w:p>
-    <w:p>
-      <w:r>
-        <w:br w:type="page"/>
-      </w:r>
-    </w:p>
-    <w:p>
-      <w:pPr>
-        <w:pStyle w:val="Heading1"/>
-      </w:pPr>
-      <w:r>
-        <w:t xml:space="preserve">8. app.py - factory &amp; entry point</w:t>
+        <w:t xml:space="preserve">Because data is generic JSON, the page shows whatever was stored without assuming any fixed columns.</w:t>
       </w:r>
     </w:p>
     <w:p>
@@ -4579,7 +4684,7 @@
         <w:pStyle w:val="Heading3"/>
       </w:pPr>
       <w:r>
-        <w:t xml:space="preserve">create_app(config_name)</w:t>
+        <w:t xml:space="preserve">delete_user (POST /delete_user/&lt;id&gt;/&lt;name&gt;)</w:t>
       </w:r>
     </w:p>
     <w:p>
@@ -4596,7 +4701,7 @@
           <w:sz w:val="18"/>
           <w:szCs w:val="18"/>
         </w:rPr>
-        <w:t xml:space="preserve">Flask() -&gt; load config -&gt; init db/csrf/limiter -&gt; register blueprint -&gt; return app</w:t>
+        <w:t xml:space="preserve">delete a person and their records</w:t>
       </w:r>
     </w:p>
     <w:p>
@@ -4624,59 +4729,7 @@
         <w:spacing w:after="40"/>
       </w:pPr>
       <w:r>
-        <w:t xml:space="preserve">Creates the Flask object.</w:t>
-      </w:r>
-    </w:p>
-    <w:p>
-      <w:pPr>
-        <w:pStyle w:val="ListParagraph"/>
-        <w:numPr>
-          <w:ilvl w:val="0"/>
-          <w:numId w:val="2"/>
-        </w:numPr>
-        <w:spacing w:after="40"/>
-      </w:pPr>
-      <w:r>
-        <w:t xml:space="preserve">Loads the chosen config class.</w:t>
-      </w:r>
-    </w:p>
-    <w:p>
-      <w:pPr>
-        <w:pStyle w:val="ListParagraph"/>
-        <w:numPr>
-          <w:ilvl w:val="0"/>
-          <w:numId w:val="2"/>
-        </w:numPr>
-        <w:spacing w:after="40"/>
-      </w:pPr>
-      <w:r>
-        <w:t xml:space="preserve">Initializes the database and security extensions.</w:t>
-      </w:r>
-    </w:p>
-    <w:p>
-      <w:pPr>
-        <w:pStyle w:val="ListParagraph"/>
-        <w:numPr>
-          <w:ilvl w:val="0"/>
-          <w:numId w:val="2"/>
-        </w:numPr>
-        <w:spacing w:after="40"/>
-      </w:pPr>
-      <w:r>
-        <w:t xml:space="preserve">Registers the routes blueprint and returns the app.</w:t>
-      </w:r>
-    </w:p>
-    <w:p>
-      <w:pPr>
-        <w:pStyle w:val="ListParagraph"/>
-        <w:numPr>
-          <w:ilvl w:val="0"/>
-          <w:numId w:val="2"/>
-        </w:numPr>
-        <w:spacing w:after="40"/>
-      </w:pPr>
-      <w:r>
-        <w:t xml:space="preserve">It does NOT create tables, start the scheduler, or bind a port.</w:t>
+        <w:t xml:space="preserve">Deletes the person's data records, then the person, in one transaction.</w:t>
       </w:r>
     </w:p>
     <w:p>
@@ -4691,7 +4744,7 @@
         <w:t xml:space="preserve">Tech point: </w:t>
       </w:r>
       <w:r>
-        <w:t xml:space="preserve">The application-factory pattern; init_app() binds extensions to this specific app.</w:t>
+        <w:t xml:space="preserve">Cascade-style cleanup inside a transaction with rollback on error.</w:t>
       </w:r>
     </w:p>
     <w:p>
@@ -4706,7 +4759,15 @@
         <w:t xml:space="preserve">Thinking behind it: </w:t>
       </w:r>
       <w:r>
-        <w:t xml:space="preserve">Side-effect-free construction is what makes the app importable and testable - the heart of 'use it as a module, not a whole system'.</w:t>
+        <w:t xml:space="preserve">Removing a person must not leave orphan records behind.</w:t>
+      </w:r>
+    </w:p>
+    <w:p>
+      <w:pPr>
+        <w:pStyle w:val="Heading2"/>
+      </w:pPr>
+      <w:r>
+        <w:t xml:space="preserve">7.9 Protected external data API</w:t>
       </w:r>
     </w:p>
     <w:p>
@@ -4714,7 +4775,7 @@
         <w:pStyle w:val="Heading3"/>
       </w:pPr>
       <w:r>
-        <w:t xml:space="preserve">init_runtime(app)</w:t>
+        <w:t xml:space="preserve">save_data (POST /save)</w:t>
       </w:r>
     </w:p>
     <w:p>
@@ -4731,7 +4792,7 @@
           <w:sz w:val="18"/>
           <w:szCs w:val="18"/>
         </w:rPr>
-        <w:t xml:space="preserve">db.create_all(); make folders; start backup scheduler</w:t>
+        <w:t xml:space="preserve">@api_key_required + rate limit -&gt; upsert person, append generic record</w:t>
       </w:r>
     </w:p>
     <w:p>
@@ -4759,7 +4820,469 @@
         <w:spacing w:after="40"/>
       </w:pPr>
       <w:r>
-        <w:t xml:space="preserve">Creates database tables, ensures folders exist, and starts the daily backup scheduler.</w:t>
+        <w:t xml:space="preserve">Requires a valid API key or bearer token (and is rate-limited).</w:t>
+      </w:r>
+    </w:p>
+    <w:p>
+      <w:pPr>
+        <w:pStyle w:val="ListParagraph"/>
+        <w:numPr>
+          <w:ilvl w:val="0"/>
+          <w:numId w:val="2"/>
+        </w:numPr>
+        <w:spacing w:after="40"/>
+      </w:pPr>
+      <w:r>
+        <w:t xml:space="preserve">Reads the JSON body and requires userInfo.userID and userInfo.name.</w:t>
+      </w:r>
+    </w:p>
+    <w:p>
+      <w:pPr>
+        <w:pStyle w:val="ListParagraph"/>
+        <w:numPr>
+          <w:ilvl w:val="0"/>
+          <w:numId w:val="2"/>
+        </w:numPr>
+        <w:spacing w:after="40"/>
+      </w:pPr>
+      <w:r>
+        <w:t xml:space="preserve">Creates or updates the person (upsert), then appends a new record whose 'data' is the generic payload.</w:t>
+      </w:r>
+    </w:p>
+    <w:p>
+      <w:pPr>
+        <w:pStyle w:val="ListParagraph"/>
+        <w:numPr>
+          <w:ilvl w:val="0"/>
+          <w:numId w:val="2"/>
+        </w:numPr>
+        <w:spacing w:after="40"/>
+      </w:pPr>
+      <w:r>
+        <w:t xml:space="preserve">Commits, or rolls back and returns an error.</w:t>
+      </w:r>
+    </w:p>
+    <w:p>
+      <w:pPr>
+        <w:spacing w:after="80"/>
+      </w:pPr>
+      <w:r>
+        <w:rPr>
+          <w:b/>
+          <w:bCs/>
+        </w:rPr>
+        <w:t xml:space="preserve">Tech point: </w:t>
+      </w:r>
+      <w:r>
+        <w:t xml:space="preserve">Upsert (update-or-insert) plus a flexible JSON payload; protected by the api guard.</w:t>
+      </w:r>
+    </w:p>
+    <w:p>
+      <w:pPr>
+        <w:spacing w:after="80"/>
+      </w:pPr>
+      <w:r>
+        <w:rPr>
+          <w:b/>
+          <w:bCs/>
+        </w:rPr>
+        <w:t xml:space="preserve">Thinking behind it: </w:t>
+      </w:r>
+      <w:r>
+        <w:t xml:space="preserve">This is the front door for outside systems. It was previously wide open; now it is authenticated, rate-limited, and domain-agnostic.</w:t>
+      </w:r>
+    </w:p>
+    <w:p>
+      <w:pPr>
+        <w:pStyle w:val="Heading3"/>
+      </w:pPr>
+      <w:r>
+        <w:t xml:space="preserve">get_log (GET /log)</w:t>
+      </w:r>
+    </w:p>
+    <w:p>
+      <w:pPr>
+        <w:pBdr>
+          <w:left w:val="single" w:color="4472C4" w:sz="18" w:space="6"/>
+        </w:pBdr>
+        <w:shd w:fill="F2F2F2" w:val="clear"/>
+        <w:spacing w:after="120" w:before="60"/>
+      </w:pPr>
+      <w:r>
+        <w:rPr>
+          <w:rFonts w:ascii="Consolas" w:cs="Consolas" w:eastAsia="Consolas" w:hAnsi="Consolas"/>
+          <w:sz w:val="18"/>
+          <w:szCs w:val="18"/>
+        </w:rPr>
+        <w:t xml:space="preserve">@api_key_required -&gt; recent records as JSON</w:t>
+      </w:r>
+    </w:p>
+    <w:p>
+      <w:pPr>
+        <w:spacing w:after="80"/>
+      </w:pPr>
+      <w:r>
+        <w:rPr>
+          <w:b/>
+          <w:bCs/>
+        </w:rPr>
+        <w:t xml:space="preserve">What it does: </w:t>
+      </w:r>
+      <w:r>
+        <w:t xml:space="preserve"/>
+      </w:r>
+    </w:p>
+    <w:p>
+      <w:pPr>
+        <w:pStyle w:val="ListParagraph"/>
+        <w:numPr>
+          <w:ilvl w:val="0"/>
+          <w:numId w:val="2"/>
+        </w:numPr>
+        <w:spacing w:after="40"/>
+      </w:pPr>
+      <w:r>
+        <w:t xml:space="preserve">Requires API auth and returns the 100 most recent records as JSON.</w:t>
+      </w:r>
+    </w:p>
+    <w:p>
+      <w:pPr>
+        <w:spacing w:after="80"/>
+      </w:pPr>
+      <w:r>
+        <w:rPr>
+          <w:b/>
+          <w:bCs/>
+        </w:rPr>
+        <w:t xml:space="preserve">Tech point: </w:t>
+      </w:r>
+      <w:r>
+        <w:t xml:space="preserve">A read endpoint behind the same guard as /save.</w:t>
+      </w:r>
+    </w:p>
+    <w:p>
+      <w:pPr>
+        <w:spacing w:after="80"/>
+      </w:pPr>
+      <w:r>
+        <w:rPr>
+          <w:b/>
+          <w:bCs/>
+        </w:rPr>
+        <w:t xml:space="preserve">Thinking behind it: </w:t>
+      </w:r>
+      <w:r>
+        <w:t xml:space="preserve">Lets an authorized client confirm what was received without opening the website.</w:t>
+      </w:r>
+    </w:p>
+    <w:p>
+      <w:r>
+        <w:br w:type="page"/>
+      </w:r>
+    </w:p>
+    <w:p>
+      <w:pPr>
+        <w:pStyle w:val="Heading1"/>
+      </w:pPr>
+      <w:r>
+        <w:t xml:space="preserve">8. app.py - factory &amp; entry point</w:t>
+      </w:r>
+    </w:p>
+    <w:p>
+      <w:pPr>
+        <w:pStyle w:val="Heading3"/>
+      </w:pPr>
+      <w:r>
+        <w:t xml:space="preserve">create_app(config_name)</w:t>
+      </w:r>
+    </w:p>
+    <w:p>
+      <w:pPr>
+        <w:pBdr>
+          <w:left w:val="single" w:color="4472C4" w:sz="18" w:space="6"/>
+        </w:pBdr>
+        <w:shd w:fill="F2F2F2" w:val="clear"/>
+        <w:spacing w:after="120" w:before="60"/>
+      </w:pPr>
+      <w:r>
+        <w:rPr>
+          <w:rFonts w:ascii="Consolas" w:cs="Consolas" w:eastAsia="Consolas" w:hAnsi="Consolas"/>
+          <w:sz w:val="18"/>
+          <w:szCs w:val="18"/>
+        </w:rPr>
+        <w:t xml:space="preserve">Flask() -&gt; load config -&gt; init db/csrf/limiter -&gt; register blueprint -&gt; return app</w:t>
+      </w:r>
+    </w:p>
+    <w:p>
+      <w:pPr>
+        <w:spacing w:after="80"/>
+      </w:pPr>
+      <w:r>
+        <w:rPr>
+          <w:b/>
+          <w:bCs/>
+        </w:rPr>
+        <w:t xml:space="preserve">What it does: </w:t>
+      </w:r>
+      <w:r>
+        <w:t xml:space="preserve"/>
+      </w:r>
+    </w:p>
+    <w:p>
+      <w:pPr>
+        <w:pStyle w:val="ListParagraph"/>
+        <w:numPr>
+          <w:ilvl w:val="0"/>
+          <w:numId w:val="2"/>
+        </w:numPr>
+        <w:spacing w:after="40"/>
+      </w:pPr>
+      <w:r>
+        <w:t xml:space="preserve">Creates the Flask object.</w:t>
+      </w:r>
+    </w:p>
+    <w:p>
+      <w:pPr>
+        <w:pStyle w:val="ListParagraph"/>
+        <w:numPr>
+          <w:ilvl w:val="0"/>
+          <w:numId w:val="2"/>
+        </w:numPr>
+        <w:spacing w:after="40"/>
+      </w:pPr>
+      <w:r>
+        <w:t xml:space="preserve">Loads the chosen config class.</w:t>
+      </w:r>
+    </w:p>
+    <w:p>
+      <w:pPr>
+        <w:pStyle w:val="ListParagraph"/>
+        <w:numPr>
+          <w:ilvl w:val="0"/>
+          <w:numId w:val="2"/>
+        </w:numPr>
+        <w:spacing w:after="40"/>
+      </w:pPr>
+      <w:r>
+        <w:t xml:space="preserve">Initializes the database and security extensions.</w:t>
+      </w:r>
+    </w:p>
+    <w:p>
+      <w:pPr>
+        <w:pStyle w:val="ListParagraph"/>
+        <w:numPr>
+          <w:ilvl w:val="0"/>
+          <w:numId w:val="2"/>
+        </w:numPr>
+        <w:spacing w:after="40"/>
+      </w:pPr>
+      <w:r>
+        <w:t xml:space="preserve">Registers the routes blueprint and returns the app.</w:t>
+      </w:r>
+    </w:p>
+    <w:p>
+      <w:pPr>
+        <w:pStyle w:val="ListParagraph"/>
+        <w:numPr>
+          <w:ilvl w:val="0"/>
+          <w:numId w:val="2"/>
+        </w:numPr>
+        <w:spacing w:after="40"/>
+      </w:pPr>
+      <w:r>
+        <w:t xml:space="preserve">It does NOT create tables, start the scheduler, or bind a port.</w:t>
+      </w:r>
+    </w:p>
+    <w:p>
+      <w:pPr>
+        <w:spacing w:after="80"/>
+      </w:pPr>
+      <w:r>
+        <w:rPr>
+          <w:b/>
+          <w:bCs/>
+        </w:rPr>
+        <w:t xml:space="preserve">Tech point: </w:t>
+      </w:r>
+      <w:r>
+        <w:t xml:space="preserve">The application-factory pattern; init_app() binds extensions to this specific app.</w:t>
+      </w:r>
+    </w:p>
+    <w:p>
+      <w:pPr>
+        <w:spacing w:after="80"/>
+      </w:pPr>
+      <w:r>
+        <w:rPr>
+          <w:b/>
+          <w:bCs/>
+        </w:rPr>
+        <w:t xml:space="preserve">Thinking behind it: </w:t>
+      </w:r>
+      <w:r>
+        <w:t xml:space="preserve">Side-effect-free construction is what makes the app importable and testable - the heart of 'use it as a module, not a whole system'.</w:t>
+      </w:r>
+    </w:p>
+    <w:p>
+      <w:pPr>
+        <w:pStyle w:val="Heading3"/>
+      </w:pPr>
+      <w:r>
+        <w:t xml:space="preserve">create_app(config_name) — schema management</w:t>
+      </w:r>
+    </w:p>
+    <w:p>
+      <w:pPr>
+        <w:pBdr>
+          <w:left w:val="single" w:color="4472C4" w:sz="18" w:space="6"/>
+        </w:pBdr>
+        <w:shd w:fill="F2F2F2" w:val="clear"/>
+        <w:spacing w:after="120" w:before="60"/>
+      </w:pPr>
+      <w:r>
+        <w:rPr>
+          <w:rFonts w:ascii="Consolas" w:cs="Consolas" w:eastAsia="Consolas" w:hAnsi="Consolas"/>
+          <w:sz w:val="18"/>
+          <w:szCs w:val="18"/>
+        </w:rPr>
+        <w:t xml:space="preserve">migrate.init_app(app, db)  +  _warn_insecure_production(app)</w:t>
+      </w:r>
+    </w:p>
+    <w:p>
+      <w:pPr>
+        <w:spacing w:after="80"/>
+      </w:pPr>
+      <w:r>
+        <w:rPr>
+          <w:b/>
+          <w:bCs/>
+        </w:rPr>
+        <w:t xml:space="preserve">What it does: </w:t>
+      </w:r>
+      <w:r>
+        <w:t xml:space="preserve"/>
+      </w:r>
+    </w:p>
+    <w:p>
+      <w:pPr>
+        <w:pStyle w:val="ListParagraph"/>
+        <w:numPr>
+          <w:ilvl w:val="0"/>
+          <w:numId w:val="2"/>
+        </w:numPr>
+        <w:spacing w:after="40"/>
+      </w:pPr>
+      <w:r>
+        <w:t xml:space="preserve">Also wires Flask-Migrate (Alembic) so schema changes are managed migrations.</w:t>
+      </w:r>
+    </w:p>
+    <w:p>
+      <w:pPr>
+        <w:pStyle w:val="ListParagraph"/>
+        <w:numPr>
+          <w:ilvl w:val="0"/>
+          <w:numId w:val="2"/>
+        </w:numPr>
+        <w:spacing w:after="40"/>
+      </w:pPr>
+      <w:r>
+        <w:t xml:space="preserve">In production, logs a warning if SECRET_KEY or the default admin password are unchanged.</w:t>
+      </w:r>
+    </w:p>
+    <w:p>
+      <w:pPr>
+        <w:spacing w:after="80"/>
+      </w:pPr>
+      <w:r>
+        <w:rPr>
+          <w:b/>
+          <w:bCs/>
+        </w:rPr>
+        <w:t xml:space="preserve">Tech point: </w:t>
+      </w:r>
+      <w:r>
+        <w:t xml:space="preserve">Flask-Migrate enables versioned, incremental schema evolution.</w:t>
+      </w:r>
+    </w:p>
+    <w:p>
+      <w:pPr>
+        <w:spacing w:after="80"/>
+      </w:pPr>
+      <w:r>
+        <w:rPr>
+          <w:b/>
+          <w:bCs/>
+        </w:rPr>
+        <w:t xml:space="preserve">Thinking behind it: </w:t>
+      </w:r>
+      <w:r>
+        <w:t xml:space="preserve">Adding a column later becomes 'add one line + flask db migrate/upgrade' - no DB rebuild, which was the pain that previously forced a full recreate.</w:t>
+      </w:r>
+    </w:p>
+    <w:p>
+      <w:pPr>
+        <w:pStyle w:val="Heading3"/>
+      </w:pPr>
+      <w:r>
+        <w:t xml:space="preserve">init_runtime(app)</w:t>
+      </w:r>
+    </w:p>
+    <w:p>
+      <w:pPr>
+        <w:pBdr>
+          <w:left w:val="single" w:color="4472C4" w:sz="18" w:space="6"/>
+        </w:pBdr>
+        <w:shd w:fill="F2F2F2" w:val="clear"/>
+        <w:spacing w:after="120" w:before="60"/>
+      </w:pPr>
+      <w:r>
+        <w:rPr>
+          <w:rFonts w:ascii="Consolas" w:cs="Consolas" w:eastAsia="Consolas" w:hAnsi="Consolas"/>
+          <w:sz w:val="18"/>
+          <w:szCs w:val="18"/>
+        </w:rPr>
+        <w:t xml:space="preserve">flask db upgrade (or db.create_all fallback); seed admin; folders; scheduler</w:t>
+      </w:r>
+    </w:p>
+    <w:p>
+      <w:pPr>
+        <w:spacing w:after="80"/>
+      </w:pPr>
+      <w:r>
+        <w:rPr>
+          <w:b/>
+          <w:bCs/>
+        </w:rPr>
+        <w:t xml:space="preserve">What it does: </w:t>
+      </w:r>
+      <w:r>
+        <w:t xml:space="preserve"/>
+      </w:r>
+    </w:p>
+    <w:p>
+      <w:pPr>
+        <w:pStyle w:val="ListParagraph"/>
+        <w:numPr>
+          <w:ilvl w:val="0"/>
+          <w:numId w:val="2"/>
+        </w:numPr>
+        <w:spacing w:after="40"/>
+      </w:pPr>
+      <w:r>
+        <w:t xml:space="preserve">Applies pending DB migrations on startup (falls back to db.create_all if no migrations).</w:t>
+      </w:r>
+    </w:p>
+    <w:p>
+      <w:pPr>
+        <w:pStyle w:val="ListParagraph"/>
+        <w:numPr>
+          <w:ilvl w:val="0"/>
+          <w:numId w:val="2"/>
+        </w:numPr>
+        <w:spacing w:after="40"/>
+      </w:pPr>
+      <w:r>
+        <w:t xml:space="preserve">Seeds the default admin, ensures folders exist, starts the daily backup scheduler.</w:t>
       </w:r>
     </w:p>
     <w:p>
@@ -4787,7 +5310,7 @@
         <w:t xml:space="preserve">Tech point: </w:t>
       </w:r>
       <w:r>
-        <w:t xml:space="preserve">Separates 'build the app' from 'run side effects'.</w:t>
+        <w:t xml:space="preserve">Separates 'build the app' from 'run side effects'; migrations keep schema in sync automatically.</w:t>
       </w:r>
     </w:p>
     <w:p>
@@ -4802,7 +5325,7 @@
         <w:t xml:space="preserve">Thinking behind it: </w:t>
       </w:r>
       <w:r>
-        <w:t xml:space="preserve">Importing app.py for a test must not start a background scheduler or create files; keeping these here prevents that.</w:t>
+        <w:t xml:space="preserve">Importing app.py for a test must not start a scheduler or touch the disk; keeping these here prevents that.</w:t>
       </w:r>
     </w:p>
     <w:p>

</xml_diff>

<commit_message>
Production path: load .env, ProxyFix/HTTPS nginx, Docker optional
- .env now loads automatically (python-dotenv is a real dependency)
- TRUST_PROXY + ProxyFix so Secure cookies, HTTPS URLs, and real client IP
  work behind nginx (was silently broken)
- nginx.conf: HTTPS server block + 80->443 redirect + X-Forwarded-Proto
- docker-compose: optional, neutral names, env_file, localhost bind; Dockerfile py3.12
- Jenkinsfile: service rename flask-app -> app
- README "Deploying" section (waitress+nginx default, Docker optional); guide regenerated
</commit_message>
<xml_diff>
--- a/PROJECT_GUIDE.docx
+++ b/PROJECT_GUIDE.docx
@@ -5128,7 +5128,7 @@
         <w:pStyle w:val="Heading3"/>
       </w:pPr>
       <w:r>
-        <w:t xml:space="preserve">create_app(config_name) — schema management</w:t>
+        <w:t xml:space="preserve">create_app(config_name) — schema, proxy &amp; warnings</w:t>
       </w:r>
     </w:p>
     <w:p>
@@ -5145,7 +5145,7 @@
           <w:sz w:val="18"/>
           <w:szCs w:val="18"/>
         </w:rPr>
-        <w:t xml:space="preserve">migrate.init_app(app, db)  +  _warn_insecure_production(app)</w:t>
+        <w:t xml:space="preserve">ProxyFix (if TRUST_PROXY) + migrate.init_app(app, db) + _warn_insecure_production(app)</w:t>
       </w:r>
     </w:p>
     <w:p>
@@ -5173,20 +5173,59 @@
         <w:spacing w:after="40"/>
       </w:pPr>
       <w:r>
-        <w:t xml:space="preserve">Also wires Flask-Migrate (Alembic) so schema changes are managed migrations.</w:t>
-      </w:r>
-    </w:p>
-    <w:p>
-      <w:pPr>
-        <w:pStyle w:val="ListParagraph"/>
-        <w:numPr>
-          <w:ilvl w:val="0"/>
-          <w:numId w:val="2"/>
-        </w:numPr>
-        <w:spacing w:after="40"/>
-      </w:pPr>
-      <w:r>
-        <w:t xml:space="preserve">In production, logs a warning if SECRET_KEY or the default admin password are unchanged.</w:t>
+        <w:t xml:space="preserve">When TRUST_PROXY is set (on in production), wraps the app in ProxyFix so it honors</w:t>
+      </w:r>
+    </w:p>
+    <w:p>
+      <w:pPr>
+        <w:pStyle w:val="ListParagraph"/>
+        <w:numPr>
+          <w:ilvl w:val="0"/>
+          <w:numId w:val="2"/>
+        </w:numPr>
+        <w:spacing w:after="40"/>
+      </w:pPr>
+      <w:r>
+        <w:t xml:space="preserve">X-Forwarded-Proto/For/Host from nginx - HTTPS detection (Secure cookies), correct</w:t>
+      </w:r>
+    </w:p>
+    <w:p>
+      <w:pPr>
+        <w:pStyle w:val="ListParagraph"/>
+        <w:numPr>
+          <w:ilvl w:val="0"/>
+          <w:numId w:val="2"/>
+        </w:numPr>
+        <w:spacing w:after="40"/>
+      </w:pPr>
+      <w:r>
+        <w:t xml:space="preserve">external URLs, and the real client IP for rate limiting.</w:t>
+      </w:r>
+    </w:p>
+    <w:p>
+      <w:pPr>
+        <w:pStyle w:val="ListParagraph"/>
+        <w:numPr>
+          <w:ilvl w:val="0"/>
+          <w:numId w:val="2"/>
+        </w:numPr>
+        <w:spacing w:after="40"/>
+      </w:pPr>
+      <w:r>
+        <w:t xml:space="preserve">Wires Flask-Migrate (Alembic) so schema changes are managed migrations.</w:t>
+      </w:r>
+    </w:p>
+    <w:p>
+      <w:pPr>
+        <w:pStyle w:val="ListParagraph"/>
+        <w:numPr>
+          <w:ilvl w:val="0"/>
+          <w:numId w:val="2"/>
+        </w:numPr>
+        <w:spacing w:after="40"/>
+      </w:pPr>
+      <w:r>
+        <w:t xml:space="preserve">In production, warns if SECRET_KEY or the default admin password are unchanged.</w:t>
       </w:r>
     </w:p>
     <w:p>
@@ -5201,7 +5240,7 @@
         <w:t xml:space="preserve">Tech point: </w:t>
       </w:r>
       <w:r>
-        <w:t xml:space="preserve">Flask-Migrate enables versioned, incremental schema evolution.</w:t>
+        <w:t xml:space="preserve">ProxyFix is the standard bridge between a reverse proxy and Flask; Flask-Migrate enables versioned schema evolution.</w:t>
       </w:r>
     </w:p>
     <w:p>
@@ -5216,7 +5255,7 @@
         <w:t xml:space="preserve">Thinking behind it: </w:t>
       </w:r>
       <w:r>
-        <w:t xml:space="preserve">Adding a column later becomes 'add one line + flask db migrate/upgrade' - no DB rebuild, which was the pain that previously forced a full recreate.</w:t>
+        <w:t xml:space="preserve">Without ProxyFix, Secure cookies silently break behind an HTTPS nginx (Flask thinks the request is plain HTTP). Settings come from .env, which now loads automatically via python-dotenv.</w:t>
       </w:r>
     </w:p>
     <w:p>

</xml_diff>

<commit_message>
Fix PROJECT_GUIDE.docx: restart each topic's numbered list at 1
</commit_message>
<xml_diff>
--- a/PROJECT_GUIDE.docx
+++ b/PROJECT_GUIDE.docx
@@ -216,41 +216,29 @@
     </w:p>
     <w:p>
       <w:pPr>
-        <w:pStyle w:val="ListParagraph"/>
-        <w:numPr>
-          <w:ilvl w:val="0"/>
-          <w:numId w:val="2"/>
-        </w:numPr>
-        <w:spacing w:after="40"/>
-      </w:pPr>
-      <w:r>
-        <w:t xml:space="preserve">Reads an environment variable by name.</w:t>
-      </w:r>
-    </w:p>
-    <w:p>
-      <w:pPr>
-        <w:pStyle w:val="ListParagraph"/>
-        <w:numPr>
-          <w:ilvl w:val="0"/>
-          <w:numId w:val="2"/>
-        </w:numPr>
-        <w:spacing w:after="40"/>
-      </w:pPr>
-      <w:r>
-        <w:t xml:space="preserve">Compares its lowercased value against a set of 'truthy' words (1, true, yes, on).</w:t>
-      </w:r>
-    </w:p>
-    <w:p>
-      <w:pPr>
-        <w:pStyle w:val="ListParagraph"/>
-        <w:numPr>
-          <w:ilvl w:val="0"/>
-          <w:numId w:val="2"/>
-        </w:numPr>
-        <w:spacing w:after="40"/>
-      </w:pPr>
-      <w:r>
-        <w:t xml:space="preserve">Returns True/False.</w:t>
+        <w:spacing w:after="40"/>
+        <w:ind w:left="600" w:hanging="320"/>
+      </w:pPr>
+      <w:r>
+        <w:t xml:space="preserve">1. Reads an environment variable by name.</w:t>
+      </w:r>
+    </w:p>
+    <w:p>
+      <w:pPr>
+        <w:spacing w:after="40"/>
+        <w:ind w:left="600" w:hanging="320"/>
+      </w:pPr>
+      <w:r>
+        <w:t xml:space="preserve">2. Compares its lowercased value against a set of 'truthy' words (1, true, yes, on).</w:t>
+      </w:r>
+    </w:p>
+    <w:p>
+      <w:pPr>
+        <w:spacing w:after="40"/>
+        <w:ind w:left="600" w:hanging="320"/>
+      </w:pPr>
+      <w:r>
+        <w:t xml:space="preserve">3. Returns True/False.</w:t>
       </w:r>
     </w:p>
     <w:p>
@@ -325,41 +313,29 @@
     </w:p>
     <w:p>
       <w:pPr>
-        <w:pStyle w:val="ListParagraph"/>
-        <w:numPr>
-          <w:ilvl w:val="0"/>
-          <w:numId w:val="2"/>
-        </w:numPr>
-        <w:spacing w:after="40"/>
-      </w:pPr>
-      <w:r>
-        <w:t xml:space="preserve">Reads a comma-separated environment variable.</w:t>
-      </w:r>
-    </w:p>
-    <w:p>
-      <w:pPr>
-        <w:pStyle w:val="ListParagraph"/>
-        <w:numPr>
-          <w:ilvl w:val="0"/>
-          <w:numId w:val="2"/>
-        </w:numPr>
-        <w:spacing w:after="40"/>
-      </w:pPr>
-      <w:r>
-        <w:t xml:space="preserve">Splits on commas and strips spaces.</w:t>
-      </w:r>
-    </w:p>
-    <w:p>
-      <w:pPr>
-        <w:pStyle w:val="ListParagraph"/>
-        <w:numPr>
-          <w:ilvl w:val="0"/>
-          <w:numId w:val="2"/>
-        </w:numPr>
-        <w:spacing w:after="40"/>
-      </w:pPr>
-      <w:r>
-        <w:t xml:space="preserve">Drops empty entries and returns a clean list.</w:t>
+        <w:spacing w:after="40"/>
+        <w:ind w:left="600" w:hanging="320"/>
+      </w:pPr>
+      <w:r>
+        <w:t xml:space="preserve">1. Reads a comma-separated environment variable.</w:t>
+      </w:r>
+    </w:p>
+    <w:p>
+      <w:pPr>
+        <w:spacing w:after="40"/>
+        <w:ind w:left="600" w:hanging="320"/>
+      </w:pPr>
+      <w:r>
+        <w:t xml:space="preserve">2. Splits on commas and strips spaces.</w:t>
+      </w:r>
+    </w:p>
+    <w:p>
+      <w:pPr>
+        <w:spacing w:after="40"/>
+        <w:ind w:left="600" w:hanging="320"/>
+      </w:pPr>
+      <w:r>
+        <w:t xml:space="preserve">3. Drops empty entries and returns a clean list.</w:t>
       </w:r>
     </w:p>
     <w:p>
@@ -452,28 +428,20 @@
     </w:p>
     <w:p>
       <w:pPr>
-        <w:pStyle w:val="ListParagraph"/>
-        <w:numPr>
-          <w:ilvl w:val="0"/>
-          <w:numId w:val="2"/>
-        </w:numPr>
-        <w:spacing w:after="40"/>
-      </w:pPr>
-      <w:r>
-        <w:t xml:space="preserve">Defines every shared setting as a class attribute, each read from os.getenv with the current value as default.</w:t>
-      </w:r>
-    </w:p>
-    <w:p>
-      <w:pPr>
-        <w:pStyle w:val="ListParagraph"/>
-        <w:numPr>
-          <w:ilvl w:val="0"/>
-          <w:numId w:val="2"/>
-        </w:numPr>
-        <w:spacing w:after="40"/>
-      </w:pPr>
-      <w:r>
-        <w:t xml:space="preserve">Groups: core Flask (SECRET_KEY, PORT, TIMEZONE), DATABASE (URI + binds), backups, ECPay payment, API protection, security add-ons.</w:t>
+        <w:spacing w:after="40"/>
+        <w:ind w:left="600" w:hanging="320"/>
+      </w:pPr>
+      <w:r>
+        <w:t xml:space="preserve">1. Defines every shared setting as a class attribute, each read from os.getenv with the current value as default.</w:t>
+      </w:r>
+    </w:p>
+    <w:p>
+      <w:pPr>
+        <w:spacing w:after="40"/>
+        <w:ind w:left="600" w:hanging="320"/>
+      </w:pPr>
+      <w:r>
+        <w:t xml:space="preserve">2. Groups: core Flask (SECRET_KEY, PORT, TIMEZONE), DATABASE (URI + binds), backups, ECPay payment, API protection, security add-ons.</w:t>
       </w:r>
     </w:p>
     <w:p>
@@ -566,28 +534,20 @@
     </w:p>
     <w:p>
       <w:pPr>
-        <w:pStyle w:val="ListParagraph"/>
-        <w:numPr>
-          <w:ilvl w:val="0"/>
-          <w:numId w:val="2"/>
-        </w:numPr>
-        <w:spacing w:after="40"/>
-      </w:pPr>
-      <w:r>
-        <w:t xml:space="preserve">Three subclasses inherit the base and override only what differs per environment.</w:t>
-      </w:r>
-    </w:p>
-    <w:p>
-      <w:pPr>
-        <w:pStyle w:val="ListParagraph"/>
-        <w:numPr>
-          <w:ilvl w:val="0"/>
-          <w:numId w:val="2"/>
-        </w:numPr>
-        <w:spacing w:after="40"/>
-      </w:pPr>
-      <w:r>
-        <w:t xml:space="preserve">Testing uses an in-memory database, disables CSRF and rate limiting, and uses dummy ECPay keys so tests are fast and isolated.</w:t>
+        <w:spacing w:after="40"/>
+        <w:ind w:left="600" w:hanging="320"/>
+      </w:pPr>
+      <w:r>
+        <w:t xml:space="preserve">1. Three subclasses inherit the base and override only what differs per environment.</w:t>
+      </w:r>
+    </w:p>
+    <w:p>
+      <w:pPr>
+        <w:spacing w:after="40"/>
+        <w:ind w:left="600" w:hanging="320"/>
+      </w:pPr>
+      <w:r>
+        <w:t xml:space="preserve">2. Testing uses an in-memory database, disables CSRF and rate limiting, and uses dummy ECPay keys so tests are fast and isolated.</w:t>
       </w:r>
     </w:p>
     <w:p>
@@ -680,28 +640,20 @@
     </w:p>
     <w:p>
       <w:pPr>
-        <w:pStyle w:val="ListParagraph"/>
-        <w:numPr>
-          <w:ilvl w:val="0"/>
-          <w:numId w:val="2"/>
-        </w:numPr>
-        <w:spacing w:after="40"/>
-      </w:pPr>
-      <w:r>
-        <w:t xml:space="preserve">Takes an explicit name, or falls back to the APP_ENV variable, or defaults to development.</w:t>
-      </w:r>
-    </w:p>
-    <w:p>
-      <w:pPr>
-        <w:pStyle w:val="ListParagraph"/>
-        <w:numPr>
-          <w:ilvl w:val="0"/>
-          <w:numId w:val="2"/>
-        </w:numPr>
-        <w:spacing w:after="40"/>
-      </w:pPr>
-      <w:r>
-        <w:t xml:space="preserve">Looks the name up in a dictionary and returns the matching config class.</w:t>
+        <w:spacing w:after="40"/>
+        <w:ind w:left="600" w:hanging="320"/>
+      </w:pPr>
+      <w:r>
+        <w:t xml:space="preserve">1. Takes an explicit name, or falls back to the APP_ENV variable, or defaults to development.</w:t>
+      </w:r>
+    </w:p>
+    <w:p>
+      <w:pPr>
+        <w:spacing w:after="40"/>
+        <w:ind w:left="600" w:hanging="320"/>
+      </w:pPr>
+      <w:r>
+        <w:t xml:space="preserve">2. Looks the name up in a dictionary and returns the matching config class.</w:t>
       </w:r>
     </w:p>
     <w:p>
@@ -815,67 +767,47 @@
     </w:p>
     <w:p>
       <w:pPr>
-        <w:pStyle w:val="ListParagraph"/>
-        <w:numPr>
-          <w:ilvl w:val="0"/>
-          <w:numId w:val="2"/>
-        </w:numPr>
-        <w:spacing w:after="40"/>
-      </w:pPr>
-      <w:r>
-        <w:t xml:space="preserve">Represents a login account.</w:t>
-      </w:r>
-    </w:p>
-    <w:p>
-      <w:pPr>
-        <w:pStyle w:val="ListParagraph"/>
-        <w:numPr>
-          <w:ilvl w:val="0"/>
-          <w:numId w:val="2"/>
-        </w:numPr>
-        <w:spacing w:after="40"/>
-      </w:pPr>
-      <w:r>
-        <w:t xml:space="preserve">__bind_key__='user_db' stores it in a SECOND database (user.db) separate from the data database.</w:t>
-      </w:r>
-    </w:p>
-    <w:p>
-      <w:pPr>
-        <w:pStyle w:val="ListParagraph"/>
-        <w:numPr>
-          <w:ilvl w:val="0"/>
-          <w:numId w:val="2"/>
-        </w:numPr>
-        <w:spacing w:after="40"/>
-      </w:pPr>
-      <w:r>
-        <w:t xml:space="preserve">Holds role (user/admin/superadmin), VIP fields, contact info, and a hashed password.</w:t>
-      </w:r>
-    </w:p>
-    <w:p>
-      <w:pPr>
-        <w:pStyle w:val="ListParagraph"/>
-        <w:numPr>
-          <w:ilvl w:val="0"/>
-          <w:numId w:val="2"/>
-        </w:numPr>
-        <w:spacing w:after="40"/>
-      </w:pPr>
-      <w:r>
-        <w:t xml:space="preserve">Optional, config-gated registration fields: email, phone, a generic address JSON</w:t>
-      </w:r>
-    </w:p>
-    <w:p>
-      <w:pPr>
-        <w:pStyle w:val="ListParagraph"/>
-        <w:numPr>
-          <w:ilvl w:val="0"/>
-          <w:numId w:val="2"/>
-        </w:numPr>
-        <w:spacing w:after="40"/>
-      </w:pPr>
-      <w:r>
-        <w:t xml:space="preserve">({country,state,city,district,zipcode,street}) and a birthday date.</w:t>
+        <w:spacing w:after="40"/>
+        <w:ind w:left="600" w:hanging="320"/>
+      </w:pPr>
+      <w:r>
+        <w:t xml:space="preserve">1. Represents a login account.</w:t>
+      </w:r>
+    </w:p>
+    <w:p>
+      <w:pPr>
+        <w:spacing w:after="40"/>
+        <w:ind w:left="600" w:hanging="320"/>
+      </w:pPr>
+      <w:r>
+        <w:t xml:space="preserve">2. __bind_key__='user_db' stores it in a SECOND database (user.db) separate from the data database.</w:t>
+      </w:r>
+    </w:p>
+    <w:p>
+      <w:pPr>
+        <w:spacing w:after="40"/>
+        <w:ind w:left="600" w:hanging="320"/>
+      </w:pPr>
+      <w:r>
+        <w:t xml:space="preserve">3. Holds role (user/admin/superadmin), VIP fields, contact info, and a hashed password.</w:t>
+      </w:r>
+    </w:p>
+    <w:p>
+      <w:pPr>
+        <w:spacing w:after="40"/>
+        <w:ind w:left="600" w:hanging="320"/>
+      </w:pPr>
+      <w:r>
+        <w:t xml:space="preserve">4. Optional, config-gated registration fields: email, phone, a generic address JSON</w:t>
+      </w:r>
+    </w:p>
+    <w:p>
+      <w:pPr>
+        <w:spacing w:after="40"/>
+        <w:ind w:left="600" w:hanging="320"/>
+      </w:pPr>
+      <w:r>
+        <w:t xml:space="preserve">5. ({country,state,city,district,zipcode,street}) and a birthday date.</w:t>
       </w:r>
     </w:p>
     <w:p>
@@ -959,28 +891,20 @@
     </w:p>
     <w:p>
       <w:pPr>
-        <w:pStyle w:val="ListParagraph"/>
-        <w:numPr>
-          <w:ilvl w:val="0"/>
-          <w:numId w:val="2"/>
-        </w:numPr>
-        <w:spacing w:after="40"/>
-      </w:pPr>
-      <w:r>
-        <w:t xml:space="preserve">set_password hashes a plain password and stores only the hash.</w:t>
-      </w:r>
-    </w:p>
-    <w:p>
-      <w:pPr>
-        <w:pStyle w:val="ListParagraph"/>
-        <w:numPr>
-          <w:ilvl w:val="0"/>
-          <w:numId w:val="2"/>
-        </w:numPr>
-        <w:spacing w:after="40"/>
-      </w:pPr>
-      <w:r>
-        <w:t xml:space="preserve">check_password verifies a candidate password against the stored hash.</w:t>
+        <w:spacing w:after="40"/>
+        <w:ind w:left="600" w:hanging="320"/>
+      </w:pPr>
+      <w:r>
+        <w:t xml:space="preserve">1. set_password hashes a plain password and stores only the hash.</w:t>
+      </w:r>
+    </w:p>
+    <w:p>
+      <w:pPr>
+        <w:spacing w:after="40"/>
+        <w:ind w:left="600" w:hanging="320"/>
+      </w:pPr>
+      <w:r>
+        <w:t xml:space="preserve">2. check_password verifies a candidate password against the stored hash.</w:t>
       </w:r>
     </w:p>
     <w:p>
@@ -1055,28 +979,20 @@
     </w:p>
     <w:p>
       <w:pPr>
-        <w:pStyle w:val="ListParagraph"/>
-        <w:numPr>
-          <w:ilvl w:val="0"/>
-          <w:numId w:val="2"/>
-        </w:numPr>
-        <w:spacing w:after="40"/>
-      </w:pPr>
-      <w:r>
-        <w:t xml:space="preserve">An append-only record of payment events (e.g. 'SUCCESS, VIP activated').</w:t>
-      </w:r>
-    </w:p>
-    <w:p>
-      <w:pPr>
-        <w:pStyle w:val="ListParagraph"/>
-        <w:numPr>
-          <w:ilvl w:val="0"/>
-          <w:numId w:val="2"/>
-        </w:numPr>
-        <w:spacing w:after="40"/>
-      </w:pPr>
-      <w:r>
-        <w:t xml:space="preserve">Written by the payment callback.</w:t>
+        <w:spacing w:after="40"/>
+        <w:ind w:left="600" w:hanging="320"/>
+      </w:pPr>
+      <w:r>
+        <w:t xml:space="preserve">1. An append-only record of payment events (e.g. 'SUCCESS, VIP activated').</w:t>
+      </w:r>
+    </w:p>
+    <w:p>
+      <w:pPr>
+        <w:spacing w:after="40"/>
+        <w:ind w:left="600" w:hanging="320"/>
+      </w:pPr>
+      <w:r>
+        <w:t xml:space="preserve">2. Written by the payment callback.</w:t>
       </w:r>
     </w:p>
     <w:p>
@@ -1151,54 +1067,38 @@
     </w:p>
     <w:p>
       <w:pPr>
-        <w:pStyle w:val="ListParagraph"/>
-        <w:numPr>
-          <w:ilvl w:val="0"/>
-          <w:numId w:val="2"/>
-        </w:numPr>
-        <w:spacing w:after="40"/>
-      </w:pPr>
-      <w:r>
-        <w:t xml:space="preserve">Represents a PERSON whose data you store - the 'per-person' identity.</w:t>
-      </w:r>
-    </w:p>
-    <w:p>
-      <w:pPr>
-        <w:pStyle w:val="ListParagraph"/>
-        <w:numPr>
-          <w:ilvl w:val="0"/>
-          <w:numId w:val="2"/>
-        </w:numPr>
-        <w:spacing w:after="40"/>
-      </w:pPr>
-      <w:r>
-        <w:t xml:space="preserve">Primary key is the pair (userID, name).</w:t>
-      </w:r>
-    </w:p>
-    <w:p>
-      <w:pPr>
-        <w:pStyle w:val="ListParagraph"/>
-        <w:numPr>
-          <w:ilvl w:val="0"/>
-          <w:numId w:val="2"/>
-        </w:numPr>
-        <w:spacing w:after="40"/>
-      </w:pPr>
-      <w:r>
-        <w:t xml:space="preserve">`meta` is a generic JSON catch-all: any extra per-person attribute can be stored</w:t>
-      </w:r>
-    </w:p>
-    <w:p>
-      <w:pPr>
-        <w:pStyle w:val="ListParagraph"/>
-        <w:numPr>
-          <w:ilvl w:val="0"/>
-          <w:numId w:val="2"/>
-        </w:numPr>
-        <w:spacing w:after="40"/>
-      </w:pPr>
-      <w:r>
-        <w:t xml:space="preserve">with no schema change (the /save API auto-routes unknown fields there).</w:t>
+        <w:spacing w:after="40"/>
+        <w:ind w:left="600" w:hanging="320"/>
+      </w:pPr>
+      <w:r>
+        <w:t xml:space="preserve">1. Represents a PERSON whose data you store - the 'per-person' identity.</w:t>
+      </w:r>
+    </w:p>
+    <w:p>
+      <w:pPr>
+        <w:spacing w:after="40"/>
+        <w:ind w:left="600" w:hanging="320"/>
+      </w:pPr>
+      <w:r>
+        <w:t xml:space="preserve">2. Primary key is the pair (userID, name).</w:t>
+      </w:r>
+    </w:p>
+    <w:p>
+      <w:pPr>
+        <w:spacing w:after="40"/>
+        <w:ind w:left="600" w:hanging="320"/>
+      </w:pPr>
+      <w:r>
+        <w:t xml:space="preserve">3. `meta` is a generic JSON catch-all: any extra per-person attribute can be stored</w:t>
+      </w:r>
+    </w:p>
+    <w:p>
+      <w:pPr>
+        <w:spacing w:after="40"/>
+        <w:ind w:left="600" w:hanging="320"/>
+      </w:pPr>
+      <w:r>
+        <w:t xml:space="preserve">4. with no schema change (the /save API auto-routes unknown fields there).</w:t>
       </w:r>
     </w:p>
     <w:p>
@@ -1282,67 +1182,47 @@
     </w:p>
     <w:p>
       <w:pPr>
-        <w:pStyle w:val="ListParagraph"/>
-        <w:numPr>
-          <w:ilvl w:val="0"/>
-          <w:numId w:val="2"/>
-        </w:numPr>
-        <w:spacing w:after="40"/>
-      </w:pPr>
-      <w:r>
-        <w:t xml:space="preserve">One stored record belonging to a person.</w:t>
-      </w:r>
-    </w:p>
-    <w:p>
-      <w:pPr>
-        <w:pStyle w:val="ListParagraph"/>
-        <w:numPr>
-          <w:ilvl w:val="0"/>
-          <w:numId w:val="2"/>
-        </w:numPr>
-        <w:spacing w:after="40"/>
-      </w:pPr>
-      <w:r>
-        <w:t xml:space="preserve">The payload column 'data' is generic JSON - it accepts any shape the client sends.</w:t>
-      </w:r>
-    </w:p>
-    <w:p>
-      <w:pPr>
-        <w:pStyle w:val="ListParagraph"/>
-        <w:numPr>
-          <w:ilvl w:val="0"/>
-          <w:numId w:val="2"/>
-        </w:numPr>
-        <w:spacing w:after="40"/>
-      </w:pPr>
-      <w:r>
-        <w:t xml:space="preserve">'kind' is a generic category label (a free string); the data API can be configured</w:t>
-      </w:r>
-    </w:p>
-    <w:p>
-      <w:pPr>
-        <w:pStyle w:val="ListParagraph"/>
-        <w:numPr>
-          <w:ilvl w:val="0"/>
-          <w:numId w:val="2"/>
-        </w:numPr>
-        <w:spacing w:after="40"/>
-      </w:pPr>
-      <w:r>
-        <w:t xml:space="preserve">to expose only certain kinds (see the /api/v1 section).</w:t>
-      </w:r>
-    </w:p>
-    <w:p>
-      <w:pPr>
-        <w:pStyle w:val="ListParagraph"/>
-        <w:numPr>
-          <w:ilvl w:val="0"/>
-          <w:numId w:val="2"/>
-        </w:numPr>
-        <w:spacing w:after="40"/>
-      </w:pPr>
-      <w:r>
-        <w:t xml:space="preserve">A foreign key links each record to its UserInfo.</w:t>
+        <w:spacing w:after="40"/>
+        <w:ind w:left="600" w:hanging="320"/>
+      </w:pPr>
+      <w:r>
+        <w:t xml:space="preserve">1. One stored record belonging to a person.</w:t>
+      </w:r>
+    </w:p>
+    <w:p>
+      <w:pPr>
+        <w:spacing w:after="40"/>
+        <w:ind w:left="600" w:hanging="320"/>
+      </w:pPr>
+      <w:r>
+        <w:t xml:space="preserve">2. The payload column 'data' is generic JSON - it accepts any shape the client sends.</w:t>
+      </w:r>
+    </w:p>
+    <w:p>
+      <w:pPr>
+        <w:spacing w:after="40"/>
+        <w:ind w:left="600" w:hanging="320"/>
+      </w:pPr>
+      <w:r>
+        <w:t xml:space="preserve">3. 'kind' is a generic category label (a free string); the data API can be configured</w:t>
+      </w:r>
+    </w:p>
+    <w:p>
+      <w:pPr>
+        <w:spacing w:after="40"/>
+        <w:ind w:left="600" w:hanging="320"/>
+      </w:pPr>
+      <w:r>
+        <w:t xml:space="preserve">4. to expose only certain kinds (see the /api/v1 section).</w:t>
+      </w:r>
+    </w:p>
+    <w:p>
+      <w:pPr>
+        <w:spacing w:after="40"/>
+        <w:ind w:left="600" w:hanging="320"/>
+      </w:pPr>
+      <w:r>
+        <w:t xml:space="preserve">5. A foreign key links each record to its UserInfo.</w:t>
       </w:r>
     </w:p>
     <w:p>
@@ -1500,41 +1380,29 @@
     </w:p>
     <w:p>
       <w:pPr>
-        <w:pStyle w:val="ListParagraph"/>
-        <w:numPr>
-          <w:ilvl w:val="0"/>
-          <w:numId w:val="2"/>
-        </w:numPr>
-        <w:spacing w:after="40"/>
-      </w:pPr>
-      <w:r>
-        <w:t xml:space="preserve">Tries to import Flask-Limiter and Flask-WTF.</w:t>
-      </w:r>
-    </w:p>
-    <w:p>
-      <w:pPr>
-        <w:pStyle w:val="ListParagraph"/>
-        <w:numPr>
-          <w:ilvl w:val="0"/>
-          <w:numId w:val="2"/>
-        </w:numPr>
-        <w:spacing w:after="40"/>
-      </w:pPr>
-      <w:r>
-        <w:t xml:space="preserve">If a package is missing, it substitutes a _NoopExt whose methods (init_app, limit, exempt) do nothing.</w:t>
-      </w:r>
-    </w:p>
-    <w:p>
-      <w:pPr>
-        <w:pStyle w:val="ListParagraph"/>
-        <w:numPr>
-          <w:ilvl w:val="0"/>
-          <w:numId w:val="2"/>
-        </w:numPr>
-        <w:spacing w:after="40"/>
-      </w:pPr>
-      <w:r>
-        <w:t xml:space="preserve">So decorators like @limiter.limit(...) and @csrf.exempt always exist.</w:t>
+        <w:spacing w:after="40"/>
+        <w:ind w:left="600" w:hanging="320"/>
+      </w:pPr>
+      <w:r>
+        <w:t xml:space="preserve">1. Tries to import Flask-Limiter and Flask-WTF.</w:t>
+      </w:r>
+    </w:p>
+    <w:p>
+      <w:pPr>
+        <w:spacing w:after="40"/>
+        <w:ind w:left="600" w:hanging="320"/>
+      </w:pPr>
+      <w:r>
+        <w:t xml:space="preserve">2. If a package is missing, it substitutes a _NoopExt whose methods (init_app, limit, exempt) do nothing.</w:t>
+      </w:r>
+    </w:p>
+    <w:p>
+      <w:pPr>
+        <w:spacing w:after="40"/>
+        <w:ind w:left="600" w:hanging="320"/>
+      </w:pPr>
+      <w:r>
+        <w:t xml:space="preserve">3. So decorators like @limiter.limit(...) and @csrf.exempt always exist.</w:t>
       </w:r>
     </w:p>
     <w:p>
@@ -1609,15 +1477,11 @@
     </w:p>
     <w:p>
       <w:pPr>
-        <w:pStyle w:val="ListParagraph"/>
-        <w:numPr>
-          <w:ilvl w:val="0"/>
-          <w:numId w:val="2"/>
-        </w:numPr>
-        <w:spacing w:after="40"/>
-      </w:pPr>
-      <w:r>
-        <w:t xml:space="preserve">Returns the current time in the configured timezone (default Asia/Taipei).</w:t>
+        <w:spacing w:after="40"/>
+        <w:ind w:left="600" w:hanging="320"/>
+      </w:pPr>
+      <w:r>
+        <w:t xml:space="preserve">1. Returns the current time in the configured timezone (default Asia/Taipei).</w:t>
       </w:r>
     </w:p>
     <w:p>
@@ -1692,15 +1556,11 @@
     </w:p>
     <w:p>
       <w:pPr>
-        <w:pStyle w:val="ListParagraph"/>
-        <w:numPr>
-          <w:ilvl w:val="0"/>
-          <w:numId w:val="2"/>
-        </w:numPr>
-        <w:spacing w:after="40"/>
-      </w:pPr>
-      <w:r>
-        <w:t xml:space="preserve">Takes any datetime, assumes UTC if it has no timezone, and converts it to local time.</w:t>
+        <w:spacing w:after="40"/>
+        <w:ind w:left="600" w:hanging="320"/>
+      </w:pPr>
+      <w:r>
+        <w:t xml:space="preserve">1. Takes any datetime, assumes UTC if it has no timezone, and converts it to local time.</w:t>
       </w:r>
     </w:p>
     <w:p>
@@ -1796,28 +1656,20 @@
     </w:p>
     <w:p>
       <w:pPr>
-        <w:pStyle w:val="ListParagraph"/>
-        <w:numPr>
-          <w:ilvl w:val="0"/>
-          <w:numId w:val="2"/>
-        </w:numPr>
-        <w:spacing w:after="40"/>
-      </w:pPr>
-      <w:r>
-        <w:t xml:space="preserve">Checks the session cookie for a logged-in user.</w:t>
-      </w:r>
-    </w:p>
-    <w:p>
-      <w:pPr>
-        <w:pStyle w:val="ListParagraph"/>
-        <w:numPr>
-          <w:ilvl w:val="0"/>
-          <w:numId w:val="2"/>
-        </w:numPr>
-        <w:spacing w:after="40"/>
-      </w:pPr>
-      <w:r>
-        <w:t xml:space="preserve">If absent, redirects to the login page; otherwise runs the route.</w:t>
+        <w:spacing w:after="40"/>
+        <w:ind w:left="600" w:hanging="320"/>
+      </w:pPr>
+      <w:r>
+        <w:t xml:space="preserve">1. Checks the session cookie for a logged-in user.</w:t>
+      </w:r>
+    </w:p>
+    <w:p>
+      <w:pPr>
+        <w:spacing w:after="40"/>
+        <w:ind w:left="600" w:hanging="320"/>
+      </w:pPr>
+      <w:r>
+        <w:t xml:space="preserve">2. If absent, redirects to the login page; otherwise runs the route.</w:t>
       </w:r>
     </w:p>
     <w:p>
@@ -1901,41 +1753,29 @@
     </w:p>
     <w:p>
       <w:pPr>
-        <w:pStyle w:val="ListParagraph"/>
-        <w:numPr>
-          <w:ilvl w:val="0"/>
-          <w:numId w:val="2"/>
-        </w:numPr>
-        <w:spacing w:after="40"/>
-      </w:pPr>
-      <w:r>
-        <w:t xml:space="preserve">Confirms the visitor is logged in.</w:t>
-      </w:r>
-    </w:p>
-    <w:p>
-      <w:pPr>
-        <w:pStyle w:val="ListParagraph"/>
-        <w:numPr>
-          <w:ilvl w:val="0"/>
-          <w:numId w:val="2"/>
-        </w:numPr>
-        <w:spacing w:after="40"/>
-      </w:pPr>
-      <w:r>
-        <w:t xml:space="preserve">Loads their account and checks the role is admin or superadmin.</w:t>
-      </w:r>
-    </w:p>
-    <w:p>
-      <w:pPr>
-        <w:pStyle w:val="ListParagraph"/>
-        <w:numPr>
-          <w:ilvl w:val="0"/>
-          <w:numId w:val="2"/>
-        </w:numPr>
-        <w:spacing w:after="40"/>
-      </w:pPr>
-      <w:r>
-        <w:t xml:space="preserve">Stores the user on g.current_user for the route to reuse; otherwise returns 403.</w:t>
+        <w:spacing w:after="40"/>
+        <w:ind w:left="600" w:hanging="320"/>
+      </w:pPr>
+      <w:r>
+        <w:t xml:space="preserve">1. Confirms the visitor is logged in.</w:t>
+      </w:r>
+    </w:p>
+    <w:p>
+      <w:pPr>
+        <w:spacing w:after="40"/>
+        <w:ind w:left="600" w:hanging="320"/>
+      </w:pPr>
+      <w:r>
+        <w:t xml:space="preserve">2. Loads their account and checks the role is admin or superadmin.</w:t>
+      </w:r>
+    </w:p>
+    <w:p>
+      <w:pPr>
+        <w:spacing w:after="40"/>
+        <w:ind w:left="600" w:hanging="320"/>
+      </w:pPr>
+      <w:r>
+        <w:t xml:space="preserve">3. Stores the user on g.current_user for the route to reuse; otherwise returns 403.</w:t>
       </w:r>
     </w:p>
     <w:p>
@@ -2010,41 +1850,29 @@
     </w:p>
     <w:p>
       <w:pPr>
-        <w:pStyle w:val="ListParagraph"/>
-        <w:numPr>
-          <w:ilvl w:val="0"/>
-          <w:numId w:val="2"/>
-        </w:numPr>
-        <w:spacing w:after="40"/>
-      </w:pPr>
-      <w:r>
-        <w:t xml:space="preserve">Looks for an X-API-Key header and checks it against the configured key list.</w:t>
-      </w:r>
-    </w:p>
-    <w:p>
-      <w:pPr>
-        <w:pStyle w:val="ListParagraph"/>
-        <w:numPr>
-          <w:ilvl w:val="0"/>
-          <w:numId w:val="2"/>
-        </w:numPr>
-        <w:spacing w:after="40"/>
-      </w:pPr>
-      <w:r>
-        <w:t xml:space="preserve">If not present, looks for an Authorization: Bearer token and verifies it.</w:t>
-      </w:r>
-    </w:p>
-    <w:p>
-      <w:pPr>
-        <w:pStyle w:val="ListParagraph"/>
-        <w:numPr>
-          <w:ilvl w:val="0"/>
-          <w:numId w:val="2"/>
-        </w:numPr>
-        <w:spacing w:after="40"/>
-      </w:pPr>
-      <w:r>
-        <w:t xml:space="preserve">On success, records who called on g.api_client; otherwise returns 401.</w:t>
+        <w:spacing w:after="40"/>
+        <w:ind w:left="600" w:hanging="320"/>
+      </w:pPr>
+      <w:r>
+        <w:t xml:space="preserve">1. Looks for an X-API-Key header and checks it against the configured key list.</w:t>
+      </w:r>
+    </w:p>
+    <w:p>
+      <w:pPr>
+        <w:spacing w:after="40"/>
+        <w:ind w:left="600" w:hanging="320"/>
+      </w:pPr>
+      <w:r>
+        <w:t xml:space="preserve">2. If not present, looks for an Authorization: Bearer token and verifies it.</w:t>
+      </w:r>
+    </w:p>
+    <w:p>
+      <w:pPr>
+        <w:spacing w:after="40"/>
+        <w:ind w:left="600" w:hanging="320"/>
+      </w:pPr>
+      <w:r>
+        <w:t xml:space="preserve">3. On success, records who called on g.api_client; otherwise returns 401.</w:t>
       </w:r>
     </w:p>
     <w:p>
@@ -2119,54 +1947,38 @@
     </w:p>
     <w:p>
       <w:pPr>
-        <w:pStyle w:val="ListParagraph"/>
-        <w:numPr>
-          <w:ilvl w:val="0"/>
-          <w:numId w:val="2"/>
-        </w:numPr>
-        <w:spacing w:after="40"/>
-      </w:pPr>
-      <w:r>
-        <w:t xml:space="preserve">Requires a valid Bearer token (a shared API key is NOT enough here).</w:t>
-      </w:r>
-    </w:p>
-    <w:p>
-      <w:pPr>
-        <w:pStyle w:val="ListParagraph"/>
-        <w:numPr>
-          <w:ilvl w:val="0"/>
-          <w:numId w:val="2"/>
-        </w:numPr>
-        <w:spacing w:after="40"/>
-      </w:pPr>
-      <w:r>
-        <w:t xml:space="preserve">Loads the SystemUser named in the token and checks the token's password-stamp</w:t>
-      </w:r>
-    </w:p>
-    <w:p>
-      <w:pPr>
-        <w:pStyle w:val="ListParagraph"/>
-        <w:numPr>
-          <w:ilvl w:val="0"/>
-          <w:numId w:val="2"/>
-        </w:numPr>
-        <w:spacing w:after="40"/>
-      </w:pPr>
-      <w:r>
-        <w:t xml:space="preserve">still matches the account's current password; sets g.api_user.</w:t>
-      </w:r>
-    </w:p>
-    <w:p>
-      <w:pPr>
-        <w:pStyle w:val="ListParagraph"/>
-        <w:numPr>
-          <w:ilvl w:val="0"/>
-          <w:numId w:val="2"/>
-        </w:numPr>
-        <w:spacing w:after="40"/>
-      </w:pPr>
-      <w:r>
-        <w:t xml:space="preserve">password_stamp(user) is a short hash of the stored password hash.</w:t>
+        <w:spacing w:after="40"/>
+        <w:ind w:left="600" w:hanging="320"/>
+      </w:pPr>
+      <w:r>
+        <w:t xml:space="preserve">1. Requires a valid Bearer token (a shared API key is NOT enough here).</w:t>
+      </w:r>
+    </w:p>
+    <w:p>
+      <w:pPr>
+        <w:spacing w:after="40"/>
+        <w:ind w:left="600" w:hanging="320"/>
+      </w:pPr>
+      <w:r>
+        <w:t xml:space="preserve">2. Loads the SystemUser named in the token and checks the token's password-stamp</w:t>
+      </w:r>
+    </w:p>
+    <w:p>
+      <w:pPr>
+        <w:spacing w:after="40"/>
+        <w:ind w:left="600" w:hanging="320"/>
+      </w:pPr>
+      <w:r>
+        <w:t xml:space="preserve">3. still matches the account's current password; sets g.api_user.</w:t>
+      </w:r>
+    </w:p>
+    <w:p>
+      <w:pPr>
+        <w:spacing w:after="40"/>
+        <w:ind w:left="600" w:hanging="320"/>
+      </w:pPr>
+      <w:r>
+        <w:t xml:space="preserve">4. password_stamp(user) is a short hash of the stored password hash.</w:t>
       </w:r>
     </w:p>
     <w:p>
@@ -2271,28 +2083,20 @@
     </w:p>
     <w:p>
       <w:pPr>
-        <w:pStyle w:val="ListParagraph"/>
-        <w:numPr>
-          <w:ilvl w:val="0"/>
-          <w:numId w:val="2"/>
-        </w:numPr>
-        <w:spacing w:after="40"/>
-      </w:pPr>
-      <w:r>
-        <w:t xml:space="preserve">make_token packs a small dict into a signed, time-stamped string.</w:t>
-      </w:r>
-    </w:p>
-    <w:p>
-      <w:pPr>
-        <w:pStyle w:val="ListParagraph"/>
-        <w:numPr>
-          <w:ilvl w:val="0"/>
-          <w:numId w:val="2"/>
-        </w:numPr>
-        <w:spacing w:after="40"/>
-      </w:pPr>
-      <w:r>
-        <w:t xml:space="preserve">read_token verifies the signature and age; returns the data if valid, or None if tampered or expired.</w:t>
+        <w:spacing w:after="40"/>
+        <w:ind w:left="600" w:hanging="320"/>
+      </w:pPr>
+      <w:r>
+        <w:t xml:space="preserve">1. make_token packs a small dict into a signed, time-stamped string.</w:t>
+      </w:r>
+    </w:p>
+    <w:p>
+      <w:pPr>
+        <w:spacing w:after="40"/>
+        <w:ind w:left="600" w:hanging="320"/>
+      </w:pPr>
+      <w:r>
+        <w:t xml:space="preserve">2. read_token verifies the signature and age; returns the data if valid, or None if tampered or expired.</w:t>
       </w:r>
     </w:p>
     <w:p>
@@ -2380,28 +2184,20 @@
     </w:p>
     <w:p>
       <w:pPr>
-        <w:pStyle w:val="ListParagraph"/>
-        <w:numPr>
-          <w:ilvl w:val="0"/>
-          <w:numId w:val="2"/>
-        </w:numPr>
-        <w:spacing w:after="40"/>
-      </w:pPr>
-      <w:r>
-        <w:t xml:space="preserve">Builds the ECPay SDK object from config credentials.</w:t>
-      </w:r>
-    </w:p>
-    <w:p>
-      <w:pPr>
-        <w:pStyle w:val="ListParagraph"/>
-        <w:numPr>
-          <w:ilvl w:val="0"/>
-          <w:numId w:val="2"/>
-        </w:numPr>
-        <w:spacing w:after="40"/>
-      </w:pPr>
-      <w:r>
-        <w:t xml:space="preserve">Caches it on app.config so it is created only once, then reused.</w:t>
+        <w:spacing w:after="40"/>
+        <w:ind w:left="600" w:hanging="320"/>
+      </w:pPr>
+      <w:r>
+        <w:t xml:space="preserve">1. Builds the ECPay SDK object from config credentials.</w:t>
+      </w:r>
+    </w:p>
+    <w:p>
+      <w:pPr>
+        <w:spacing w:after="40"/>
+        <w:ind w:left="600" w:hanging="320"/>
+      </w:pPr>
+      <w:r>
+        <w:t xml:space="preserve">2. Caches it on app.config so it is created only once, then reused.</w:t>
       </w:r>
     </w:p>
     <w:p>
@@ -2476,54 +2272,38 @@
     </w:p>
     <w:p>
       <w:pPr>
-        <w:pStyle w:val="ListParagraph"/>
-        <w:numPr>
-          <w:ilvl w:val="0"/>
-          <w:numId w:val="2"/>
-        </w:numPr>
-        <w:spacing w:after="40"/>
-      </w:pPr>
-      <w:r>
-        <w:t xml:space="preserve">Assembles the ECPay order dict (amount, item, callback URLs, payment methods).</w:t>
-      </w:r>
-    </w:p>
-    <w:p>
-      <w:pPr>
-        <w:pStyle w:val="ListParagraph"/>
-        <w:numPr>
-          <w:ilvl w:val="0"/>
-          <w:numId w:val="2"/>
-        </w:numPr>
-        <w:spacing w:after="40"/>
-      </w:pPr>
-      <w:r>
-        <w:t xml:space="preserve">Pulls changeable defaults from config (ChoosePayment, EncryptType, item, action URL).</w:t>
-      </w:r>
-    </w:p>
-    <w:p>
-      <w:pPr>
-        <w:pStyle w:val="ListParagraph"/>
-        <w:numPr>
-          <w:ilvl w:val="0"/>
-          <w:numId w:val="2"/>
-        </w:numPr>
-        <w:spacing w:after="40"/>
-      </w:pPr>
-      <w:r>
-        <w:t xml:space="preserve">Signs it via get_ecpay_sdk() and returns the signed params plus the action URL.</w:t>
-      </w:r>
-    </w:p>
-    <w:p>
-      <w:pPr>
-        <w:pStyle w:val="ListParagraph"/>
-        <w:numPr>
-          <w:ilvl w:val="0"/>
-          <w:numId w:val="2"/>
-        </w:numPr>
-        <w:spacing w:after="40"/>
-      </w:pPr>
-      <w:r>
-        <w:t xml:space="preserve">pay_vip is now just a thin caller; new payment flows are a single call.</w:t>
+        <w:spacing w:after="40"/>
+        <w:ind w:left="600" w:hanging="320"/>
+      </w:pPr>
+      <w:r>
+        <w:t xml:space="preserve">1. Assembles the ECPay order dict (amount, item, callback URLs, payment methods).</w:t>
+      </w:r>
+    </w:p>
+    <w:p>
+      <w:pPr>
+        <w:spacing w:after="40"/>
+        <w:ind w:left="600" w:hanging="320"/>
+      </w:pPr>
+      <w:r>
+        <w:t xml:space="preserve">2. Pulls changeable defaults from config (ChoosePayment, EncryptType, item, action URL).</w:t>
+      </w:r>
+    </w:p>
+    <w:p>
+      <w:pPr>
+        <w:spacing w:after="40"/>
+        <w:ind w:left="600" w:hanging="320"/>
+      </w:pPr>
+      <w:r>
+        <w:t xml:space="preserve">3. Signs it via get_ecpay_sdk() and returns the signed params plus the action URL.</w:t>
+      </w:r>
+    </w:p>
+    <w:p>
+      <w:pPr>
+        <w:spacing w:after="40"/>
+        <w:ind w:left="600" w:hanging="320"/>
+      </w:pPr>
+      <w:r>
+        <w:t xml:space="preserve">4. pay_vip is now just a thin caller; new payment flows are a single call.</w:t>
       </w:r>
     </w:p>
     <w:p>
@@ -2659,28 +2439,20 @@
     </w:p>
     <w:p>
       <w:pPr>
-        <w:pStyle w:val="ListParagraph"/>
-        <w:numPr>
-          <w:ilvl w:val="0"/>
-          <w:numId w:val="2"/>
-        </w:numPr>
-        <w:spacing w:after="40"/>
-      </w:pPr>
-      <w:r>
-        <w:t xml:space="preserve">If SMTP_HOST is set, sends a real email (STARTTLS + optional login).</w:t>
-      </w:r>
-    </w:p>
-    <w:p>
-      <w:pPr>
-        <w:pStyle w:val="ListParagraph"/>
-        <w:numPr>
-          <w:ilvl w:val="0"/>
-          <w:numId w:val="2"/>
-        </w:numPr>
-        <w:spacing w:after="40"/>
-      </w:pPr>
-      <w:r>
-        <w:t xml:space="preserve">If not configured, logs the content and returns False (dev fallback).</w:t>
+        <w:spacing w:after="40"/>
+        <w:ind w:left="600" w:hanging="320"/>
+      </w:pPr>
+      <w:r>
+        <w:t xml:space="preserve">1. If SMTP_HOST is set, sends a real email (STARTTLS + optional login).</w:t>
+      </w:r>
+    </w:p>
+    <w:p>
+      <w:pPr>
+        <w:spacing w:after="40"/>
+        <w:ind w:left="600" w:hanging="320"/>
+      </w:pPr>
+      <w:r>
+        <w:t xml:space="preserve">2. If not configured, logs the content and returns False (dev fallback).</w:t>
       </w:r>
     </w:p>
     <w:p>
@@ -2755,41 +2527,29 @@
     </w:p>
     <w:p>
       <w:pPr>
-        <w:pStyle w:val="ListParagraph"/>
-        <w:numPr>
-          <w:ilvl w:val="0"/>
-          <w:numId w:val="2"/>
-        </w:numPr>
-        <w:spacing w:after="40"/>
-      </w:pPr>
-      <w:r>
-        <w:t xml:space="preserve">create_backup copies the database file into the backups folder with a timestamped name.</w:t>
-      </w:r>
-    </w:p>
-    <w:p>
-      <w:pPr>
-        <w:pStyle w:val="ListParagraph"/>
-        <w:numPr>
-          <w:ilvl w:val="0"/>
-          <w:numId w:val="2"/>
-        </w:numPr>
-        <w:spacing w:after="40"/>
-      </w:pPr>
-      <w:r>
-        <w:t xml:space="preserve">delete_old_backups removes backups older than RETENTION_DAYS.</w:t>
-      </w:r>
-    </w:p>
-    <w:p>
-      <w:pPr>
-        <w:pStyle w:val="ListParagraph"/>
-        <w:numPr>
-          <w:ilvl w:val="0"/>
-          <w:numId w:val="2"/>
-        </w:numPr>
-        <w:spacing w:after="40"/>
-      </w:pPr>
-      <w:r>
-        <w:t xml:space="preserve">Both take 'app' and use app.app_context() because they run on a background thread.</w:t>
+        <w:spacing w:after="40"/>
+        <w:ind w:left="600" w:hanging="320"/>
+      </w:pPr>
+      <w:r>
+        <w:t xml:space="preserve">1. create_backup copies the database file into the backups folder with a timestamped name.</w:t>
+      </w:r>
+    </w:p>
+    <w:p>
+      <w:pPr>
+        <w:spacing w:after="40"/>
+        <w:ind w:left="600" w:hanging="320"/>
+      </w:pPr>
+      <w:r>
+        <w:t xml:space="preserve">2. delete_old_backups removes backups older than RETENTION_DAYS.</w:t>
+      </w:r>
+    </w:p>
+    <w:p>
+      <w:pPr>
+        <w:spacing w:after="40"/>
+        <w:ind w:left="600" w:hanging="320"/>
+      </w:pPr>
+      <w:r>
+        <w:t xml:space="preserve">3. Both take 'app' and use app.app_context() because they run on a background thread.</w:t>
       </w:r>
     </w:p>
     <w:p>
@@ -2885,54 +2645,38 @@
     </w:p>
     <w:p>
       <w:pPr>
-        <w:pStyle w:val="ListParagraph"/>
-        <w:numPr>
-          <w:ilvl w:val="0"/>
-          <w:numId w:val="2"/>
-        </w:numPr>
-        <w:spacing w:after="40"/>
-      </w:pPr>
-      <w:r>
-        <w:t xml:space="preserve">Reads JSON, requires username + password.</w:t>
-      </w:r>
-    </w:p>
-    <w:p>
-      <w:pPr>
-        <w:pStyle w:val="ListParagraph"/>
-        <w:numPr>
-          <w:ilvl w:val="0"/>
-          <w:numId w:val="2"/>
-        </w:numPr>
-        <w:spacing w:after="40"/>
-      </w:pPr>
-      <w:r>
-        <w:t xml:space="preserve">Rejects duplicates.</w:t>
-      </w:r>
-    </w:p>
-    <w:p>
-      <w:pPr>
-        <w:pStyle w:val="ListParagraph"/>
-        <w:numPr>
-          <w:ilvl w:val="0"/>
-          <w:numId w:val="2"/>
-        </w:numPr>
-        <w:spacing w:after="40"/>
-      </w:pPr>
-      <w:r>
-        <w:t xml:space="preserve">Always creates a plain 'user' (admins are promoted later via the admin panel or DB).</w:t>
-      </w:r>
-    </w:p>
-    <w:p>
-      <w:pPr>
-        <w:pStyle w:val="ListParagraph"/>
-        <w:numPr>
-          <w:ilvl w:val="0"/>
-          <w:numId w:val="2"/>
-        </w:numPr>
-        <w:spacing w:after="40"/>
-      </w:pPr>
-      <w:r>
-        <w:t xml:space="preserve">Creates the user, hashes the password, commits, returns 201.</w:t>
+        <w:spacing w:after="40"/>
+        <w:ind w:left="600" w:hanging="320"/>
+      </w:pPr>
+      <w:r>
+        <w:t xml:space="preserve">1. Reads JSON, requires username + password.</w:t>
+      </w:r>
+    </w:p>
+    <w:p>
+      <w:pPr>
+        <w:spacing w:after="40"/>
+        <w:ind w:left="600" w:hanging="320"/>
+      </w:pPr>
+      <w:r>
+        <w:t xml:space="preserve">2. Rejects duplicates.</w:t>
+      </w:r>
+    </w:p>
+    <w:p>
+      <w:pPr>
+        <w:spacing w:after="40"/>
+        <w:ind w:left="600" w:hanging="320"/>
+      </w:pPr>
+      <w:r>
+        <w:t xml:space="preserve">3. Always creates a plain 'user' (admins are promoted later via the admin panel or DB).</w:t>
+      </w:r>
+    </w:p>
+    <w:p>
+      <w:pPr>
+        <w:spacing w:after="40"/>
+        <w:ind w:left="600" w:hanging="320"/>
+      </w:pPr>
+      <w:r>
+        <w:t xml:space="preserve">4. Creates the user, hashes the password, commits, returns 201.</w:t>
       </w:r>
     </w:p>
     <w:p>
@@ -3007,15 +2751,11 @@
     </w:p>
     <w:p>
       <w:pPr>
-        <w:pStyle w:val="ListParagraph"/>
-        <w:numPr>
-          <w:ilvl w:val="0"/>
-          <w:numId w:val="2"/>
-        </w:numPr>
-        <w:spacing w:after="40"/>
-      </w:pPr>
-      <w:r>
-        <w:t xml:space="preserve">A stripped-down JSON register with just username + password.</w:t>
+        <w:spacing w:after="40"/>
+        <w:ind w:left="600" w:hanging="320"/>
+      </w:pPr>
+      <w:r>
+        <w:t xml:space="preserve">1. A stripped-down JSON register with just username + password.</w:t>
       </w:r>
     </w:p>
     <w:p>
@@ -3090,28 +2830,20 @@
     </w:p>
     <w:p>
       <w:pPr>
-        <w:pStyle w:val="ListParagraph"/>
-        <w:numPr>
-          <w:ilvl w:val="0"/>
-          <w:numId w:val="2"/>
-        </w:numPr>
-        <w:spacing w:after="40"/>
-      </w:pPr>
-      <w:r>
-        <w:t xml:space="preserve">The GET shows the registration HTML page.</w:t>
-      </w:r>
-    </w:p>
-    <w:p>
-      <w:pPr>
-        <w:pStyle w:val="ListParagraph"/>
-        <w:numPr>
-          <w:ilvl w:val="0"/>
-          <w:numId w:val="2"/>
-        </w:numPr>
-        <w:spacing w:after="40"/>
-      </w:pPr>
-      <w:r>
-        <w:t xml:space="preserve">The POST validates the form (required fields, matching passwords, unique username) and creates the account, then shows login.</w:t>
+        <w:spacing w:after="40"/>
+        <w:ind w:left="600" w:hanging="320"/>
+      </w:pPr>
+      <w:r>
+        <w:t xml:space="preserve">1. The GET shows the registration HTML page.</w:t>
+      </w:r>
+    </w:p>
+    <w:p>
+      <w:pPr>
+        <w:spacing w:after="40"/>
+        <w:ind w:left="600" w:hanging="320"/>
+      </w:pPr>
+      <w:r>
+        <w:t xml:space="preserve">2. The POST validates the form (required fields, matching passwords, unique username) and creates the account, then shows login.</w:t>
       </w:r>
     </w:p>
     <w:p>
@@ -3194,54 +2926,38 @@
     </w:p>
     <w:p>
       <w:pPr>
-        <w:pStyle w:val="ListParagraph"/>
-        <w:numPr>
-          <w:ilvl w:val="0"/>
-          <w:numId w:val="2"/>
-        </w:numPr>
-        <w:spacing w:after="40"/>
-      </w:pPr>
-      <w:r>
-        <w:t xml:space="preserve">Looks up the user and checks the password.</w:t>
-      </w:r>
-    </w:p>
-    <w:p>
-      <w:pPr>
-        <w:pStyle w:val="ListParagraph"/>
-        <w:numPr>
-          <w:ilvl w:val="0"/>
-          <w:numId w:val="2"/>
-        </w:numPr>
-        <w:spacing w:after="40"/>
-      </w:pPr>
-      <w:r>
-        <w:t xml:space="preserve">On success, issues a signed bearer token and returns it with profile and VIP info.</w:t>
-      </w:r>
-    </w:p>
-    <w:p>
-      <w:pPr>
-        <w:pStyle w:val="ListParagraph"/>
-        <w:numPr>
-          <w:ilvl w:val="0"/>
-          <w:numId w:val="2"/>
-        </w:numPr>
-        <w:spacing w:after="40"/>
-      </w:pPr>
-      <w:r>
-        <w:t xml:space="preserve">On failure returns 401.</w:t>
-      </w:r>
-    </w:p>
-    <w:p>
-      <w:pPr>
-        <w:pStyle w:val="ListParagraph"/>
-        <w:numPr>
-          <w:ilvl w:val="0"/>
-          <w:numId w:val="2"/>
-        </w:numPr>
-        <w:spacing w:after="40"/>
-      </w:pPr>
-      <w:r>
-        <w:t xml:space="preserve">Rate-limited.</w:t>
+        <w:spacing w:after="40"/>
+        <w:ind w:left="600" w:hanging="320"/>
+      </w:pPr>
+      <w:r>
+        <w:t xml:space="preserve">1. Looks up the user and checks the password.</w:t>
+      </w:r>
+    </w:p>
+    <w:p>
+      <w:pPr>
+        <w:spacing w:after="40"/>
+        <w:ind w:left="600" w:hanging="320"/>
+      </w:pPr>
+      <w:r>
+        <w:t xml:space="preserve">2. On success, issues a signed bearer token and returns it with profile and VIP info.</w:t>
+      </w:r>
+    </w:p>
+    <w:p>
+      <w:pPr>
+        <w:spacing w:after="40"/>
+        <w:ind w:left="600" w:hanging="320"/>
+      </w:pPr>
+      <w:r>
+        <w:t xml:space="preserve">3. On failure returns 401.</w:t>
+      </w:r>
+    </w:p>
+    <w:p>
+      <w:pPr>
+        <w:spacing w:after="40"/>
+        <w:ind w:left="600" w:hanging="320"/>
+      </w:pPr>
+      <w:r>
+        <w:t xml:space="preserve">4. Rate-limited.</w:t>
       </w:r>
     </w:p>
     <w:p>
@@ -3316,41 +3032,29 @@
     </w:p>
     <w:p>
       <w:pPr>
-        <w:pStyle w:val="ListParagraph"/>
-        <w:numPr>
-          <w:ilvl w:val="0"/>
-          <w:numId w:val="2"/>
-        </w:numPr>
-        <w:spacing w:after="40"/>
-      </w:pPr>
-      <w:r>
-        <w:t xml:space="preserve">The GET shows the login page (or redirects in if already logged in).</w:t>
-      </w:r>
-    </w:p>
-    <w:p>
-      <w:pPr>
-        <w:pStyle w:val="ListParagraph"/>
-        <w:numPr>
-          <w:ilvl w:val="0"/>
-          <w:numId w:val="2"/>
-        </w:numPr>
-        <w:spacing w:after="40"/>
-      </w:pPr>
-      <w:r>
-        <w:t xml:space="preserve">The POST verifies credentials and stores user_id in the session cookie.</w:t>
-      </w:r>
-    </w:p>
-    <w:p>
-      <w:pPr>
-        <w:pStyle w:val="ListParagraph"/>
-        <w:numPr>
-          <w:ilvl w:val="0"/>
-          <w:numId w:val="2"/>
-        </w:numPr>
-        <w:spacing w:after="40"/>
-      </w:pPr>
-      <w:r>
-        <w:t xml:space="preserve">Rate-limited.</w:t>
+        <w:spacing w:after="40"/>
+        <w:ind w:left="600" w:hanging="320"/>
+      </w:pPr>
+      <w:r>
+        <w:t xml:space="preserve">1. The GET shows the login page (or redirects in if already logged in).</w:t>
+      </w:r>
+    </w:p>
+    <w:p>
+      <w:pPr>
+        <w:spacing w:after="40"/>
+        <w:ind w:left="600" w:hanging="320"/>
+      </w:pPr>
+      <w:r>
+        <w:t xml:space="preserve">2. The POST verifies credentials and stores user_id in the session cookie.</w:t>
+      </w:r>
+    </w:p>
+    <w:p>
+      <w:pPr>
+        <w:spacing w:after="40"/>
+        <w:ind w:left="600" w:hanging="320"/>
+      </w:pPr>
+      <w:r>
+        <w:t xml:space="preserve">3. Rate-limited.</w:t>
       </w:r>
     </w:p>
     <w:p>
@@ -3425,15 +3129,11 @@
     </w:p>
     <w:p>
       <w:pPr>
-        <w:pStyle w:val="ListParagraph"/>
-        <w:numPr>
-          <w:ilvl w:val="0"/>
-          <w:numId w:val="2"/>
-        </w:numPr>
-        <w:spacing w:after="40"/>
-      </w:pPr>
-      <w:r>
-        <w:t xml:space="preserve">Clears the whole session and redirects to login.</w:t>
+        <w:spacing w:after="40"/>
+        <w:ind w:left="600" w:hanging="320"/>
+      </w:pPr>
+      <w:r>
+        <w:t xml:space="preserve">1. Clears the whole session and redirects to login.</w:t>
       </w:r>
     </w:p>
     <w:p>
@@ -3516,54 +3216,38 @@
     </w:p>
     <w:p>
       <w:pPr>
-        <w:pStyle w:val="ListParagraph"/>
-        <w:numPr>
-          <w:ilvl w:val="0"/>
-          <w:numId w:val="2"/>
-        </w:numPr>
-        <w:spacing w:after="40"/>
-      </w:pPr>
-      <w:r>
-        <w:t xml:space="preserve">GET shows the form; POST looks up the user.</w:t>
-      </w:r>
-    </w:p>
-    <w:p>
-      <w:pPr>
-        <w:pStyle w:val="ListParagraph"/>
-        <w:numPr>
-          <w:ilvl w:val="0"/>
-          <w:numId w:val="2"/>
-        </w:numPr>
-        <w:spacing w:after="40"/>
-      </w:pPr>
-      <w:r>
-        <w:t xml:space="preserve">If found, builds a time-limited reset link and logs it (a hook for sending email later).</w:t>
-      </w:r>
-    </w:p>
-    <w:p>
-      <w:pPr>
-        <w:pStyle w:val="ListParagraph"/>
-        <w:numPr>
-          <w:ilvl w:val="0"/>
-          <w:numId w:val="2"/>
-        </w:numPr>
-        <w:spacing w:after="40"/>
-      </w:pPr>
-      <w:r>
-        <w:t xml:space="preserve">Always shows the same confirmation, whether or not the account exists.</w:t>
-      </w:r>
-    </w:p>
-    <w:p>
-      <w:pPr>
-        <w:pStyle w:val="ListParagraph"/>
-        <w:numPr>
-          <w:ilvl w:val="0"/>
-          <w:numId w:val="2"/>
-        </w:numPr>
-        <w:spacing w:after="40"/>
-      </w:pPr>
-      <w:r>
-        <w:t xml:space="preserve">Rate-limited.</w:t>
+        <w:spacing w:after="40"/>
+        <w:ind w:left="600" w:hanging="320"/>
+      </w:pPr>
+      <w:r>
+        <w:t xml:space="preserve">1. GET shows the form; POST looks up the user.</w:t>
+      </w:r>
+    </w:p>
+    <w:p>
+      <w:pPr>
+        <w:spacing w:after="40"/>
+        <w:ind w:left="600" w:hanging="320"/>
+      </w:pPr>
+      <w:r>
+        <w:t xml:space="preserve">2. If found, builds a time-limited reset link and logs it (a hook for sending email later).</w:t>
+      </w:r>
+    </w:p>
+    <w:p>
+      <w:pPr>
+        <w:spacing w:after="40"/>
+        <w:ind w:left="600" w:hanging="320"/>
+      </w:pPr>
+      <w:r>
+        <w:t xml:space="preserve">3. Always shows the same confirmation, whether or not the account exists.</w:t>
+      </w:r>
+    </w:p>
+    <w:p>
+      <w:pPr>
+        <w:spacing w:after="40"/>
+        <w:ind w:left="600" w:hanging="320"/>
+      </w:pPr>
+      <w:r>
+        <w:t xml:space="preserve">4. Rate-limited.</w:t>
       </w:r>
     </w:p>
     <w:p>
@@ -3638,41 +3322,29 @@
     </w:p>
     <w:p>
       <w:pPr>
-        <w:pStyle w:val="ListParagraph"/>
-        <w:numPr>
-          <w:ilvl w:val="0"/>
-          <w:numId w:val="2"/>
-        </w:numPr>
-        <w:spacing w:after="40"/>
-      </w:pPr>
-      <w:r>
-        <w:t xml:space="preserve">Verifies the token (signature + age).</w:t>
-      </w:r>
-    </w:p>
-    <w:p>
-      <w:pPr>
-        <w:pStyle w:val="ListParagraph"/>
-        <w:numPr>
-          <w:ilvl w:val="0"/>
-          <w:numId w:val="2"/>
-        </w:numPr>
-        <w:spacing w:after="40"/>
-      </w:pPr>
-      <w:r>
-        <w:t xml:space="preserve">On POST with matching passwords, sets the new password and commits.</w:t>
-      </w:r>
-    </w:p>
-    <w:p>
-      <w:pPr>
-        <w:pStyle w:val="ListParagraph"/>
-        <w:numPr>
-          <w:ilvl w:val="0"/>
-          <w:numId w:val="2"/>
-        </w:numPr>
-        <w:spacing w:after="40"/>
-      </w:pPr>
-      <w:r>
-        <w:t xml:space="preserve">Invalid/expired tokens show an error with a link to try again.</w:t>
+        <w:spacing w:after="40"/>
+        <w:ind w:left="600" w:hanging="320"/>
+      </w:pPr>
+      <w:r>
+        <w:t xml:space="preserve">1. Verifies the token (signature + age).</w:t>
+      </w:r>
+    </w:p>
+    <w:p>
+      <w:pPr>
+        <w:spacing w:after="40"/>
+        <w:ind w:left="600" w:hanging="320"/>
+      </w:pPr>
+      <w:r>
+        <w:t xml:space="preserve">2. On POST with matching passwords, sets the new password and commits.</w:t>
+      </w:r>
+    </w:p>
+    <w:p>
+      <w:pPr>
+        <w:spacing w:after="40"/>
+        <w:ind w:left="600" w:hanging="320"/>
+      </w:pPr>
+      <w:r>
+        <w:t xml:space="preserve">3. Invalid/expired tokens show an error with a link to try again.</w:t>
       </w:r>
     </w:p>
     <w:p>
@@ -3747,41 +3419,29 @@
     </w:p>
     <w:p>
       <w:pPr>
-        <w:pStyle w:val="ListParagraph"/>
-        <w:numPr>
-          <w:ilvl w:val="0"/>
-          <w:numId w:val="2"/>
-        </w:numPr>
-        <w:spacing w:after="40"/>
-      </w:pPr>
-      <w:r>
-        <w:t xml:space="preserve">For an already-logged-in user.</w:t>
-      </w:r>
-    </w:p>
-    <w:p>
-      <w:pPr>
-        <w:pStyle w:val="ListParagraph"/>
-        <w:numPr>
-          <w:ilvl w:val="0"/>
-          <w:numId w:val="2"/>
-        </w:numPr>
-        <w:spacing w:after="40"/>
-      </w:pPr>
-      <w:r>
-        <w:t xml:space="preserve">Verifies the current password, checks the two new entries match, updates it.</w:t>
-      </w:r>
-    </w:p>
-    <w:p>
-      <w:pPr>
-        <w:pStyle w:val="ListParagraph"/>
-        <w:numPr>
-          <w:ilvl w:val="0"/>
-          <w:numId w:val="2"/>
-        </w:numPr>
-        <w:spacing w:after="40"/>
-      </w:pPr>
-      <w:r>
-        <w:t xml:space="preserve">CSRF-protected form; linked from the personal page.</w:t>
+        <w:spacing w:after="40"/>
+        <w:ind w:left="600" w:hanging="320"/>
+      </w:pPr>
+      <w:r>
+        <w:t xml:space="preserve">1. For an already-logged-in user.</w:t>
+      </w:r>
+    </w:p>
+    <w:p>
+      <w:pPr>
+        <w:spacing w:after="40"/>
+        <w:ind w:left="600" w:hanging="320"/>
+      </w:pPr>
+      <w:r>
+        <w:t xml:space="preserve">2. Verifies the current password, checks the two new entries match, updates it.</w:t>
+      </w:r>
+    </w:p>
+    <w:p>
+      <w:pPr>
+        <w:spacing w:after="40"/>
+        <w:ind w:left="600" w:hanging="320"/>
+      </w:pPr>
+      <w:r>
+        <w:t xml:space="preserve">3. CSRF-protected form; linked from the personal page.</w:t>
       </w:r>
     </w:p>
     <w:p>
@@ -3864,15 +3524,11 @@
     </w:p>
     <w:p>
       <w:pPr>
-        <w:pStyle w:val="ListParagraph"/>
-        <w:numPr>
-          <w:ilvl w:val="0"/>
-          <w:numId w:val="2"/>
-        </w:numPr>
-        <w:spacing w:after="40"/>
-      </w:pPr>
-      <w:r>
-        <w:t xml:space="preserve">Finds the user by username and updates generic profile fields only.</w:t>
+        <w:spacing w:after="40"/>
+        <w:ind w:left="600" w:hanging="320"/>
+      </w:pPr>
+      <w:r>
+        <w:t xml:space="preserve">1. Finds the user by username and updates generic profile fields only.</w:t>
       </w:r>
     </w:p>
     <w:p>
@@ -3955,41 +3611,29 @@
     </w:p>
     <w:p>
       <w:pPr>
-        <w:pStyle w:val="ListParagraph"/>
-        <w:numPr>
-          <w:ilvl w:val="0"/>
-          <w:numId w:val="2"/>
-        </w:numPr>
-        <w:spacing w:after="40"/>
-      </w:pPr>
-      <w:r>
-        <w:t xml:space="preserve">Calls the reusable create_ecpay_order helper with the VIP item + price.</w:t>
-      </w:r>
-    </w:p>
-    <w:p>
-      <w:pPr>
-        <w:pStyle w:val="ListParagraph"/>
-        <w:numPr>
-          <w:ilvl w:val="0"/>
-          <w:numId w:val="2"/>
-        </w:numPr>
-        <w:spacing w:after="40"/>
-      </w:pPr>
-      <w:r>
-        <w:t xml:space="preserve">Asks the ECPay SDK to sign the order (CheckMacValue).</w:t>
-      </w:r>
-    </w:p>
-    <w:p>
-      <w:pPr>
-        <w:pStyle w:val="ListParagraph"/>
-        <w:numPr>
-          <w:ilvl w:val="0"/>
-          <w:numId w:val="2"/>
-        </w:numPr>
-        <w:spacing w:after="40"/>
-      </w:pPr>
-      <w:r>
-        <w:t xml:space="preserve">Renders a page that auto-submits the signed form to ECPay's payment page.</w:t>
+        <w:spacing w:after="40"/>
+        <w:ind w:left="600" w:hanging="320"/>
+      </w:pPr>
+      <w:r>
+        <w:t xml:space="preserve">1. Calls the reusable create_ecpay_order helper with the VIP item + price.</w:t>
+      </w:r>
+    </w:p>
+    <w:p>
+      <w:pPr>
+        <w:spacing w:after="40"/>
+        <w:ind w:left="600" w:hanging="320"/>
+      </w:pPr>
+      <w:r>
+        <w:t xml:space="preserve">2. Asks the ECPay SDK to sign the order (CheckMacValue).</w:t>
+      </w:r>
+    </w:p>
+    <w:p>
+      <w:pPr>
+        <w:spacing w:after="40"/>
+        <w:ind w:left="600" w:hanging="320"/>
+      </w:pPr>
+      <w:r>
+        <w:t xml:space="preserve">3. Renders a page that auto-submits the signed form to ECPay's payment page.</w:t>
       </w:r>
     </w:p>
     <w:p>
@@ -4064,54 +3708,38 @@
     </w:p>
     <w:p>
       <w:pPr>
-        <w:pStyle w:val="ListParagraph"/>
-        <w:numPr>
-          <w:ilvl w:val="0"/>
-          <w:numId w:val="2"/>
-        </w:numPr>
-        <w:spacing w:after="40"/>
-      </w:pPr>
-      <w:r>
-        <w:t xml:space="preserve">Receives ECPay's server-to-server callback.</w:t>
-      </w:r>
-    </w:p>
-    <w:p>
-      <w:pPr>
-        <w:pStyle w:val="ListParagraph"/>
-        <w:numPr>
-          <w:ilvl w:val="0"/>
-          <w:numId w:val="2"/>
-        </w:numPr>
-        <w:spacing w:after="40"/>
-      </w:pPr>
-      <w:r>
-        <w:t xml:space="preserve">Recomputes the signature and compares it to the one ECPay sent.</w:t>
-      </w:r>
-    </w:p>
-    <w:p>
-      <w:pPr>
-        <w:pStyle w:val="ListParagraph"/>
-        <w:numPr>
-          <w:ilvl w:val="0"/>
-          <w:numId w:val="2"/>
-        </w:numPr>
-        <w:spacing w:after="40"/>
-      </w:pPr>
-      <w:r>
-        <w:t xml:space="preserve">If valid and paid, sets is_vip and an expiry date, writes a PaymentLog, and replies '1|OK'.</w:t>
-      </w:r>
-    </w:p>
-    <w:p>
-      <w:pPr>
-        <w:pStyle w:val="ListParagraph"/>
-        <w:numPr>
-          <w:ilvl w:val="0"/>
-          <w:numId w:val="2"/>
-        </w:numPr>
-        <w:spacing w:after="40"/>
-      </w:pPr>
-      <w:r>
-        <w:t xml:space="preserve">CSRF-exempt (it is a machine call, not a browser form).</w:t>
+        <w:spacing w:after="40"/>
+        <w:ind w:left="600" w:hanging="320"/>
+      </w:pPr>
+      <w:r>
+        <w:t xml:space="preserve">1. Receives ECPay's server-to-server callback.</w:t>
+      </w:r>
+    </w:p>
+    <w:p>
+      <w:pPr>
+        <w:spacing w:after="40"/>
+        <w:ind w:left="600" w:hanging="320"/>
+      </w:pPr>
+      <w:r>
+        <w:t xml:space="preserve">2. Recomputes the signature and compares it to the one ECPay sent.</w:t>
+      </w:r>
+    </w:p>
+    <w:p>
+      <w:pPr>
+        <w:spacing w:after="40"/>
+        <w:ind w:left="600" w:hanging="320"/>
+      </w:pPr>
+      <w:r>
+        <w:t xml:space="preserve">3. If valid and paid, sets is_vip and an expiry date, writes a PaymentLog, and replies '1|OK'.</w:t>
+      </w:r>
+    </w:p>
+    <w:p>
+      <w:pPr>
+        <w:spacing w:after="40"/>
+        <w:ind w:left="600" w:hanging="320"/>
+      </w:pPr>
+      <w:r>
+        <w:t xml:space="preserve">4. CSRF-exempt (it is a machine call, not a browser form).</w:t>
       </w:r>
     </w:p>
     <w:p>
@@ -4186,28 +3814,20 @@
     </w:p>
     <w:p>
       <w:pPr>
-        <w:pStyle w:val="ListParagraph"/>
-        <w:numPr>
-          <w:ilvl w:val="0"/>
-          <w:numId w:val="2"/>
-        </w:numPr>
-        <w:spacing w:after="40"/>
-      </w:pPr>
-      <w:r>
-        <w:t xml:space="preserve">The page the user's browser lands on after paying; shows order id and amount.</w:t>
-      </w:r>
-    </w:p>
-    <w:p>
-      <w:pPr>
-        <w:pStyle w:val="ListParagraph"/>
-        <w:numPr>
-          <w:ilvl w:val="0"/>
-          <w:numId w:val="2"/>
-        </w:numPr>
-        <w:spacing w:after="40"/>
-      </w:pPr>
-      <w:r>
-        <w:t xml:space="preserve">CSRF-exempt (ECPay posts to it).</w:t>
+        <w:spacing w:after="40"/>
+        <w:ind w:left="600" w:hanging="320"/>
+      </w:pPr>
+      <w:r>
+        <w:t xml:space="preserve">1. The page the user's browser lands on after paying; shows order id and amount.</w:t>
+      </w:r>
+    </w:p>
+    <w:p>
+      <w:pPr>
+        <w:spacing w:after="40"/>
+        <w:ind w:left="600" w:hanging="320"/>
+      </w:pPr>
+      <w:r>
+        <w:t xml:space="preserve">2. CSRF-exempt (ECPay posts to it).</w:t>
       </w:r>
     </w:p>
     <w:p>
@@ -4290,15 +3910,11 @@
     </w:p>
     <w:p>
       <w:pPr>
-        <w:pStyle w:val="ListParagraph"/>
-        <w:numPr>
-          <w:ilvl w:val="0"/>
-          <w:numId w:val="2"/>
-        </w:numPr>
-        <w:spacing w:after="40"/>
-      </w:pPr>
-      <w:r>
-        <w:t xml:space="preserve">Admin-only endpoints to turn a chosen user's VIP on (with expiry) or off.</w:t>
+        <w:spacing w:after="40"/>
+        <w:ind w:left="600" w:hanging="320"/>
+      </w:pPr>
+      <w:r>
+        <w:t xml:space="preserve">1. Admin-only endpoints to turn a chosen user's VIP on (with expiry) or off.</w:t>
       </w:r>
     </w:p>
     <w:p>
@@ -4381,15 +3997,11 @@
     </w:p>
     <w:p>
       <w:pPr>
-        <w:pStyle w:val="ListParagraph"/>
-        <w:numPr>
-          <w:ilvl w:val="0"/>
-          <w:numId w:val="2"/>
-        </w:numPr>
-        <w:spacing w:after="40"/>
-      </w:pPr>
-      <w:r>
-        <w:t xml:space="preserve">Lists accounts, optionally filtered by a search keyword.</w:t>
+        <w:spacing w:after="40"/>
+        <w:ind w:left="600" w:hanging="320"/>
+      </w:pPr>
+      <w:r>
+        <w:t xml:space="preserve">1. Lists accounts, optionally filtered by a search keyword.</w:t>
       </w:r>
     </w:p>
     <w:p>
@@ -4464,54 +4076,38 @@
     </w:p>
     <w:p>
       <w:pPr>
-        <w:pStyle w:val="ListParagraph"/>
-        <w:numPr>
-          <w:ilvl w:val="0"/>
-          <w:numId w:val="2"/>
-        </w:numPr>
-        <w:spacing w:after="40"/>
-      </w:pPr>
-      <w:r>
-        <w:t xml:space="preserve">create: add a new account.</w:t>
-      </w:r>
-    </w:p>
-    <w:p>
-      <w:pPr>
-        <w:pStyle w:val="ListParagraph"/>
-        <w:numPr>
-          <w:ilvl w:val="0"/>
-          <w:numId w:val="2"/>
-        </w:numPr>
-        <w:spacing w:after="40"/>
-      </w:pPr>
-      <w:r>
-        <w:t xml:space="preserve">edit: change role, email, phone, and optionally reset the password (only a superadmin may set/modify admin or superadmin accounts).</w:t>
-      </w:r>
-    </w:p>
-    <w:p>
-      <w:pPr>
-        <w:pStyle w:val="ListParagraph"/>
-        <w:numPr>
-          <w:ilvl w:val="0"/>
-          <w:numId w:val="2"/>
-        </w:numPr>
-        <w:spacing w:after="40"/>
-      </w:pPr>
-      <w:r>
-        <w:t xml:space="preserve">update_binding: link an account to a product/device id.</w:t>
-      </w:r>
-    </w:p>
-    <w:p>
-      <w:pPr>
-        <w:pStyle w:val="ListParagraph"/>
-        <w:numPr>
-          <w:ilvl w:val="0"/>
-          <w:numId w:val="2"/>
-        </w:numPr>
-        <w:spacing w:after="40"/>
-      </w:pPr>
-      <w:r>
-        <w:t xml:space="preserve">delete: remove an account (but you cannot delete yourself).</w:t>
+        <w:spacing w:after="40"/>
+        <w:ind w:left="600" w:hanging="320"/>
+      </w:pPr>
+      <w:r>
+        <w:t xml:space="preserve">1. create: add a new account.</w:t>
+      </w:r>
+    </w:p>
+    <w:p>
+      <w:pPr>
+        <w:spacing w:after="40"/>
+        <w:ind w:left="600" w:hanging="320"/>
+      </w:pPr>
+      <w:r>
+        <w:t xml:space="preserve">2. edit: change role, email, phone, and optionally reset the password (only a superadmin may set/modify admin or superadmin accounts).</w:t>
+      </w:r>
+    </w:p>
+    <w:p>
+      <w:pPr>
+        <w:spacing w:after="40"/>
+        <w:ind w:left="600" w:hanging="320"/>
+      </w:pPr>
+      <w:r>
+        <w:t xml:space="preserve">3. update_binding: link an account to a product/device id.</w:t>
+      </w:r>
+    </w:p>
+    <w:p>
+      <w:pPr>
+        <w:spacing w:after="40"/>
+        <w:ind w:left="600" w:hanging="320"/>
+      </w:pPr>
+      <w:r>
+        <w:t xml:space="preserve">4. delete: remove an account (but you cannot delete yourself).</w:t>
       </w:r>
     </w:p>
     <w:p>
@@ -4594,15 +4190,11 @@
     </w:p>
     <w:p>
       <w:pPr>
-        <w:pStyle w:val="ListParagraph"/>
-        <w:numPr>
-          <w:ilvl w:val="0"/>
-          <w:numId w:val="2"/>
-        </w:numPr>
-        <w:spacing w:after="40"/>
-      </w:pPr>
-      <w:r>
-        <w:t xml:space="preserve">The home route simply redirects logged-in users to the people list.</w:t>
+        <w:spacing w:after="40"/>
+        <w:ind w:left="600" w:hanging="320"/>
+      </w:pPr>
+      <w:r>
+        <w:t xml:space="preserve">1. The home route simply redirects logged-in users to the people list.</w:t>
       </w:r>
     </w:p>
     <w:p>
@@ -4677,41 +4269,29 @@
     </w:p>
     <w:p>
       <w:pPr>
-        <w:pStyle w:val="ListParagraph"/>
-        <w:numPr>
-          <w:ilvl w:val="0"/>
-          <w:numId w:val="2"/>
-        </w:numPr>
-        <w:spacing w:after="40"/>
-      </w:pPr>
-      <w:r>
-        <w:t xml:space="preserve">Loads the logged-in user.</w:t>
-      </w:r>
-    </w:p>
-    <w:p>
-      <w:pPr>
-        <w:pStyle w:val="ListParagraph"/>
-        <w:numPr>
-          <w:ilvl w:val="0"/>
-          <w:numId w:val="2"/>
-        </w:numPr>
-        <w:spacing w:after="40"/>
-      </w:pPr>
-      <w:r>
-        <w:t xml:space="preserve">Auto-expires VIP if past the expiry date.</w:t>
-      </w:r>
-    </w:p>
-    <w:p>
-      <w:pPr>
-        <w:pStyle w:val="ListParagraph"/>
-        <w:numPr>
-          <w:ilvl w:val="0"/>
-          <w:numId w:val="2"/>
-        </w:numPr>
-        <w:spacing w:after="40"/>
-      </w:pPr>
-      <w:r>
-        <w:t xml:space="preserve">For non-admins, loads that person's own data records to display.</w:t>
+        <w:spacing w:after="40"/>
+        <w:ind w:left="600" w:hanging="320"/>
+      </w:pPr>
+      <w:r>
+        <w:t xml:space="preserve">1. Loads the logged-in user.</w:t>
+      </w:r>
+    </w:p>
+    <w:p>
+      <w:pPr>
+        <w:spacing w:after="40"/>
+        <w:ind w:left="600" w:hanging="320"/>
+      </w:pPr>
+      <w:r>
+        <w:t xml:space="preserve">2. Auto-expires VIP if past the expiry date.</w:t>
+      </w:r>
+    </w:p>
+    <w:p>
+      <w:pPr>
+        <w:spacing w:after="40"/>
+        <w:ind w:left="600" w:hanging="320"/>
+      </w:pPr>
+      <w:r>
+        <w:t xml:space="preserve">3. For non-admins, loads that person's own data records to display.</w:t>
       </w:r>
     </w:p>
     <w:p>
@@ -4786,28 +4366,20 @@
     </w:p>
     <w:p>
       <w:pPr>
-        <w:pStyle w:val="ListParagraph"/>
-        <w:numPr>
-          <w:ilvl w:val="0"/>
-          <w:numId w:val="2"/>
-        </w:numPr>
-        <w:spacing w:after="40"/>
-      </w:pPr>
-      <w:r>
-        <w:t xml:space="preserve">Builds the query, then narrows it by role: ordinary users see only themselves; admins and superadmins see all.</w:t>
-      </w:r>
-    </w:p>
-    <w:p>
-      <w:pPr>
-        <w:pStyle w:val="ListParagraph"/>
-        <w:numPr>
-          <w:ilvl w:val="0"/>
-          <w:numId w:val="2"/>
-        </w:numPr>
-        <w:spacing w:after="40"/>
-      </w:pPr>
-      <w:r>
-        <w:t xml:space="preserve">Applies the search term and paginates (50 per page).</w:t>
+        <w:spacing w:after="40"/>
+        <w:ind w:left="600" w:hanging="320"/>
+      </w:pPr>
+      <w:r>
+        <w:t xml:space="preserve">1. Builds the query, then narrows it by role: ordinary users see only themselves; admins and superadmins see all.</w:t>
+      </w:r>
+    </w:p>
+    <w:p>
+      <w:pPr>
+        <w:spacing w:after="40"/>
+        <w:ind w:left="600" w:hanging="320"/>
+      </w:pPr>
+      <w:r>
+        <w:t xml:space="preserve">2. Applies the search term and paginates (50 per page).</w:t>
       </w:r>
     </w:p>
     <w:p>
@@ -4882,15 +4454,11 @@
     </w:p>
     <w:p>
       <w:pPr>
-        <w:pStyle w:val="ListParagraph"/>
-        <w:numPr>
-          <w:ilvl w:val="0"/>
-          <w:numId w:val="2"/>
-        </w:numPr>
-        <w:spacing w:after="40"/>
-      </w:pPr>
-      <w:r>
-        <w:t xml:space="preserve">Finds the person, loads their records newest-first, converts timestamps to local time, and renders them as formatted JSON.</w:t>
+        <w:spacing w:after="40"/>
+        <w:ind w:left="600" w:hanging="320"/>
+      </w:pPr>
+      <w:r>
+        <w:t xml:space="preserve">1. Finds the person, loads their records newest-first, converts timestamps to local time, and renders them as formatted JSON.</w:t>
       </w:r>
     </w:p>
     <w:p>
@@ -4965,15 +4533,11 @@
     </w:p>
     <w:p>
       <w:pPr>
-        <w:pStyle w:val="ListParagraph"/>
-        <w:numPr>
-          <w:ilvl w:val="0"/>
-          <w:numId w:val="2"/>
-        </w:numPr>
-        <w:spacing w:after="40"/>
-      </w:pPr>
-      <w:r>
-        <w:t xml:space="preserve">Deletes the person's data records, then the person, in one transaction.</w:t>
+        <w:spacing w:after="40"/>
+        <w:ind w:left="600" w:hanging="320"/>
+      </w:pPr>
+      <w:r>
+        <w:t xml:space="preserve">1. Deletes the person's data records, then the person, in one transaction.</w:t>
       </w:r>
     </w:p>
     <w:p>
@@ -5056,54 +4620,38 @@
     </w:p>
     <w:p>
       <w:pPr>
-        <w:pStyle w:val="ListParagraph"/>
-        <w:numPr>
-          <w:ilvl w:val="0"/>
-          <w:numId w:val="2"/>
-        </w:numPr>
-        <w:spacing w:after="40"/>
-      </w:pPr>
-      <w:r>
-        <w:t xml:space="preserve">Requires a valid API key or bearer token (and is rate-limited).</w:t>
-      </w:r>
-    </w:p>
-    <w:p>
-      <w:pPr>
-        <w:pStyle w:val="ListParagraph"/>
-        <w:numPr>
-          <w:ilvl w:val="0"/>
-          <w:numId w:val="2"/>
-        </w:numPr>
-        <w:spacing w:after="40"/>
-      </w:pPr>
-      <w:r>
-        <w:t xml:space="preserve">Reads the JSON body and requires userInfo.userID and userInfo.name.</w:t>
-      </w:r>
-    </w:p>
-    <w:p>
-      <w:pPr>
-        <w:pStyle w:val="ListParagraph"/>
-        <w:numPr>
-          <w:ilvl w:val="0"/>
-          <w:numId w:val="2"/>
-        </w:numPr>
-        <w:spacing w:after="40"/>
-      </w:pPr>
-      <w:r>
-        <w:t xml:space="preserve">Creates or updates the person (upsert), then appends a new record whose 'data' is the generic payload.</w:t>
-      </w:r>
-    </w:p>
-    <w:p>
-      <w:pPr>
-        <w:pStyle w:val="ListParagraph"/>
-        <w:numPr>
-          <w:ilvl w:val="0"/>
-          <w:numId w:val="2"/>
-        </w:numPr>
-        <w:spacing w:after="40"/>
-      </w:pPr>
-      <w:r>
-        <w:t xml:space="preserve">Commits, or rolls back and returns an error.</w:t>
+        <w:spacing w:after="40"/>
+        <w:ind w:left="600" w:hanging="320"/>
+      </w:pPr>
+      <w:r>
+        <w:t xml:space="preserve">1. Requires a valid API key or bearer token (and is rate-limited).</w:t>
+      </w:r>
+    </w:p>
+    <w:p>
+      <w:pPr>
+        <w:spacing w:after="40"/>
+        <w:ind w:left="600" w:hanging="320"/>
+      </w:pPr>
+      <w:r>
+        <w:t xml:space="preserve">2. Reads the JSON body and requires userInfo.userID and userInfo.name.</w:t>
+      </w:r>
+    </w:p>
+    <w:p>
+      <w:pPr>
+        <w:spacing w:after="40"/>
+        <w:ind w:left="600" w:hanging="320"/>
+      </w:pPr>
+      <w:r>
+        <w:t xml:space="preserve">3. Creates or updates the person (upsert), then appends a new record whose 'data' is the generic payload.</w:t>
+      </w:r>
+    </w:p>
+    <w:p>
+      <w:pPr>
+        <w:spacing w:after="40"/>
+        <w:ind w:left="600" w:hanging="320"/>
+      </w:pPr>
+      <w:r>
+        <w:t xml:space="preserve">4. Commits, or rolls back and returns an error.</w:t>
       </w:r>
     </w:p>
     <w:p>
@@ -5178,15 +4726,11 @@
     </w:p>
     <w:p>
       <w:pPr>
-        <w:pStyle w:val="ListParagraph"/>
-        <w:numPr>
-          <w:ilvl w:val="0"/>
-          <w:numId w:val="2"/>
-        </w:numPr>
-        <w:spacing w:after="40"/>
-      </w:pPr>
-      <w:r>
-        <w:t xml:space="preserve">Requires API auth and returns the 100 most recent records as JSON.</w:t>
+        <w:spacing w:after="40"/>
+        <w:ind w:left="600" w:hanging="320"/>
+      </w:pPr>
+      <w:r>
+        <w:t xml:space="preserve">1. Requires API auth and returns the 100 most recent records as JSON.</w:t>
       </w:r>
     </w:p>
     <w:p>
@@ -5282,28 +4826,20 @@
     </w:p>
     <w:p>
       <w:pPr>
-        <w:pStyle w:val="ListParagraph"/>
-        <w:numPr>
-          <w:ilvl w:val="0"/>
-          <w:numId w:val="2"/>
-        </w:numPr>
-        <w:spacing w:after="40"/>
-      </w:pPr>
-      <w:r>
-        <w:t xml:space="preserve">Returns the (userID, name) pair an account owns.</w:t>
-      </w:r>
-    </w:p>
-    <w:p>
-      <w:pPr>
-        <w:pStyle w:val="ListParagraph"/>
-        <w:numPr>
-          <w:ilvl w:val="0"/>
-          <w:numId w:val="2"/>
-        </w:numPr>
-        <w:spacing w:after="40"/>
-      </w:pPr>
-      <w:r>
-        <w:t xml:space="preserve">Keyed on the unique username taken from the verified TOKEN - never on values from the request body.</w:t>
+        <w:spacing w:after="40"/>
+        <w:ind w:left="600" w:hanging="320"/>
+      </w:pPr>
+      <w:r>
+        <w:t xml:space="preserve">1. Returns the (userID, name) pair an account owns.</w:t>
+      </w:r>
+    </w:p>
+    <w:p>
+      <w:pPr>
+        <w:spacing w:after="40"/>
+        <w:ind w:left="600" w:hanging="320"/>
+      </w:pPr>
+      <w:r>
+        <w:t xml:space="preserve">2. Keyed on the unique username taken from the verified TOKEN - never on values from the request body.</w:t>
       </w:r>
     </w:p>
     <w:p>
@@ -5378,54 +4914,38 @@
     </w:p>
     <w:p>
       <w:pPr>
-        <w:pStyle w:val="ListParagraph"/>
-        <w:numPr>
-          <w:ilvl w:val="0"/>
-          <w:numId w:val="2"/>
-        </w:numPr>
-        <w:spacing w:after="40"/>
-      </w:pPr>
-      <w:r>
-        <w:t xml:space="preserve">register_account creates a plain 'user' from a JSON payload, honoring the config-gated</w:t>
-      </w:r>
-    </w:p>
-    <w:p>
-      <w:pPr>
-        <w:pStyle w:val="ListParagraph"/>
-        <w:numPr>
-          <w:ilvl w:val="0"/>
-          <w:numId w:val="2"/>
-        </w:numPr>
-        <w:spacing w:after="40"/>
-      </w:pPr>
-      <w:r>
-        <w:t xml:space="preserve">optional fields (email/phone/address/birthday) and a minimum password length;</w:t>
-      </w:r>
-    </w:p>
-    <w:p>
-      <w:pPr>
-        <w:pStyle w:val="ListParagraph"/>
-        <w:numPr>
-          <w:ilvl w:val="0"/>
-          <w:numId w:val="2"/>
-        </w:numPr>
-        <w:spacing w:after="40"/>
-      </w:pPr>
-      <w:r>
-        <w:t xml:space="preserve">it IGNORES any client-supplied role/linked_userid (admin-only bindings).</w:t>
-      </w:r>
-    </w:p>
-    <w:p>
-      <w:pPr>
-        <w:pStyle w:val="ListParagraph"/>
-        <w:numPr>
-          <w:ilvl w:val="0"/>
-          <w:numId w:val="2"/>
-        </w:numPr>
-        <w:spacing w:after="40"/>
-      </w:pPr>
-      <w:r>
-        <w:t xml:space="preserve">issue_login returns the login JSON incl. a bearer token carrying the password-stamp.</w:t>
+        <w:spacing w:after="40"/>
+        <w:ind w:left="600" w:hanging="320"/>
+      </w:pPr>
+      <w:r>
+        <w:t xml:space="preserve">1. register_account creates a plain 'user' from a JSON payload, honoring the config-gated</w:t>
+      </w:r>
+    </w:p>
+    <w:p>
+      <w:pPr>
+        <w:spacing w:after="40"/>
+        <w:ind w:left="600" w:hanging="320"/>
+      </w:pPr>
+      <w:r>
+        <w:t xml:space="preserve">2. optional fields (email/phone/address/birthday) and a minimum password length;</w:t>
+      </w:r>
+    </w:p>
+    <w:p>
+      <w:pPr>
+        <w:spacing w:after="40"/>
+        <w:ind w:left="600" w:hanging="320"/>
+      </w:pPr>
+      <w:r>
+        <w:t xml:space="preserve">3. it IGNORES any client-supplied role/linked_userid (admin-only bindings).</w:t>
+      </w:r>
+    </w:p>
+    <w:p>
+      <w:pPr>
+        <w:spacing w:after="40"/>
+        <w:ind w:left="600" w:hanging="320"/>
+      </w:pPr>
+      <w:r>
+        <w:t xml:space="preserve">4. issue_login returns the login JSON incl. a bearer token carrying the password-stamp.</w:t>
       </w:r>
     </w:p>
     <w:p>
@@ -5500,28 +5020,20 @@
     </w:p>
     <w:p>
       <w:pPr>
-        <w:pStyle w:val="ListParagraph"/>
-        <w:numPr>
-          <w:ilvl w:val="0"/>
-          <w:numId w:val="2"/>
-        </w:numPr>
-        <w:spacing w:after="40"/>
-      </w:pPr>
-      <w:r>
-        <w:t xml:space="preserve">register is rate-limited and csrf-exempt; calls register_account.</w:t>
-      </w:r>
-    </w:p>
-    <w:p>
-      <w:pPr>
-        <w:pStyle w:val="ListParagraph"/>
-        <w:numPr>
-          <w:ilvl w:val="0"/>
-          <w:numId w:val="2"/>
-        </w:numPr>
-        <w:spacing w:after="40"/>
-      </w:pPr>
-      <w:r>
-        <w:t xml:space="preserve">login verifies credentials and returns a bearer token via issue_login.</w:t>
+        <w:spacing w:after="40"/>
+        <w:ind w:left="600" w:hanging="320"/>
+      </w:pPr>
+      <w:r>
+        <w:t xml:space="preserve">1. register is rate-limited and csrf-exempt; calls register_account.</w:t>
+      </w:r>
+    </w:p>
+    <w:p>
+      <w:pPr>
+        <w:spacing w:after="40"/>
+        <w:ind w:left="600" w:hanging="320"/>
+      </w:pPr>
+      <w:r>
+        <w:t xml:space="preserve">2. login verifies credentials and returns a bearer token via issue_login.</w:t>
       </w:r>
     </w:p>
     <w:p>
@@ -5596,67 +5108,47 @@
     </w:p>
     <w:p>
       <w:pPr>
-        <w:pStyle w:val="ListParagraph"/>
-        <w:numPr>
-          <w:ilvl w:val="0"/>
-          <w:numId w:val="2"/>
-        </w:numPr>
-        <w:spacing w:after="40"/>
-      </w:pPr>
-      <w:r>
-        <w:t xml:space="preserve">/me returns the account profile.</w:t>
-      </w:r>
-    </w:p>
-    <w:p>
-      <w:pPr>
-        <w:pStyle w:val="ListParagraph"/>
-        <w:numPr>
-          <w:ilvl w:val="0"/>
-          <w:numId w:val="2"/>
-        </w:numPr>
-        <w:spacing w:after="40"/>
-      </w:pPr>
-      <w:r>
-        <w:t xml:space="preserve">/me/data returns the account's own records WITH their data payloads,</w:t>
-      </w:r>
-    </w:p>
-    <w:p>
-      <w:pPr>
-        <w:pStyle w:val="ListParagraph"/>
-        <w:numPr>
-          <w:ilvl w:val="0"/>
-          <w:numId w:val="2"/>
-        </w:numPr>
-        <w:spacing w:after="40"/>
-      </w:pPr>
-      <w:r>
-        <w:t xml:space="preserve">paginated (?page, ?per_page capped at API_MAX_PAGE_SIZE).</w:t>
-      </w:r>
-    </w:p>
-    <w:p>
-      <w:pPr>
-        <w:pStyle w:val="ListParagraph"/>
-        <w:numPr>
-          <w:ilvl w:val="0"/>
-          <w:numId w:val="2"/>
-        </w:numPr>
-        <w:spacing w:after="40"/>
-      </w:pPr>
-      <w:r>
-        <w:t xml:space="preserve">A configurable 'kind' whitelist (API_READABLE_KINDS) decides which record kinds</w:t>
-      </w:r>
-    </w:p>
-    <w:p>
-      <w:pPr>
-        <w:pStyle w:val="ListParagraph"/>
-        <w:numPr>
-          <w:ilvl w:val="0"/>
-          <w:numId w:val="2"/>
-        </w:numPr>
-        <w:spacing w:after="40"/>
-      </w:pPr>
-      <w:r>
-        <w:t xml:space="preserve">are returned; ?kind= narrows within the allowed set but can't bypass it.</w:t>
+        <w:spacing w:after="40"/>
+        <w:ind w:left="600" w:hanging="320"/>
+      </w:pPr>
+      <w:r>
+        <w:t xml:space="preserve">1. /me returns the account profile.</w:t>
+      </w:r>
+    </w:p>
+    <w:p>
+      <w:pPr>
+        <w:spacing w:after="40"/>
+        <w:ind w:left="600" w:hanging="320"/>
+      </w:pPr>
+      <w:r>
+        <w:t xml:space="preserve">2. /me/data returns the account's own records WITH their data payloads,</w:t>
+      </w:r>
+    </w:p>
+    <w:p>
+      <w:pPr>
+        <w:spacing w:after="40"/>
+        <w:ind w:left="600" w:hanging="320"/>
+      </w:pPr>
+      <w:r>
+        <w:t xml:space="preserve">3. paginated (?page, ?per_page capped at API_MAX_PAGE_SIZE).</w:t>
+      </w:r>
+    </w:p>
+    <w:p>
+      <w:pPr>
+        <w:spacing w:after="40"/>
+        <w:ind w:left="600" w:hanging="320"/>
+      </w:pPr>
+      <w:r>
+        <w:t xml:space="preserve">4. A configurable 'kind' whitelist (API_READABLE_KINDS) decides which record kinds</w:t>
+      </w:r>
+    </w:p>
+    <w:p>
+      <w:pPr>
+        <w:spacing w:after="40"/>
+        <w:ind w:left="600" w:hanging="320"/>
+      </w:pPr>
+      <w:r>
+        <w:t xml:space="preserve">5. are returned; ?kind= narrows within the allowed set but can't bypass it.</w:t>
       </w:r>
     </w:p>
     <w:p>
@@ -5731,54 +5223,38 @@
     </w:p>
     <w:p>
       <w:pPr>
-        <w:pStyle w:val="ListParagraph"/>
-        <w:numPr>
-          <w:ilvl w:val="0"/>
-          <w:numId w:val="2"/>
-        </w:numPr>
-        <w:spacing w:after="40"/>
-      </w:pPr>
-      <w:r>
-        <w:t xml:space="preserve">Stores body['data'] (or the whole body) as a new record under the account's identity.</w:t>
-      </w:r>
-    </w:p>
-    <w:p>
-      <w:pPr>
-        <w:pStyle w:val="ListParagraph"/>
-        <w:numPr>
-          <w:ilvl w:val="0"/>
-          <w:numId w:val="2"/>
-        </w:numPr>
-        <w:spacing w:after="40"/>
-      </w:pPr>
-      <w:r>
-        <w:t xml:space="preserve">Tags it with body['kind'] or API_DEFAULT_KIND; API_WRITABLE_KINDS can cap allowed kinds.</w:t>
-      </w:r>
-    </w:p>
-    <w:p>
-      <w:pPr>
-        <w:pStyle w:val="ListParagraph"/>
-        <w:numPr>
-          <w:ilvl w:val="0"/>
-          <w:numId w:val="2"/>
-        </w:numPr>
-        <w:spacing w:after="40"/>
-      </w:pPr>
-      <w:r>
-        <w:t xml:space="preserve">Upserts the UserInfo person; the app can never write to another identity.</w:t>
-      </w:r>
-    </w:p>
-    <w:p>
-      <w:pPr>
-        <w:pStyle w:val="ListParagraph"/>
-        <w:numPr>
-          <w:ilvl w:val="0"/>
-          <w:numId w:val="2"/>
-        </w:numPr>
-        <w:spacing w:after="40"/>
-      </w:pPr>
-      <w:r>
-        <w:t xml:space="preserve">Errors are logged server-side and returned generically (no internals leaked).</w:t>
+        <w:spacing w:after="40"/>
+        <w:ind w:left="600" w:hanging="320"/>
+      </w:pPr>
+      <w:r>
+        <w:t xml:space="preserve">1. Stores body['data'] (or the whole body) as a new record under the account's identity.</w:t>
+      </w:r>
+    </w:p>
+    <w:p>
+      <w:pPr>
+        <w:spacing w:after="40"/>
+        <w:ind w:left="600" w:hanging="320"/>
+      </w:pPr>
+      <w:r>
+        <w:t xml:space="preserve">2. Tags it with body['kind'] or API_DEFAULT_KIND; API_WRITABLE_KINDS can cap allowed kinds.</w:t>
+      </w:r>
+    </w:p>
+    <w:p>
+      <w:pPr>
+        <w:spacing w:after="40"/>
+        <w:ind w:left="600" w:hanging="320"/>
+      </w:pPr>
+      <w:r>
+        <w:t xml:space="preserve">3. Upserts the UserInfo person; the app can never write to another identity.</w:t>
+      </w:r>
+    </w:p>
+    <w:p>
+      <w:pPr>
+        <w:spacing w:after="40"/>
+        <w:ind w:left="600" w:hanging="320"/>
+      </w:pPr>
+      <w:r>
+        <w:t xml:space="preserve">4. Errors are logged server-side and returned generically (no internals leaked).</w:t>
       </w:r>
     </w:p>
     <w:p>
@@ -5866,67 +5342,47 @@
     </w:p>
     <w:p>
       <w:pPr>
-        <w:pStyle w:val="ListParagraph"/>
-        <w:numPr>
-          <w:ilvl w:val="0"/>
-          <w:numId w:val="2"/>
-        </w:numPr>
-        <w:spacing w:after="40"/>
-      </w:pPr>
-      <w:r>
-        <w:t xml:space="preserve">Creates the Flask object.</w:t>
-      </w:r>
-    </w:p>
-    <w:p>
-      <w:pPr>
-        <w:pStyle w:val="ListParagraph"/>
-        <w:numPr>
-          <w:ilvl w:val="0"/>
-          <w:numId w:val="2"/>
-        </w:numPr>
-        <w:spacing w:after="40"/>
-      </w:pPr>
-      <w:r>
-        <w:t xml:space="preserve">Loads the chosen config class.</w:t>
-      </w:r>
-    </w:p>
-    <w:p>
-      <w:pPr>
-        <w:pStyle w:val="ListParagraph"/>
-        <w:numPr>
-          <w:ilvl w:val="0"/>
-          <w:numId w:val="2"/>
-        </w:numPr>
-        <w:spacing w:after="40"/>
-      </w:pPr>
-      <w:r>
-        <w:t xml:space="preserve">Initializes the database and security extensions.</w:t>
-      </w:r>
-    </w:p>
-    <w:p>
-      <w:pPr>
-        <w:pStyle w:val="ListParagraph"/>
-        <w:numPr>
-          <w:ilvl w:val="0"/>
-          <w:numId w:val="2"/>
-        </w:numPr>
-        <w:spacing w:after="40"/>
-      </w:pPr>
-      <w:r>
-        <w:t xml:space="preserve">Registers the routes blueprint and returns the app.</w:t>
-      </w:r>
-    </w:p>
-    <w:p>
-      <w:pPr>
-        <w:pStyle w:val="ListParagraph"/>
-        <w:numPr>
-          <w:ilvl w:val="0"/>
-          <w:numId w:val="2"/>
-        </w:numPr>
-        <w:spacing w:after="40"/>
-      </w:pPr>
-      <w:r>
-        <w:t xml:space="preserve">It does NOT create tables, start the scheduler, or bind a port.</w:t>
+        <w:spacing w:after="40"/>
+        <w:ind w:left="600" w:hanging="320"/>
+      </w:pPr>
+      <w:r>
+        <w:t xml:space="preserve">1. Creates the Flask object.</w:t>
+      </w:r>
+    </w:p>
+    <w:p>
+      <w:pPr>
+        <w:spacing w:after="40"/>
+        <w:ind w:left="600" w:hanging="320"/>
+      </w:pPr>
+      <w:r>
+        <w:t xml:space="preserve">2. Loads the chosen config class.</w:t>
+      </w:r>
+    </w:p>
+    <w:p>
+      <w:pPr>
+        <w:spacing w:after="40"/>
+        <w:ind w:left="600" w:hanging="320"/>
+      </w:pPr>
+      <w:r>
+        <w:t xml:space="preserve">3. Initializes the database and security extensions.</w:t>
+      </w:r>
+    </w:p>
+    <w:p>
+      <w:pPr>
+        <w:spacing w:after="40"/>
+        <w:ind w:left="600" w:hanging="320"/>
+      </w:pPr>
+      <w:r>
+        <w:t xml:space="preserve">4. Registers the routes blueprint and returns the app.</w:t>
+      </w:r>
+    </w:p>
+    <w:p>
+      <w:pPr>
+        <w:spacing w:after="40"/>
+        <w:ind w:left="600" w:hanging="320"/>
+      </w:pPr>
+      <w:r>
+        <w:t xml:space="preserve">5. It does NOT create tables, start the scheduler, or bind a port.</w:t>
       </w:r>
     </w:p>
     <w:p>
@@ -6001,67 +5457,47 @@
     </w:p>
     <w:p>
       <w:pPr>
-        <w:pStyle w:val="ListParagraph"/>
-        <w:numPr>
-          <w:ilvl w:val="0"/>
-          <w:numId w:val="2"/>
-        </w:numPr>
-        <w:spacing w:after="40"/>
-      </w:pPr>
-      <w:r>
-        <w:t xml:space="preserve">When TRUST_PROXY is set (on in production), wraps the app in ProxyFix so it honors</w:t>
-      </w:r>
-    </w:p>
-    <w:p>
-      <w:pPr>
-        <w:pStyle w:val="ListParagraph"/>
-        <w:numPr>
-          <w:ilvl w:val="0"/>
-          <w:numId w:val="2"/>
-        </w:numPr>
-        <w:spacing w:after="40"/>
-      </w:pPr>
-      <w:r>
-        <w:t xml:space="preserve">X-Forwarded-Proto/For/Host from nginx - HTTPS detection (Secure cookies), correct</w:t>
-      </w:r>
-    </w:p>
-    <w:p>
-      <w:pPr>
-        <w:pStyle w:val="ListParagraph"/>
-        <w:numPr>
-          <w:ilvl w:val="0"/>
-          <w:numId w:val="2"/>
-        </w:numPr>
-        <w:spacing w:after="40"/>
-      </w:pPr>
-      <w:r>
-        <w:t xml:space="preserve">external URLs, and the real client IP for rate limiting.</w:t>
-      </w:r>
-    </w:p>
-    <w:p>
-      <w:pPr>
-        <w:pStyle w:val="ListParagraph"/>
-        <w:numPr>
-          <w:ilvl w:val="0"/>
-          <w:numId w:val="2"/>
-        </w:numPr>
-        <w:spacing w:after="40"/>
-      </w:pPr>
-      <w:r>
-        <w:t xml:space="preserve">Wires Flask-Migrate (Alembic) so schema changes are managed migrations.</w:t>
-      </w:r>
-    </w:p>
-    <w:p>
-      <w:pPr>
-        <w:pStyle w:val="ListParagraph"/>
-        <w:numPr>
-          <w:ilvl w:val="0"/>
-          <w:numId w:val="2"/>
-        </w:numPr>
-        <w:spacing w:after="40"/>
-      </w:pPr>
-      <w:r>
-        <w:t xml:space="preserve">In production, warns if SECRET_KEY or the default admin password are unchanged.</w:t>
+        <w:spacing w:after="40"/>
+        <w:ind w:left="600" w:hanging="320"/>
+      </w:pPr>
+      <w:r>
+        <w:t xml:space="preserve">1. When TRUST_PROXY is set (on in production), wraps the app in ProxyFix so it honors</w:t>
+      </w:r>
+    </w:p>
+    <w:p>
+      <w:pPr>
+        <w:spacing w:after="40"/>
+        <w:ind w:left="600" w:hanging="320"/>
+      </w:pPr>
+      <w:r>
+        <w:t xml:space="preserve">2. X-Forwarded-Proto/For/Host from nginx - HTTPS detection (Secure cookies), correct</w:t>
+      </w:r>
+    </w:p>
+    <w:p>
+      <w:pPr>
+        <w:spacing w:after="40"/>
+        <w:ind w:left="600" w:hanging="320"/>
+      </w:pPr>
+      <w:r>
+        <w:t xml:space="preserve">3. external URLs, and the real client IP for rate limiting.</w:t>
+      </w:r>
+    </w:p>
+    <w:p>
+      <w:pPr>
+        <w:spacing w:after="40"/>
+        <w:ind w:left="600" w:hanging="320"/>
+      </w:pPr>
+      <w:r>
+        <w:t xml:space="preserve">4. Wires Flask-Migrate (Alembic) so schema changes are managed migrations.</w:t>
+      </w:r>
+    </w:p>
+    <w:p>
+      <w:pPr>
+        <w:spacing w:after="40"/>
+        <w:ind w:left="600" w:hanging="320"/>
+      </w:pPr>
+      <w:r>
+        <w:t xml:space="preserve">5. In production, warns if SECRET_KEY or the default admin password are unchanged.</w:t>
       </w:r>
     </w:p>
     <w:p>
@@ -6136,41 +5572,29 @@
     </w:p>
     <w:p>
       <w:pPr>
-        <w:pStyle w:val="ListParagraph"/>
-        <w:numPr>
-          <w:ilvl w:val="0"/>
-          <w:numId w:val="2"/>
-        </w:numPr>
-        <w:spacing w:after="40"/>
-      </w:pPr>
-      <w:r>
-        <w:t xml:space="preserve">Applies pending DB migrations on startup (falls back to db.create_all if no migrations).</w:t>
-      </w:r>
-    </w:p>
-    <w:p>
-      <w:pPr>
-        <w:pStyle w:val="ListParagraph"/>
-        <w:numPr>
-          <w:ilvl w:val="0"/>
-          <w:numId w:val="2"/>
-        </w:numPr>
-        <w:spacing w:after="40"/>
-      </w:pPr>
-      <w:r>
-        <w:t xml:space="preserve">Seeds the default admin, ensures folders exist, starts the daily backup scheduler.</w:t>
-      </w:r>
-    </w:p>
-    <w:p>
-      <w:pPr>
-        <w:pStyle w:val="ListParagraph"/>
-        <w:numPr>
-          <w:ilvl w:val="0"/>
-          <w:numId w:val="2"/>
-        </w:numPr>
-        <w:spacing w:after="40"/>
-      </w:pPr>
-      <w:r>
-        <w:t xml:space="preserve">Called only when actually serving.</w:t>
+        <w:spacing w:after="40"/>
+        <w:ind w:left="600" w:hanging="320"/>
+      </w:pPr>
+      <w:r>
+        <w:t xml:space="preserve">1. Applies pending DB migrations on startup (falls back to db.create_all if no migrations).</w:t>
+      </w:r>
+    </w:p>
+    <w:p>
+      <w:pPr>
+        <w:spacing w:after="40"/>
+        <w:ind w:left="600" w:hanging="320"/>
+      </w:pPr>
+      <w:r>
+        <w:t xml:space="preserve">2. Seeds the default admin, ensures folders exist, starts the daily backup scheduler.</w:t>
+      </w:r>
+    </w:p>
+    <w:p>
+      <w:pPr>
+        <w:spacing w:after="40"/>
+        <w:ind w:left="600" w:hanging="320"/>
+      </w:pPr>
+      <w:r>
+        <w:t xml:space="preserve">3. Called only when actually serving.</w:t>
       </w:r>
     </w:p>
     <w:p>
@@ -6245,28 +5669,20 @@
     </w:p>
     <w:p>
       <w:pPr>
-        <w:pStyle w:val="ListParagraph"/>
-        <w:numPr>
-          <w:ilvl w:val="0"/>
-          <w:numId w:val="2"/>
-        </w:numPr>
-        <w:spacing w:after="40"/>
-      </w:pPr>
-      <w:r>
-        <w:t xml:space="preserve">Builds the app and runs init_runtime.</w:t>
-      </w:r>
-    </w:p>
-    <w:p>
-      <w:pPr>
-        <w:pStyle w:val="ListParagraph"/>
-        <w:numPr>
-          <w:ilvl w:val="0"/>
-          <w:numId w:val="2"/>
-        </w:numPr>
-        <w:spacing w:after="40"/>
-      </w:pPr>
-      <w:r>
-        <w:t xml:space="preserve">If APP_ENV=production, serves with waitress; otherwise uses the Flask dev server.</w:t>
+        <w:spacing w:after="40"/>
+        <w:ind w:left="600" w:hanging="320"/>
+      </w:pPr>
+      <w:r>
+        <w:t xml:space="preserve">1. Builds the app and runs init_runtime.</w:t>
+      </w:r>
+    </w:p>
+    <w:p>
+      <w:pPr>
+        <w:spacing w:after="40"/>
+        <w:ind w:left="600" w:hanging="320"/>
+      </w:pPr>
+      <w:r>
+        <w:t xml:space="preserve">2. If APP_ENV=production, serves with waitress; otherwise uses the Flask dev server.</w:t>
       </w:r>
     </w:p>
     <w:p>
@@ -6751,38 +6167,8 @@
       </w:pPr>
     </w:lvl>
   </w:abstractNum>
-  <w:abstractNum w:abstractNumId="2" w15:restartNumberingAfterBreak="0">
-    <w:multiLevelType w:val="hybridMultilevel"/>
-    <w:lvl w:ilvl="0" w15:tentative="1">
-      <w:start w:val="1"/>
-      <w:numFmt w:val="bullet"/>
-      <w:lvlText w:val="•"/>
-      <w:lvlJc w:val="left"/>
-      <w:pPr>
-        <w:ind w:left="600" w:hanging="280"/>
-      </w:pPr>
-    </w:lvl>
-  </w:abstractNum>
-  <w:abstractNum w:abstractNumId="3" w15:restartNumberingAfterBreak="0">
-    <w:multiLevelType w:val="hybridMultilevel"/>
-    <w:lvl w:ilvl="0" w15:tentative="1">
-      <w:start w:val="1"/>
-      <w:numFmt w:val="decimal"/>
-      <w:lvlText w:val="%1."/>
-      <w:lvlJc w:val="left"/>
-      <w:pPr>
-        <w:ind w:left="600" w:hanging="320"/>
-      </w:pPr>
-    </w:lvl>
-  </w:abstractNum>
   <w:num w:numId="1">
     <w:abstractNumId w:val="1"/>
-    <w:lvlOverride w:ilvl="0">
-      <w:startOverride w:val="1"/>
-    </w:lvlOverride>
-  </w:num>
-  <w:num w:numId="2">
-    <w:abstractNumId w:val="3"/>
     <w:lvlOverride w:ilvl="0">
       <w:startOverride w:val="1"/>
     </w:lvlOverride>

</xml_diff>